<commit_message>
updated project proposal doccument
</commit_message>
<xml_diff>
--- a/Project Proposal.docx
+++ b/Project Proposal.docx
@@ -5,7 +5,13 @@
     <w:sdt>
       <w:sdtPr>
         <w:rPr>
+          <w:rFonts w:eastAsiaTheme="minorHAnsi"/>
           <w:color w:val="156082" w:themeColor="accent1"/>
+          <w:kern w:val="2"/>
+          <w:sz w:val="24"/>
+          <w:szCs w:val="24"/>
+          <w:lang w:eastAsia="en-US"/>
+          <w14:ligatures w14:val="standardContextual"/>
         </w:rPr>
         <w:id w:val="-966433263"/>
         <w:docPartObj>
@@ -15,13 +21,7 @@
       </w:sdtPr>
       <w:sdtEndPr>
         <w:rPr>
-          <w:rFonts w:eastAsiaTheme="minorHAnsi"/>
           <w:color w:val="auto"/>
-          <w:kern w:val="2"/>
-          <w:sz w:val="24"/>
-          <w:szCs w:val="24"/>
-          <w:lang w:eastAsia="en-US"/>
-          <w14:ligatures w14:val="standardContextual"/>
         </w:rPr>
       </w:sdtEndPr>
       <w:sdtContent>
@@ -106,6 +106,7 @@
             <w:dataBinding w:prefixMappings="xmlns:ns0='http://purl.org/dc/elements/1.1/' xmlns:ns1='http://schemas.openxmlformats.org/package/2006/metadata/core-properties' " w:xpath="/ns1:coreProperties[1]/ns0:subject[1]" w:storeItemID="{6C3C8BC8-F283-45AE-878A-BAB7291924A1}"/>
             <w:text/>
           </w:sdtPr>
+          <w:sdtEndPr/>
           <w:sdtContent>
             <w:p>
               <w:pPr>
@@ -266,6 +267,15 @@
     </w:sdt>
     <w:sdt>
       <w:sdtPr>
+        <w:rPr>
+          <w:rFonts w:asciiTheme="minorHAnsi" w:eastAsiaTheme="minorHAnsi" w:hAnsiTheme="minorHAnsi" w:cstheme="minorBidi"/>
+          <w:color w:val="auto"/>
+          <w:kern w:val="2"/>
+          <w:sz w:val="24"/>
+          <w:szCs w:val="24"/>
+          <w:lang w:eastAsia="en-US"/>
+          <w14:ligatures w14:val="standardContextual"/>
+        </w:rPr>
         <w:id w:val="1159815006"/>
         <w:docPartObj>
           <w:docPartGallery w:val="Table of Contents"/>
@@ -274,15 +284,8 @@
       </w:sdtPr>
       <w:sdtEndPr>
         <w:rPr>
-          <w:rFonts w:asciiTheme="minorHAnsi" w:eastAsiaTheme="minorHAnsi" w:hAnsiTheme="minorHAnsi" w:cstheme="minorBidi"/>
           <w:b/>
           <w:bCs/>
-          <w:color w:val="auto"/>
-          <w:kern w:val="2"/>
-          <w:sz w:val="24"/>
-          <w:szCs w:val="24"/>
-          <w:lang w:eastAsia="en-US"/>
-          <w14:ligatures w14:val="standardContextual"/>
         </w:rPr>
       </w:sdtEndPr>
       <w:sdtContent>
@@ -301,7 +304,9 @@
               <w:tab w:val="right" w:leader="dot" w:pos="9016"/>
             </w:tabs>
             <w:rPr>
+              <w:rFonts w:eastAsiaTheme="minorEastAsia"/>
               <w:noProof/>
+              <w:lang w:eastAsia="en-GB"/>
             </w:rPr>
           </w:pPr>
           <w:r>
@@ -313,7 +318,7 @@
           <w:r>
             <w:fldChar w:fldCharType="separate"/>
           </w:r>
-          <w:hyperlink w:anchor="_Toc220327343" w:history="1">
+          <w:hyperlink w:anchor="_Toc220335978" w:history="1">
             <w:r>
               <w:rPr>
                 <w:rStyle w:val="Hyperlink"/>
@@ -340,7 +345,7 @@
                 <w:noProof/>
                 <w:webHidden/>
               </w:rPr>
-              <w:instrText xml:space="preserve"> PAGEREF _Toc220327343 \h </w:instrText>
+              <w:instrText xml:space="preserve"> PAGEREF _Toc220335978 \h </w:instrText>
             </w:r>
             <w:r>
               <w:rPr>
@@ -378,10 +383,12 @@
               <w:tab w:val="right" w:leader="dot" w:pos="9016"/>
             </w:tabs>
             <w:rPr>
+              <w:rFonts w:eastAsiaTheme="minorEastAsia"/>
               <w:noProof/>
+              <w:lang w:eastAsia="en-GB"/>
             </w:rPr>
           </w:pPr>
-          <w:hyperlink w:anchor="_Toc220327344" w:history="1">
+          <w:hyperlink w:anchor="_Toc220335979" w:history="1">
             <w:r>
               <w:rPr>
                 <w:rStyle w:val="Hyperlink"/>
@@ -408,7 +415,7 @@
                 <w:noProof/>
                 <w:webHidden/>
               </w:rPr>
-              <w:instrText xml:space="preserve"> PAGEREF _Toc220327344 \h </w:instrText>
+              <w:instrText xml:space="preserve"> PAGEREF _Toc220335979 \h </w:instrText>
             </w:r>
             <w:r>
               <w:rPr>
@@ -446,10 +453,12 @@
               <w:tab w:val="right" w:leader="dot" w:pos="9016"/>
             </w:tabs>
             <w:rPr>
+              <w:rFonts w:eastAsiaTheme="minorEastAsia"/>
               <w:noProof/>
+              <w:lang w:eastAsia="en-GB"/>
             </w:rPr>
           </w:pPr>
-          <w:hyperlink w:anchor="_Toc220327345" w:history="1">
+          <w:hyperlink w:anchor="_Toc220335980" w:history="1">
             <w:r>
               <w:rPr>
                 <w:rStyle w:val="Hyperlink"/>
@@ -476,7 +485,7 @@
                 <w:noProof/>
                 <w:webHidden/>
               </w:rPr>
-              <w:instrText xml:space="preserve"> PAGEREF _Toc220327345 \h </w:instrText>
+              <w:instrText xml:space="preserve"> PAGEREF _Toc220335980 \h </w:instrText>
             </w:r>
             <w:r>
               <w:rPr>
@@ -514,10 +523,12 @@
               <w:tab w:val="right" w:leader="dot" w:pos="9016"/>
             </w:tabs>
             <w:rPr>
+              <w:rFonts w:eastAsiaTheme="minorEastAsia"/>
               <w:noProof/>
+              <w:lang w:eastAsia="en-GB"/>
             </w:rPr>
           </w:pPr>
-          <w:hyperlink w:anchor="_Toc220327346" w:history="1">
+          <w:hyperlink w:anchor="_Toc220335981" w:history="1">
             <w:r>
               <w:rPr>
                 <w:rStyle w:val="Hyperlink"/>
@@ -544,7 +555,7 @@
                 <w:noProof/>
                 <w:webHidden/>
               </w:rPr>
-              <w:instrText xml:space="preserve"> PAGEREF _Toc220327346 \h </w:instrText>
+              <w:instrText xml:space="preserve"> PAGEREF _Toc220335981 \h </w:instrText>
             </w:r>
             <w:r>
               <w:rPr>
@@ -582,10 +593,12 @@
               <w:tab w:val="right" w:leader="dot" w:pos="9016"/>
             </w:tabs>
             <w:rPr>
+              <w:rFonts w:eastAsiaTheme="minorEastAsia"/>
               <w:noProof/>
+              <w:lang w:eastAsia="en-GB"/>
             </w:rPr>
           </w:pPr>
-          <w:hyperlink w:anchor="_Toc220327347" w:history="1">
+          <w:hyperlink w:anchor="_Toc220335982" w:history="1">
             <w:r>
               <w:rPr>
                 <w:rStyle w:val="Hyperlink"/>
@@ -612,7 +625,7 @@
                 <w:noProof/>
                 <w:webHidden/>
               </w:rPr>
-              <w:instrText xml:space="preserve"> PAGEREF _Toc220327347 \h </w:instrText>
+              <w:instrText xml:space="preserve"> PAGEREF _Toc220335982 \h </w:instrText>
             </w:r>
             <w:r>
               <w:rPr>
@@ -650,10 +663,12 @@
               <w:tab w:val="right" w:leader="dot" w:pos="9016"/>
             </w:tabs>
             <w:rPr>
+              <w:rFonts w:eastAsiaTheme="minorEastAsia"/>
               <w:noProof/>
+              <w:lang w:eastAsia="en-GB"/>
             </w:rPr>
           </w:pPr>
-          <w:hyperlink w:anchor="_Toc220327348" w:history="1">
+          <w:hyperlink w:anchor="_Toc220335983" w:history="1">
             <w:r>
               <w:rPr>
                 <w:rStyle w:val="Hyperlink"/>
@@ -680,7 +695,7 @@
                 <w:noProof/>
                 <w:webHidden/>
               </w:rPr>
-              <w:instrText xml:space="preserve"> PAGEREF _Toc220327348 \h </w:instrText>
+              <w:instrText xml:space="preserve"> PAGEREF _Toc220335983 \h </w:instrText>
             </w:r>
             <w:r>
               <w:rPr>
@@ -718,10 +733,12 @@
               <w:tab w:val="right" w:leader="dot" w:pos="9016"/>
             </w:tabs>
             <w:rPr>
+              <w:rFonts w:eastAsiaTheme="minorEastAsia"/>
               <w:noProof/>
+              <w:lang w:eastAsia="en-GB"/>
             </w:rPr>
           </w:pPr>
-          <w:hyperlink w:anchor="_Toc220327349" w:history="1">
+          <w:hyperlink w:anchor="_Toc220335984" w:history="1">
             <w:r>
               <w:rPr>
                 <w:rStyle w:val="Hyperlink"/>
@@ -748,7 +765,7 @@
                 <w:noProof/>
                 <w:webHidden/>
               </w:rPr>
-              <w:instrText xml:space="preserve"> PAGEREF _Toc220327349 \h </w:instrText>
+              <w:instrText xml:space="preserve"> PAGEREF _Toc220335984 \h </w:instrText>
             </w:r>
             <w:r>
               <w:rPr>
@@ -768,7 +785,7 @@
                 <w:noProof/>
                 <w:webHidden/>
               </w:rPr>
-              <w:t>2</w:t>
+              <w:t>3</w:t>
             </w:r>
             <w:r>
               <w:rPr>
@@ -786,10 +803,12 @@
               <w:tab w:val="right" w:leader="dot" w:pos="9016"/>
             </w:tabs>
             <w:rPr>
+              <w:rFonts w:eastAsiaTheme="minorEastAsia"/>
               <w:noProof/>
+              <w:lang w:eastAsia="en-GB"/>
             </w:rPr>
           </w:pPr>
-          <w:hyperlink w:anchor="_Toc220327350" w:history="1">
+          <w:hyperlink w:anchor="_Toc220335985" w:history="1">
             <w:r>
               <w:rPr>
                 <w:rStyle w:val="Hyperlink"/>
@@ -816,7 +835,7 @@
                 <w:noProof/>
                 <w:webHidden/>
               </w:rPr>
-              <w:instrText xml:space="preserve"> PAGEREF _Toc220327350 \h </w:instrText>
+              <w:instrText xml:space="preserve"> PAGEREF _Toc220335985 \h </w:instrText>
             </w:r>
             <w:r>
               <w:rPr>
@@ -854,10 +873,12 @@
               <w:tab w:val="right" w:leader="dot" w:pos="9016"/>
             </w:tabs>
             <w:rPr>
+              <w:rFonts w:eastAsiaTheme="minorEastAsia"/>
               <w:noProof/>
+              <w:lang w:eastAsia="en-GB"/>
             </w:rPr>
           </w:pPr>
-          <w:hyperlink w:anchor="_Toc220327351" w:history="1">
+          <w:hyperlink w:anchor="_Toc220335986" w:history="1">
             <w:r>
               <w:rPr>
                 <w:rStyle w:val="Hyperlink"/>
@@ -884,7 +905,7 @@
                 <w:noProof/>
                 <w:webHidden/>
               </w:rPr>
-              <w:instrText xml:space="preserve"> PAGEREF _Toc220327351 \h </w:instrText>
+              <w:instrText xml:space="preserve"> PAGEREF _Toc220335986 \h </w:instrText>
             </w:r>
             <w:r>
               <w:rPr>
@@ -922,10 +943,12 @@
               <w:tab w:val="right" w:leader="dot" w:pos="9016"/>
             </w:tabs>
             <w:rPr>
+              <w:rFonts w:eastAsiaTheme="minorEastAsia"/>
               <w:noProof/>
+              <w:lang w:eastAsia="en-GB"/>
             </w:rPr>
           </w:pPr>
-          <w:hyperlink w:anchor="_Toc220327352" w:history="1">
+          <w:hyperlink w:anchor="_Toc220335987" w:history="1">
             <w:r>
               <w:rPr>
                 <w:rStyle w:val="Hyperlink"/>
@@ -952,7 +975,7 @@
                 <w:noProof/>
                 <w:webHidden/>
               </w:rPr>
-              <w:instrText xml:space="preserve"> PAGEREF _Toc220327352 \h </w:instrText>
+              <w:instrText xml:space="preserve"> PAGEREF _Toc220335987 \h </w:instrText>
             </w:r>
             <w:r>
               <w:rPr>
@@ -990,10 +1013,12 @@
               <w:tab w:val="right" w:leader="dot" w:pos="9016"/>
             </w:tabs>
             <w:rPr>
+              <w:rFonts w:eastAsiaTheme="minorEastAsia"/>
               <w:noProof/>
+              <w:lang w:eastAsia="en-GB"/>
             </w:rPr>
           </w:pPr>
-          <w:hyperlink w:anchor="_Toc220327353" w:history="1">
+          <w:hyperlink w:anchor="_Toc220335988" w:history="1">
             <w:r>
               <w:rPr>
                 <w:rStyle w:val="Hyperlink"/>
@@ -1020,7 +1045,7 @@
                 <w:noProof/>
                 <w:webHidden/>
               </w:rPr>
-              <w:instrText xml:space="preserve"> PAGEREF _Toc220327353 \h </w:instrText>
+              <w:instrText xml:space="preserve"> PAGEREF _Toc220335988 \h </w:instrText>
             </w:r>
             <w:r>
               <w:rPr>
@@ -1040,7 +1065,7 @@
                 <w:noProof/>
                 <w:webHidden/>
               </w:rPr>
-              <w:t>3</w:t>
+              <w:t>4</w:t>
             </w:r>
             <w:r>
               <w:rPr>
@@ -1058,10 +1083,12 @@
               <w:tab w:val="right" w:leader="dot" w:pos="9016"/>
             </w:tabs>
             <w:rPr>
+              <w:rFonts w:eastAsiaTheme="minorEastAsia"/>
               <w:noProof/>
+              <w:lang w:eastAsia="en-GB"/>
             </w:rPr>
           </w:pPr>
-          <w:hyperlink w:anchor="_Toc220327354" w:history="1">
+          <w:hyperlink w:anchor="_Toc220335989" w:history="1">
             <w:r>
               <w:rPr>
                 <w:rStyle w:val="Hyperlink"/>
@@ -1088,7 +1115,7 @@
                 <w:noProof/>
                 <w:webHidden/>
               </w:rPr>
-              <w:instrText xml:space="preserve"> PAGEREF _Toc220327354 \h </w:instrText>
+              <w:instrText xml:space="preserve"> PAGEREF _Toc220335989 \h </w:instrText>
             </w:r>
             <w:r>
               <w:rPr>
@@ -1108,7 +1135,287 @@
                 <w:noProof/>
                 <w:webHidden/>
               </w:rPr>
-              <w:t>4</w:t>
+              <w:t>8</w:t>
+            </w:r>
+            <w:r>
+              <w:rPr>
+                <w:noProof/>
+                <w:webHidden/>
+              </w:rPr>
+              <w:fldChar w:fldCharType="end"/>
+            </w:r>
+          </w:hyperlink>
+        </w:p>
+        <w:p>
+          <w:pPr>
+            <w:pStyle w:val="TOC1"/>
+            <w:tabs>
+              <w:tab w:val="right" w:leader="dot" w:pos="9016"/>
+            </w:tabs>
+            <w:rPr>
+              <w:rFonts w:eastAsiaTheme="minorEastAsia"/>
+              <w:noProof/>
+              <w:lang w:eastAsia="en-GB"/>
+            </w:rPr>
+          </w:pPr>
+          <w:hyperlink w:anchor="_Toc220335990" w:history="1">
+            <w:r>
+              <w:rPr>
+                <w:rStyle w:val="Hyperlink"/>
+                <w:noProof/>
+              </w:rPr>
+              <w:t>Hierarchy Diagram</w:t>
+            </w:r>
+            <w:r>
+              <w:rPr>
+                <w:noProof/>
+                <w:webHidden/>
+              </w:rPr>
+              <w:tab/>
+            </w:r>
+            <w:r>
+              <w:rPr>
+                <w:noProof/>
+                <w:webHidden/>
+              </w:rPr>
+              <w:fldChar w:fldCharType="begin"/>
+            </w:r>
+            <w:r>
+              <w:rPr>
+                <w:noProof/>
+                <w:webHidden/>
+              </w:rPr>
+              <w:instrText xml:space="preserve"> PAGEREF _Toc220335990 \h </w:instrText>
+            </w:r>
+            <w:r>
+              <w:rPr>
+                <w:noProof/>
+                <w:webHidden/>
+              </w:rPr>
+            </w:r>
+            <w:r>
+              <w:rPr>
+                <w:noProof/>
+                <w:webHidden/>
+              </w:rPr>
+              <w:fldChar w:fldCharType="separate"/>
+            </w:r>
+            <w:r>
+              <w:rPr>
+                <w:noProof/>
+                <w:webHidden/>
+              </w:rPr>
+              <w:t>10</w:t>
+            </w:r>
+            <w:r>
+              <w:rPr>
+                <w:noProof/>
+                <w:webHidden/>
+              </w:rPr>
+              <w:fldChar w:fldCharType="end"/>
+            </w:r>
+          </w:hyperlink>
+        </w:p>
+        <w:p>
+          <w:pPr>
+            <w:pStyle w:val="TOC1"/>
+            <w:tabs>
+              <w:tab w:val="right" w:leader="dot" w:pos="9016"/>
+            </w:tabs>
+            <w:rPr>
+              <w:rFonts w:eastAsiaTheme="minorEastAsia"/>
+              <w:noProof/>
+              <w:lang w:eastAsia="en-GB"/>
+            </w:rPr>
+          </w:pPr>
+          <w:hyperlink w:anchor="_Toc220335991" w:history="1">
+            <w:r>
+              <w:rPr>
+                <w:rStyle w:val="Hyperlink"/>
+                <w:noProof/>
+              </w:rPr>
+              <w:t>Risk management plan</w:t>
+            </w:r>
+            <w:r>
+              <w:rPr>
+                <w:noProof/>
+                <w:webHidden/>
+              </w:rPr>
+              <w:tab/>
+            </w:r>
+            <w:r>
+              <w:rPr>
+                <w:noProof/>
+                <w:webHidden/>
+              </w:rPr>
+              <w:fldChar w:fldCharType="begin"/>
+            </w:r>
+            <w:r>
+              <w:rPr>
+                <w:noProof/>
+                <w:webHidden/>
+              </w:rPr>
+              <w:instrText xml:space="preserve"> PAGEREF _Toc220335991 \h </w:instrText>
+            </w:r>
+            <w:r>
+              <w:rPr>
+                <w:noProof/>
+                <w:webHidden/>
+              </w:rPr>
+            </w:r>
+            <w:r>
+              <w:rPr>
+                <w:noProof/>
+                <w:webHidden/>
+              </w:rPr>
+              <w:fldChar w:fldCharType="separate"/>
+            </w:r>
+            <w:r>
+              <w:rPr>
+                <w:noProof/>
+                <w:webHidden/>
+              </w:rPr>
+              <w:t>10</w:t>
+            </w:r>
+            <w:r>
+              <w:rPr>
+                <w:noProof/>
+                <w:webHidden/>
+              </w:rPr>
+              <w:fldChar w:fldCharType="end"/>
+            </w:r>
+          </w:hyperlink>
+        </w:p>
+        <w:p>
+          <w:pPr>
+            <w:pStyle w:val="TOC1"/>
+            <w:tabs>
+              <w:tab w:val="right" w:leader="dot" w:pos="9016"/>
+            </w:tabs>
+            <w:rPr>
+              <w:rFonts w:eastAsiaTheme="minorEastAsia"/>
+              <w:noProof/>
+              <w:lang w:eastAsia="en-GB"/>
+            </w:rPr>
+          </w:pPr>
+          <w:hyperlink w:anchor="_Toc220335992" w:history="1">
+            <w:r>
+              <w:rPr>
+                <w:rStyle w:val="Hyperlink"/>
+                <w:noProof/>
+              </w:rPr>
+              <w:t>UI Considerations</w:t>
+            </w:r>
+            <w:r>
+              <w:rPr>
+                <w:noProof/>
+                <w:webHidden/>
+              </w:rPr>
+              <w:tab/>
+            </w:r>
+            <w:r>
+              <w:rPr>
+                <w:noProof/>
+                <w:webHidden/>
+              </w:rPr>
+              <w:fldChar w:fldCharType="begin"/>
+            </w:r>
+            <w:r>
+              <w:rPr>
+                <w:noProof/>
+                <w:webHidden/>
+              </w:rPr>
+              <w:instrText xml:space="preserve"> PAGEREF _Toc220335992 \h </w:instrText>
+            </w:r>
+            <w:r>
+              <w:rPr>
+                <w:noProof/>
+                <w:webHidden/>
+              </w:rPr>
+            </w:r>
+            <w:r>
+              <w:rPr>
+                <w:noProof/>
+                <w:webHidden/>
+              </w:rPr>
+              <w:fldChar w:fldCharType="separate"/>
+            </w:r>
+            <w:r>
+              <w:rPr>
+                <w:noProof/>
+                <w:webHidden/>
+              </w:rPr>
+              <w:t>10</w:t>
+            </w:r>
+            <w:r>
+              <w:rPr>
+                <w:noProof/>
+                <w:webHidden/>
+              </w:rPr>
+              <w:fldChar w:fldCharType="end"/>
+            </w:r>
+          </w:hyperlink>
+        </w:p>
+        <w:p>
+          <w:pPr>
+            <w:pStyle w:val="TOC1"/>
+            <w:tabs>
+              <w:tab w:val="right" w:leader="dot" w:pos="9016"/>
+            </w:tabs>
+            <w:rPr>
+              <w:rFonts w:eastAsiaTheme="minorEastAsia"/>
+              <w:noProof/>
+              <w:lang w:eastAsia="en-GB"/>
+            </w:rPr>
+          </w:pPr>
+          <w:hyperlink w:anchor="_Toc220335993" w:history="1">
+            <w:r>
+              <w:rPr>
+                <w:rStyle w:val="Hyperlink"/>
+                <w:noProof/>
+              </w:rPr>
+              <w:t>Legal</w:t>
+            </w:r>
+            <w:r>
+              <w:rPr>
+                <w:noProof/>
+                <w:webHidden/>
+              </w:rPr>
+              <w:tab/>
+            </w:r>
+            <w:r>
+              <w:rPr>
+                <w:noProof/>
+                <w:webHidden/>
+              </w:rPr>
+              <w:fldChar w:fldCharType="begin"/>
+            </w:r>
+            <w:r>
+              <w:rPr>
+                <w:noProof/>
+                <w:webHidden/>
+              </w:rPr>
+              <w:instrText xml:space="preserve"> PAGEREF _Toc220335993 \h </w:instrText>
+            </w:r>
+            <w:r>
+              <w:rPr>
+                <w:noProof/>
+                <w:webHidden/>
+              </w:rPr>
+            </w:r>
+            <w:r>
+              <w:rPr>
+                <w:noProof/>
+                <w:webHidden/>
+              </w:rPr>
+              <w:fldChar w:fldCharType="separate"/>
+            </w:r>
+            <w:r>
+              <w:rPr>
+                <w:noProof/>
+                <w:webHidden/>
+              </w:rPr>
+              <w:t>10</w:t>
             </w:r>
             <w:r>
               <w:rPr>
@@ -1140,7 +1447,7 @@
       <w:pPr>
         <w:pStyle w:val="Heading1"/>
       </w:pPr>
-      <w:bookmarkStart w:id="0" w:name="_Toc220327343"/>
+      <w:bookmarkStart w:id="0" w:name="_Toc220335978"/>
       <w:r>
         <w:lastRenderedPageBreak/>
         <w:t>Business context</w:t>
@@ -1151,7 +1458,7 @@
       <w:pPr>
         <w:pStyle w:val="Heading2"/>
       </w:pPr>
-      <w:bookmarkStart w:id="1" w:name="_Toc220327344"/>
+      <w:bookmarkStart w:id="1" w:name="_Toc220335979"/>
       <w:r>
         <w:t>Room availability and facilities</w:t>
       </w:r>
@@ -1178,7 +1485,7 @@
       <w:pPr>
         <w:pStyle w:val="Heading2"/>
       </w:pPr>
-      <w:bookmarkStart w:id="2" w:name="_Toc220327345"/>
+      <w:bookmarkStart w:id="2" w:name="_Toc220335980"/>
       <w:r>
         <w:t>Booking policies</w:t>
       </w:r>
@@ -1201,7 +1508,7 @@
       <w:pPr>
         <w:pStyle w:val="Heading2"/>
       </w:pPr>
-      <w:bookmarkStart w:id="3" w:name="_Toc220327346"/>
+      <w:bookmarkStart w:id="3" w:name="_Toc220335981"/>
       <w:r>
         <w:t>Staff details</w:t>
       </w:r>
@@ -1228,7 +1535,7 @@
       <w:pPr>
         <w:pStyle w:val="Heading2"/>
       </w:pPr>
-      <w:bookmarkStart w:id="4" w:name="_Toc220327347"/>
+      <w:bookmarkStart w:id="4" w:name="_Toc220335982"/>
       <w:r>
         <w:t>Create booking</w:t>
       </w:r>
@@ -1252,7 +1559,7 @@
       <w:pPr>
         <w:pStyle w:val="Heading2"/>
       </w:pPr>
-      <w:bookmarkStart w:id="5" w:name="_Toc220327348"/>
+      <w:bookmarkStart w:id="5" w:name="_Toc220335983"/>
       <w:r>
         <w:t>View and manage existing bookings</w:t>
       </w:r>
@@ -1270,7 +1577,7 @@
       <w:pPr>
         <w:pStyle w:val="Heading2"/>
       </w:pPr>
-      <w:bookmarkStart w:id="6" w:name="_Toc220327349"/>
+      <w:bookmarkStart w:id="6" w:name="_Toc220335984"/>
       <w:r>
         <w:lastRenderedPageBreak/>
         <w:t>Account registration</w:t>
@@ -1289,7 +1596,7 @@
       <w:pPr>
         <w:pStyle w:val="Heading2"/>
       </w:pPr>
-      <w:bookmarkStart w:id="7" w:name="_Toc220327350"/>
+      <w:bookmarkStart w:id="7" w:name="_Toc220335985"/>
       <w:r>
         <w:t>Accessibility features</w:t>
       </w:r>
@@ -1339,7 +1646,7 @@
       <w:pPr>
         <w:pStyle w:val="Heading2"/>
       </w:pPr>
-      <w:bookmarkStart w:id="8" w:name="_Toc220327351"/>
+      <w:bookmarkStart w:id="8" w:name="_Toc220335986"/>
       <w:r>
         <w:t>A staff area</w:t>
       </w:r>
@@ -1363,7 +1670,7 @@
       <w:pPr>
         <w:pStyle w:val="Heading1"/>
       </w:pPr>
-      <w:bookmarkStart w:id="9" w:name="_Toc220327352"/>
+      <w:bookmarkStart w:id="9" w:name="_Toc220335987"/>
       <w:r>
         <w:t>Project aim</w:t>
       </w:r>
@@ -1473,7 +1780,7 @@
       <w:pPr>
         <w:pStyle w:val="Heading1"/>
       </w:pPr>
-      <w:bookmarkStart w:id="10" w:name="_Toc220327353"/>
+      <w:bookmarkStart w:id="10" w:name="_Toc220335988"/>
       <w:r>
         <w:t>Functional requirements</w:t>
       </w:r>
@@ -1551,14 +1858,14 @@
     <w:tbl>
       <w:tblPr>
         <w:tblStyle w:val="TableGrid"/>
-        <w:tblW w:w="8580" w:type="dxa"/>
+        <w:tblW w:w="8926" w:type="dxa"/>
         <w:tblLook w:val="04A0" w:firstRow="1" w:lastRow="0" w:firstColumn="1" w:lastColumn="0" w:noHBand="0" w:noVBand="1"/>
       </w:tblPr>
       <w:tblGrid>
-        <w:gridCol w:w="2145"/>
-        <w:gridCol w:w="2145"/>
-        <w:gridCol w:w="2145"/>
-        <w:gridCol w:w="2145"/>
+        <w:gridCol w:w="2132"/>
+        <w:gridCol w:w="2133"/>
+        <w:gridCol w:w="2768"/>
+        <w:gridCol w:w="1893"/>
       </w:tblGrid>
       <w:tr>
         <w:trPr>
@@ -1566,7 +1873,7 @@
         </w:trPr>
         <w:tc>
           <w:tcPr>
-            <w:tcW w:w="2145" w:type="dxa"/>
+            <w:tcW w:w="2132" w:type="dxa"/>
             <w:tcBorders>
               <w:top w:val="single" w:sz="4" w:space="0" w:color="auto"/>
               <w:left w:val="single" w:sz="4" w:space="0" w:color="auto"/>
@@ -1596,7 +1903,7 @@
         </w:tc>
         <w:tc>
           <w:tcPr>
-            <w:tcW w:w="2145" w:type="dxa"/>
+            <w:tcW w:w="2133" w:type="dxa"/>
             <w:tcBorders>
               <w:top w:val="single" w:sz="4" w:space="0" w:color="auto"/>
               <w:left w:val="single" w:sz="4" w:space="0" w:color="auto"/>
@@ -1626,7 +1933,7 @@
         </w:tc>
         <w:tc>
           <w:tcPr>
-            <w:tcW w:w="2145" w:type="dxa"/>
+            <w:tcW w:w="2768" w:type="dxa"/>
             <w:tcBorders>
               <w:top w:val="single" w:sz="4" w:space="0" w:color="auto"/>
               <w:left w:val="single" w:sz="4" w:space="0" w:color="auto"/>
@@ -1656,7 +1963,7 @@
         </w:tc>
         <w:tc>
           <w:tcPr>
-            <w:tcW w:w="2145" w:type="dxa"/>
+            <w:tcW w:w="1893" w:type="dxa"/>
             <w:tcBorders>
               <w:top w:val="single" w:sz="4" w:space="0" w:color="auto"/>
               <w:left w:val="single" w:sz="4" w:space="0" w:color="auto"/>
@@ -1691,7 +1998,7 @@
         </w:trPr>
         <w:tc>
           <w:tcPr>
-            <w:tcW w:w="2145" w:type="dxa"/>
+            <w:tcW w:w="2132" w:type="dxa"/>
             <w:tcBorders>
               <w:top w:val="single" w:sz="4" w:space="0" w:color="auto"/>
               <w:left w:val="single" w:sz="4" w:space="0" w:color="auto"/>
@@ -1718,7 +2025,7 @@
         </w:tc>
         <w:tc>
           <w:tcPr>
-            <w:tcW w:w="2145" w:type="dxa"/>
+            <w:tcW w:w="2133" w:type="dxa"/>
             <w:tcBorders>
               <w:top w:val="single" w:sz="4" w:space="0" w:color="auto"/>
               <w:left w:val="single" w:sz="4" w:space="0" w:color="auto"/>
@@ -1790,7 +2097,120 @@
         </w:tc>
         <w:tc>
           <w:tcPr>
-            <w:tcW w:w="2145" w:type="dxa"/>
+            <w:tcW w:w="2768" w:type="dxa"/>
+            <w:tcBorders>
+              <w:top w:val="single" w:sz="4" w:space="0" w:color="auto"/>
+              <w:left w:val="single" w:sz="4" w:space="0" w:color="auto"/>
+              <w:bottom w:val="single" w:sz="4" w:space="0" w:color="auto"/>
+              <w:right w:val="single" w:sz="4" w:space="0" w:color="auto"/>
+            </w:tcBorders>
+          </w:tcPr>
+          <w:p>
+            <w:pPr>
+              <w:pStyle w:val="ListParagraph"/>
+              <w:numPr>
+                <w:ilvl w:val="0"/>
+                <w:numId w:val="2"/>
+              </w:numPr>
+              <w:rPr>
+                <w:b/>
+                <w:bCs/>
+              </w:rPr>
+            </w:pPr>
+            <w:r>
+              <w:rPr>
+                <w:b/>
+                <w:bCs/>
+              </w:rPr>
+              <w:t xml:space="preserve">Provide the user with a </w:t>
+            </w:r>
+            <w:r>
+              <w:rPr>
+                <w:b/>
+                <w:bCs/>
+              </w:rPr>
+              <w:t xml:space="preserve">functional registration screen </w:t>
+            </w:r>
+          </w:p>
+          <w:p>
+            <w:pPr>
+              <w:pStyle w:val="ListParagraph"/>
+              <w:numPr>
+                <w:ilvl w:val="0"/>
+                <w:numId w:val="2"/>
+              </w:numPr>
+              <w:rPr>
+                <w:b/>
+                <w:bCs/>
+              </w:rPr>
+            </w:pPr>
+            <w:r>
+              <w:rPr>
+                <w:b/>
+                <w:bCs/>
+              </w:rPr>
+              <w:t>Check that the data entered passes all validation checks</w:t>
+            </w:r>
+            <w:r>
+              <w:rPr>
+                <w:b/>
+                <w:bCs/>
+              </w:rPr>
+              <w:t xml:space="preserve"> </w:t>
+            </w:r>
+          </w:p>
+          <w:p>
+            <w:pPr>
+              <w:pStyle w:val="ListParagraph"/>
+              <w:numPr>
+                <w:ilvl w:val="0"/>
+                <w:numId w:val="2"/>
+              </w:numPr>
+              <w:rPr>
+                <w:b/>
+                <w:bCs/>
+              </w:rPr>
+            </w:pPr>
+            <w:r>
+              <w:rPr>
+                <w:b/>
+                <w:bCs/>
+              </w:rPr>
+              <w:t xml:space="preserve">Save </w:t>
+            </w:r>
+            <w:r>
+              <w:rPr>
+                <w:b/>
+                <w:bCs/>
+              </w:rPr>
+              <w:t>account</w:t>
+            </w:r>
+            <w:r>
+              <w:rPr>
+                <w:b/>
+                <w:bCs/>
+              </w:rPr>
+              <w:t xml:space="preserve"> </w:t>
+            </w:r>
+            <w:r>
+              <w:rPr>
+                <w:b/>
+                <w:bCs/>
+              </w:rPr>
+              <w:t>information</w:t>
+            </w:r>
+            <w:r>
+              <w:rPr>
+                <w:b/>
+                <w:bCs/>
+              </w:rPr>
+              <w:t xml:space="preserve"> onto a database</w:t>
+            </w:r>
+          </w:p>
+        </w:tc>
+        <w:tc>
+          <w:tcPr>
+            <w:tcW w:w="1893" w:type="dxa"/>
             <w:tcBorders>
               <w:top w:val="single" w:sz="4" w:space="0" w:color="auto"/>
               <w:left w:val="single" w:sz="4" w:space="0" w:color="auto"/>
@@ -1806,26 +2226,27 @@
                 <w:bCs/>
               </w:rPr>
             </w:pPr>
-          </w:p>
-        </w:tc>
-        <w:tc>
-          <w:tcPr>
-            <w:tcW w:w="2145" w:type="dxa"/>
-            <w:tcBorders>
-              <w:top w:val="single" w:sz="4" w:space="0" w:color="auto"/>
-              <w:left w:val="single" w:sz="4" w:space="0" w:color="auto"/>
-              <w:bottom w:val="single" w:sz="4" w:space="0" w:color="auto"/>
-              <w:right w:val="single" w:sz="4" w:space="0" w:color="auto"/>
-            </w:tcBorders>
-          </w:tcPr>
-          <w:p>
-            <w:pPr>
-              <w:spacing w:after="160" w:line="278" w:lineRule="auto"/>
-              <w:rPr>
-                <w:b/>
-                <w:bCs/>
-              </w:rPr>
-            </w:pPr>
+            <w:r>
+              <w:rPr>
+                <w:b/>
+                <w:bCs/>
+              </w:rPr>
+              <w:t xml:space="preserve">This feature will benefit the </w:t>
+            </w:r>
+            <w:r>
+              <w:rPr>
+                <w:b/>
+                <w:bCs/>
+              </w:rPr>
+              <w:t>customer</w:t>
+            </w:r>
+            <w:r>
+              <w:rPr>
+                <w:b/>
+                <w:bCs/>
+              </w:rPr>
+              <w:t xml:space="preserve"> as it gives users the option to create an account for simpler management of their data.</w:t>
+            </w:r>
           </w:p>
         </w:tc>
       </w:tr>
@@ -1835,7 +2256,7 @@
         </w:trPr>
         <w:tc>
           <w:tcPr>
-            <w:tcW w:w="2145" w:type="dxa"/>
+            <w:tcW w:w="2132" w:type="dxa"/>
             <w:tcBorders>
               <w:top w:val="single" w:sz="4" w:space="0" w:color="auto"/>
               <w:left w:val="single" w:sz="4" w:space="0" w:color="auto"/>
@@ -1862,7 +2283,7 @@
         </w:tc>
         <w:tc>
           <w:tcPr>
-            <w:tcW w:w="2145" w:type="dxa"/>
+            <w:tcW w:w="2133" w:type="dxa"/>
             <w:tcBorders>
               <w:top w:val="single" w:sz="4" w:space="0" w:color="auto"/>
               <w:left w:val="single" w:sz="4" w:space="0" w:color="auto"/>
@@ -1890,13 +2311,161 @@
                 <w:b/>
                 <w:bCs/>
               </w:rPr>
-              <w:t xml:space="preserve"> data. </w:t>
-            </w:r>
-          </w:p>
-        </w:tc>
-        <w:tc>
-          <w:tcPr>
-            <w:tcW w:w="2145" w:type="dxa"/>
+              <w:t xml:space="preserve"> data</w:t>
+            </w:r>
+            <w:r>
+              <w:rPr>
+                <w:b/>
+                <w:bCs/>
+              </w:rPr>
+              <w:t xml:space="preserve"> so that I do not lose track of important booking details. </w:t>
+            </w:r>
+          </w:p>
+        </w:tc>
+        <w:tc>
+          <w:tcPr>
+            <w:tcW w:w="2768" w:type="dxa"/>
+            <w:tcBorders>
+              <w:top w:val="single" w:sz="4" w:space="0" w:color="auto"/>
+              <w:left w:val="single" w:sz="4" w:space="0" w:color="auto"/>
+              <w:bottom w:val="single" w:sz="4" w:space="0" w:color="auto"/>
+              <w:right w:val="single" w:sz="4" w:space="0" w:color="auto"/>
+            </w:tcBorders>
+          </w:tcPr>
+          <w:p>
+            <w:pPr>
+              <w:pStyle w:val="ListParagraph"/>
+              <w:numPr>
+                <w:ilvl w:val="0"/>
+                <w:numId w:val="2"/>
+              </w:numPr>
+              <w:rPr>
+                <w:b/>
+                <w:bCs/>
+              </w:rPr>
+            </w:pPr>
+            <w:r>
+              <w:rPr>
+                <w:b/>
+                <w:bCs/>
+              </w:rPr>
+              <w:t>Provide the user with a functional login screen</w:t>
+            </w:r>
+          </w:p>
+          <w:p>
+            <w:pPr>
+              <w:pStyle w:val="ListParagraph"/>
+              <w:numPr>
+                <w:ilvl w:val="0"/>
+                <w:numId w:val="2"/>
+              </w:numPr>
+              <w:rPr>
+                <w:b/>
+                <w:bCs/>
+              </w:rPr>
+            </w:pPr>
+            <w:r>
+              <w:rPr>
+                <w:b/>
+                <w:bCs/>
+              </w:rPr>
+              <w:t>Allow users to enter data into specified fields</w:t>
+            </w:r>
+          </w:p>
+          <w:p>
+            <w:pPr>
+              <w:pStyle w:val="ListParagraph"/>
+              <w:numPr>
+                <w:ilvl w:val="0"/>
+                <w:numId w:val="2"/>
+              </w:numPr>
+              <w:rPr>
+                <w:b/>
+                <w:bCs/>
+              </w:rPr>
+            </w:pPr>
+            <w:r>
+              <w:rPr>
+                <w:b/>
+                <w:bCs/>
+              </w:rPr>
+              <w:t>Check that the data entered passes all validation checks</w:t>
+            </w:r>
+          </w:p>
+          <w:p>
+            <w:pPr>
+              <w:pStyle w:val="ListParagraph"/>
+              <w:numPr>
+                <w:ilvl w:val="0"/>
+                <w:numId w:val="2"/>
+              </w:numPr>
+              <w:rPr>
+                <w:b/>
+                <w:bCs/>
+              </w:rPr>
+            </w:pPr>
+            <w:r>
+              <w:rPr>
+                <w:b/>
+                <w:bCs/>
+              </w:rPr>
+              <w:t xml:space="preserve">Check </w:t>
+            </w:r>
+            <w:r>
+              <w:rPr>
+                <w:b/>
+                <w:bCs/>
+              </w:rPr>
+              <w:t>if</w:t>
+            </w:r>
+            <w:r>
+              <w:rPr>
+                <w:b/>
+                <w:bCs/>
+              </w:rPr>
+              <w:t xml:space="preserve"> the </w:t>
+            </w:r>
+            <w:r>
+              <w:rPr>
+                <w:b/>
+                <w:bCs/>
+              </w:rPr>
+              <w:t>account information</w:t>
+            </w:r>
+            <w:r>
+              <w:rPr>
+                <w:b/>
+                <w:bCs/>
+              </w:rPr>
+              <w:t xml:space="preserve"> matches </w:t>
+            </w:r>
+            <w:r>
+              <w:rPr>
+                <w:b/>
+                <w:bCs/>
+              </w:rPr>
+              <w:t xml:space="preserve">any </w:t>
+            </w:r>
+            <w:r>
+              <w:rPr>
+                <w:b/>
+                <w:bCs/>
+              </w:rPr>
+              <w:lastRenderedPageBreak/>
+              <w:t>account data</w:t>
+            </w:r>
+            <w:r>
+              <w:rPr>
+                <w:b/>
+                <w:bCs/>
+              </w:rPr>
+              <w:t xml:space="preserve"> saved onto the database</w:t>
+            </w:r>
+          </w:p>
+        </w:tc>
+        <w:tc>
+          <w:tcPr>
+            <w:tcW w:w="1893" w:type="dxa"/>
             <w:tcBorders>
               <w:top w:val="single" w:sz="4" w:space="0" w:color="auto"/>
               <w:left w:val="single" w:sz="4" w:space="0" w:color="auto"/>
@@ -1912,26 +2481,36 @@
                 <w:bCs/>
               </w:rPr>
             </w:pPr>
-          </w:p>
-        </w:tc>
-        <w:tc>
-          <w:tcPr>
-            <w:tcW w:w="2145" w:type="dxa"/>
-            <w:tcBorders>
-              <w:top w:val="single" w:sz="4" w:space="0" w:color="auto"/>
-              <w:left w:val="single" w:sz="4" w:space="0" w:color="auto"/>
-              <w:bottom w:val="single" w:sz="4" w:space="0" w:color="auto"/>
-              <w:right w:val="single" w:sz="4" w:space="0" w:color="auto"/>
-            </w:tcBorders>
-          </w:tcPr>
-          <w:p>
-            <w:pPr>
-              <w:spacing w:after="160" w:line="278" w:lineRule="auto"/>
-              <w:rPr>
-                <w:b/>
-                <w:bCs/>
-              </w:rPr>
-            </w:pPr>
+            <w:r>
+              <w:rPr>
+                <w:b/>
+                <w:bCs/>
+              </w:rPr>
+              <w:lastRenderedPageBreak/>
+              <w:t xml:space="preserve">This feature will benefit the </w:t>
+            </w:r>
+            <w:r>
+              <w:rPr>
+                <w:b/>
+                <w:bCs/>
+              </w:rPr>
+              <w:t>customer</w:t>
+            </w:r>
+            <w:r>
+              <w:rPr>
+                <w:b/>
+                <w:bCs/>
+              </w:rPr>
+              <w:t xml:space="preserve"> as it allows for users to sign into their accounts to update and view data about their bookings, and view information </w:t>
+            </w:r>
+            <w:r>
+              <w:rPr>
+                <w:b/>
+                <w:bCs/>
+              </w:rPr>
+              <w:lastRenderedPageBreak/>
+              <w:t xml:space="preserve">about room availability. </w:t>
+            </w:r>
           </w:p>
         </w:tc>
       </w:tr>
@@ -1941,7 +2520,7 @@
         </w:trPr>
         <w:tc>
           <w:tcPr>
-            <w:tcW w:w="2145" w:type="dxa"/>
+            <w:tcW w:w="2132" w:type="dxa"/>
             <w:tcBorders>
               <w:top w:val="single" w:sz="4" w:space="0" w:color="auto"/>
               <w:left w:val="single" w:sz="4" w:space="0" w:color="auto"/>
@@ -1962,6 +2541,7 @@
                 <w:b/>
                 <w:bCs/>
               </w:rPr>
+              <w:lastRenderedPageBreak/>
               <w:t>Create booking</w:t>
             </w:r>
             <w:r>
@@ -1975,7 +2555,7 @@
         </w:tc>
         <w:tc>
           <w:tcPr>
-            <w:tcW w:w="2145" w:type="dxa"/>
+            <w:tcW w:w="2133" w:type="dxa"/>
             <w:tcBorders>
               <w:top w:val="single" w:sz="4" w:space="0" w:color="auto"/>
               <w:left w:val="single" w:sz="4" w:space="0" w:color="auto"/>
@@ -1996,13 +2576,125 @@
                 <w:b/>
                 <w:bCs/>
               </w:rPr>
-              <w:t xml:space="preserve">As Jon, I want to be able to create bookings through a verified account for simpler management of my data. </w:t>
-            </w:r>
-          </w:p>
-        </w:tc>
-        <w:tc>
-          <w:tcPr>
-            <w:tcW w:w="2145" w:type="dxa"/>
+              <w:t xml:space="preserve">As Jon, I want to be able to create bookings through </w:t>
+            </w:r>
+            <w:r>
+              <w:rPr>
+                <w:b/>
+                <w:bCs/>
+              </w:rPr>
+              <w:t xml:space="preserve">my </w:t>
+            </w:r>
+            <w:r>
+              <w:rPr>
+                <w:b/>
+                <w:bCs/>
+              </w:rPr>
+              <w:t xml:space="preserve">account for simpler management of my data. </w:t>
+            </w:r>
+          </w:p>
+        </w:tc>
+        <w:tc>
+          <w:tcPr>
+            <w:tcW w:w="2768" w:type="dxa"/>
+            <w:tcBorders>
+              <w:top w:val="single" w:sz="4" w:space="0" w:color="auto"/>
+              <w:left w:val="single" w:sz="4" w:space="0" w:color="auto"/>
+              <w:bottom w:val="single" w:sz="4" w:space="0" w:color="auto"/>
+              <w:right w:val="single" w:sz="4" w:space="0" w:color="auto"/>
+            </w:tcBorders>
+          </w:tcPr>
+          <w:p>
+            <w:pPr>
+              <w:pStyle w:val="ListParagraph"/>
+              <w:numPr>
+                <w:ilvl w:val="0"/>
+                <w:numId w:val="2"/>
+              </w:numPr>
+              <w:rPr>
+                <w:b/>
+                <w:bCs/>
+              </w:rPr>
+            </w:pPr>
+            <w:r>
+              <w:rPr>
+                <w:b/>
+                <w:bCs/>
+              </w:rPr>
+              <w:t>Provide user with a form-based page to enter booking details</w:t>
+            </w:r>
+          </w:p>
+          <w:p>
+            <w:pPr>
+              <w:pStyle w:val="ListParagraph"/>
+              <w:numPr>
+                <w:ilvl w:val="0"/>
+                <w:numId w:val="2"/>
+              </w:numPr>
+              <w:rPr>
+                <w:b/>
+                <w:bCs/>
+              </w:rPr>
+            </w:pPr>
+            <w:r>
+              <w:rPr>
+                <w:b/>
+                <w:bCs/>
+              </w:rPr>
+              <w:t>The solution should provide the user with an appropriate UI/UX to fit the user</w:t>
+            </w:r>
+            <w:r>
+              <w:rPr>
+                <w:b/>
+                <w:bCs/>
+              </w:rPr>
+              <w:t xml:space="preserve"> requirements</w:t>
+            </w:r>
+          </w:p>
+          <w:p>
+            <w:pPr>
+              <w:pStyle w:val="ListParagraph"/>
+              <w:numPr>
+                <w:ilvl w:val="0"/>
+                <w:numId w:val="2"/>
+              </w:numPr>
+              <w:rPr>
+                <w:b/>
+                <w:bCs/>
+              </w:rPr>
+            </w:pPr>
+            <w:r>
+              <w:rPr>
+                <w:b/>
+                <w:bCs/>
+              </w:rPr>
+              <w:t>Verify that the information entered is in the correct format</w:t>
+            </w:r>
+          </w:p>
+          <w:p>
+            <w:pPr>
+              <w:pStyle w:val="ListParagraph"/>
+              <w:numPr>
+                <w:ilvl w:val="0"/>
+                <w:numId w:val="2"/>
+              </w:numPr>
+              <w:rPr>
+                <w:b/>
+                <w:bCs/>
+              </w:rPr>
+            </w:pPr>
+            <w:r>
+              <w:rPr>
+                <w:b/>
+                <w:bCs/>
+              </w:rPr>
+              <w:t>Check that the data entered passes all validation checks</w:t>
+            </w:r>
+          </w:p>
+        </w:tc>
+        <w:tc>
+          <w:tcPr>
+            <w:tcW w:w="1893" w:type="dxa"/>
             <w:tcBorders>
               <w:top w:val="single" w:sz="4" w:space="0" w:color="auto"/>
               <w:left w:val="single" w:sz="4" w:space="0" w:color="auto"/>
@@ -2018,26 +2710,27 @@
                 <w:bCs/>
               </w:rPr>
             </w:pPr>
-          </w:p>
-        </w:tc>
-        <w:tc>
-          <w:tcPr>
-            <w:tcW w:w="2145" w:type="dxa"/>
-            <w:tcBorders>
-              <w:top w:val="single" w:sz="4" w:space="0" w:color="auto"/>
-              <w:left w:val="single" w:sz="4" w:space="0" w:color="auto"/>
-              <w:bottom w:val="single" w:sz="4" w:space="0" w:color="auto"/>
-              <w:right w:val="single" w:sz="4" w:space="0" w:color="auto"/>
-            </w:tcBorders>
-          </w:tcPr>
-          <w:p>
-            <w:pPr>
-              <w:spacing w:after="160" w:line="278" w:lineRule="auto"/>
-              <w:rPr>
-                <w:b/>
-                <w:bCs/>
-              </w:rPr>
-            </w:pPr>
+            <w:r>
+              <w:rPr>
+                <w:b/>
+                <w:bCs/>
+              </w:rPr>
+              <w:t xml:space="preserve">This feature will benefit the </w:t>
+            </w:r>
+            <w:r>
+              <w:rPr>
+                <w:b/>
+                <w:bCs/>
+              </w:rPr>
+              <w:t>customer</w:t>
+            </w:r>
+            <w:r>
+              <w:rPr>
+                <w:b/>
+                <w:bCs/>
+              </w:rPr>
+              <w:t xml:space="preserve"> as it allows for users to create bookings online rather than in-person allowing for a better automated process. </w:t>
+            </w:r>
           </w:p>
         </w:tc>
       </w:tr>
@@ -2047,7 +2740,7 @@
         </w:trPr>
         <w:tc>
           <w:tcPr>
-            <w:tcW w:w="2145" w:type="dxa"/>
+            <w:tcW w:w="2132" w:type="dxa"/>
             <w:tcBorders>
               <w:top w:val="single" w:sz="4" w:space="0" w:color="auto"/>
               <w:left w:val="single" w:sz="4" w:space="0" w:color="auto"/>
@@ -2068,99 +2761,188 @@
                 <w:b/>
                 <w:bCs/>
               </w:rPr>
+              <w:t>View bookings</w:t>
+            </w:r>
+          </w:p>
+        </w:tc>
+        <w:tc>
+          <w:tcPr>
+            <w:tcW w:w="2133" w:type="dxa"/>
+            <w:tcBorders>
+              <w:top w:val="single" w:sz="4" w:space="0" w:color="auto"/>
+              <w:left w:val="single" w:sz="4" w:space="0" w:color="auto"/>
+              <w:bottom w:val="single" w:sz="4" w:space="0" w:color="auto"/>
+              <w:right w:val="single" w:sz="4" w:space="0" w:color="auto"/>
+            </w:tcBorders>
+          </w:tcPr>
+          <w:p>
+            <w:pPr>
+              <w:spacing w:after="160" w:line="278" w:lineRule="auto"/>
+              <w:rPr>
+                <w:b/>
+                <w:bCs/>
+              </w:rPr>
+            </w:pPr>
+            <w:r>
+              <w:rPr>
+                <w:b/>
+                <w:bCs/>
+              </w:rPr>
+              <w:t xml:space="preserve">As Jon, I want to be able to view my bookings via my account, so that everything is organised and in a clear format. </w:t>
+            </w:r>
+          </w:p>
+          <w:p>
+            <w:pPr>
+              <w:spacing w:after="160" w:line="278" w:lineRule="auto"/>
+              <w:rPr>
+                <w:b/>
+                <w:bCs/>
+              </w:rPr>
+            </w:pPr>
+            <w:r>
+              <w:rPr>
+                <w:b/>
+                <w:bCs/>
+              </w:rPr>
+              <w:t xml:space="preserve">As Sam, I want to be able to view bookings made by customers </w:t>
+            </w:r>
+            <w:r>
+              <w:rPr>
+                <w:b/>
+                <w:bCs/>
+              </w:rPr>
+              <w:t xml:space="preserve">online so that this information is easier to manage. </w:t>
+            </w:r>
+          </w:p>
+        </w:tc>
+        <w:tc>
+          <w:tcPr>
+            <w:tcW w:w="2768" w:type="dxa"/>
+            <w:tcBorders>
+              <w:top w:val="single" w:sz="4" w:space="0" w:color="auto"/>
+              <w:left w:val="single" w:sz="4" w:space="0" w:color="auto"/>
+              <w:bottom w:val="single" w:sz="4" w:space="0" w:color="auto"/>
+              <w:right w:val="single" w:sz="4" w:space="0" w:color="auto"/>
+            </w:tcBorders>
+          </w:tcPr>
+          <w:p>
+            <w:pPr>
+              <w:pStyle w:val="ListParagraph"/>
+              <w:numPr>
+                <w:ilvl w:val="0"/>
+                <w:numId w:val="2"/>
+              </w:numPr>
+              <w:rPr>
+                <w:b/>
+                <w:bCs/>
+              </w:rPr>
+            </w:pPr>
+            <w:r>
+              <w:rPr>
+                <w:b/>
+                <w:bCs/>
+              </w:rPr>
+              <w:t>The solution should provide the user with an appropriate UI/UX to fit the user</w:t>
+            </w:r>
+            <w:r>
+              <w:rPr>
+                <w:b/>
+                <w:bCs/>
+              </w:rPr>
+              <w:t xml:space="preserve"> requirements</w:t>
+            </w:r>
+          </w:p>
+          <w:p>
+            <w:pPr>
+              <w:pStyle w:val="ListParagraph"/>
+              <w:numPr>
+                <w:ilvl w:val="0"/>
+                <w:numId w:val="2"/>
+              </w:numPr>
+              <w:rPr>
+                <w:b/>
+                <w:bCs/>
+              </w:rPr>
+            </w:pPr>
+            <w:r>
+              <w:rPr>
+                <w:b/>
+                <w:bCs/>
+              </w:rPr>
+              <w:t>Allow users to filter their bookings to display their data in a preferred format</w:t>
+            </w:r>
+          </w:p>
+        </w:tc>
+        <w:tc>
+          <w:tcPr>
+            <w:tcW w:w="1893" w:type="dxa"/>
+            <w:tcBorders>
+              <w:top w:val="single" w:sz="4" w:space="0" w:color="auto"/>
+              <w:left w:val="single" w:sz="4" w:space="0" w:color="auto"/>
+              <w:bottom w:val="single" w:sz="4" w:space="0" w:color="auto"/>
+              <w:right w:val="single" w:sz="4" w:space="0" w:color="auto"/>
+            </w:tcBorders>
+          </w:tcPr>
+          <w:p>
+            <w:pPr>
+              <w:spacing w:after="160" w:line="278" w:lineRule="auto"/>
+              <w:rPr>
+                <w:b/>
+                <w:bCs/>
+              </w:rPr>
+            </w:pPr>
+            <w:r>
+              <w:rPr>
+                <w:b/>
+                <w:bCs/>
+              </w:rPr>
+              <w:t xml:space="preserve">This feature will benefit the </w:t>
+            </w:r>
+            <w:r>
+              <w:rPr>
+                <w:b/>
+                <w:bCs/>
+              </w:rPr>
+              <w:t>customer</w:t>
+            </w:r>
+            <w:r>
+              <w:rPr>
+                <w:b/>
+                <w:bCs/>
+              </w:rPr>
+              <w:t xml:space="preserve"> as it will allow for users to view which booking they have previously made so they do not </w:t>
+            </w:r>
+            <w:r>
+              <w:rPr>
+                <w:b/>
+                <w:bCs/>
+              </w:rPr>
+              <w:t>lose track of events.</w:t>
+            </w:r>
+          </w:p>
+          <w:p>
+            <w:pPr>
+              <w:spacing w:after="160" w:line="278" w:lineRule="auto"/>
+              <w:rPr>
+                <w:b/>
+                <w:bCs/>
+              </w:rPr>
+            </w:pPr>
+            <w:r>
+              <w:rPr>
+                <w:b/>
+                <w:bCs/>
+              </w:rPr>
+              <w:t xml:space="preserve">This feature will be beneficial as it will allow staff to have a better overview of which slots </w:t>
+            </w:r>
+            <w:r>
+              <w:rPr>
+                <w:b/>
+                <w:bCs/>
+              </w:rPr>
               <w:lastRenderedPageBreak/>
-              <w:t>View bookings</w:t>
-            </w:r>
-          </w:p>
-        </w:tc>
-        <w:tc>
-          <w:tcPr>
-            <w:tcW w:w="2145" w:type="dxa"/>
-            <w:tcBorders>
-              <w:top w:val="single" w:sz="4" w:space="0" w:color="auto"/>
-              <w:left w:val="single" w:sz="4" w:space="0" w:color="auto"/>
-              <w:bottom w:val="single" w:sz="4" w:space="0" w:color="auto"/>
-              <w:right w:val="single" w:sz="4" w:space="0" w:color="auto"/>
-            </w:tcBorders>
-          </w:tcPr>
-          <w:p>
-            <w:pPr>
-              <w:spacing w:after="160" w:line="278" w:lineRule="auto"/>
-              <w:rPr>
-                <w:b/>
-                <w:bCs/>
-              </w:rPr>
-            </w:pPr>
-            <w:r>
-              <w:rPr>
-                <w:b/>
-                <w:bCs/>
-              </w:rPr>
-              <w:t xml:space="preserve">As Jon, I want to be able to view my bookings via my account, so that everything is organised and in a clear format. </w:t>
-            </w:r>
-          </w:p>
-          <w:p>
-            <w:pPr>
-              <w:spacing w:after="160" w:line="278" w:lineRule="auto"/>
-              <w:rPr>
-                <w:b/>
-                <w:bCs/>
-              </w:rPr>
-            </w:pPr>
-            <w:r>
-              <w:rPr>
-                <w:b/>
-                <w:bCs/>
-              </w:rPr>
-              <w:t xml:space="preserve">As Sam, I want to be able to view bookings made by customers </w:t>
-            </w:r>
-            <w:r>
-              <w:rPr>
-                <w:b/>
-                <w:bCs/>
-              </w:rPr>
-              <w:t xml:space="preserve">online so that this information is easier to manage. </w:t>
-            </w:r>
-          </w:p>
-        </w:tc>
-        <w:tc>
-          <w:tcPr>
-            <w:tcW w:w="2145" w:type="dxa"/>
-            <w:tcBorders>
-              <w:top w:val="single" w:sz="4" w:space="0" w:color="auto"/>
-              <w:left w:val="single" w:sz="4" w:space="0" w:color="auto"/>
-              <w:bottom w:val="single" w:sz="4" w:space="0" w:color="auto"/>
-              <w:right w:val="single" w:sz="4" w:space="0" w:color="auto"/>
-            </w:tcBorders>
-          </w:tcPr>
-          <w:p>
-            <w:pPr>
-              <w:spacing w:after="160" w:line="278" w:lineRule="auto"/>
-              <w:rPr>
-                <w:b/>
-                <w:bCs/>
-              </w:rPr>
-            </w:pPr>
-          </w:p>
-        </w:tc>
-        <w:tc>
-          <w:tcPr>
-            <w:tcW w:w="2145" w:type="dxa"/>
-            <w:tcBorders>
-              <w:top w:val="single" w:sz="4" w:space="0" w:color="auto"/>
-              <w:left w:val="single" w:sz="4" w:space="0" w:color="auto"/>
-              <w:bottom w:val="single" w:sz="4" w:space="0" w:color="auto"/>
-              <w:right w:val="single" w:sz="4" w:space="0" w:color="auto"/>
-            </w:tcBorders>
-          </w:tcPr>
-          <w:p>
-            <w:pPr>
-              <w:spacing w:after="160" w:line="278" w:lineRule="auto"/>
-              <w:rPr>
-                <w:b/>
-                <w:bCs/>
-              </w:rPr>
-            </w:pPr>
+              <w:t xml:space="preserve">have been booked/are unavailable.   </w:t>
+            </w:r>
           </w:p>
         </w:tc>
       </w:tr>
@@ -2170,7 +2952,7 @@
         </w:trPr>
         <w:tc>
           <w:tcPr>
-            <w:tcW w:w="2145" w:type="dxa"/>
+            <w:tcW w:w="2132" w:type="dxa"/>
             <w:tcBorders>
               <w:top w:val="single" w:sz="4" w:space="0" w:color="auto"/>
               <w:left w:val="single" w:sz="4" w:space="0" w:color="auto"/>
@@ -2191,13 +2973,14 @@
                 <w:b/>
                 <w:bCs/>
               </w:rPr>
+              <w:lastRenderedPageBreak/>
               <w:t>Manage bookings</w:t>
             </w:r>
           </w:p>
         </w:tc>
         <w:tc>
           <w:tcPr>
-            <w:tcW w:w="2145" w:type="dxa"/>
+            <w:tcW w:w="2133" w:type="dxa"/>
             <w:tcBorders>
               <w:top w:val="single" w:sz="4" w:space="0" w:color="auto"/>
               <w:left w:val="single" w:sz="4" w:space="0" w:color="auto"/>
@@ -2240,27 +3023,99 @@
         </w:tc>
         <w:tc>
           <w:tcPr>
-            <w:tcW w:w="2145" w:type="dxa"/>
-            <w:tcBorders>
-              <w:top w:val="single" w:sz="4" w:space="0" w:color="auto"/>
-              <w:left w:val="single" w:sz="4" w:space="0" w:color="auto"/>
-              <w:bottom w:val="single" w:sz="4" w:space="0" w:color="auto"/>
-              <w:right w:val="single" w:sz="4" w:space="0" w:color="auto"/>
-            </w:tcBorders>
-          </w:tcPr>
-          <w:p>
-            <w:pPr>
-              <w:spacing w:after="160" w:line="278" w:lineRule="auto"/>
-              <w:rPr>
-                <w:b/>
-                <w:bCs/>
-              </w:rPr>
-            </w:pPr>
-          </w:p>
-        </w:tc>
-        <w:tc>
-          <w:tcPr>
-            <w:tcW w:w="2145" w:type="dxa"/>
+            <w:tcW w:w="2768" w:type="dxa"/>
+            <w:tcBorders>
+              <w:top w:val="single" w:sz="4" w:space="0" w:color="auto"/>
+              <w:left w:val="single" w:sz="4" w:space="0" w:color="auto"/>
+              <w:bottom w:val="single" w:sz="4" w:space="0" w:color="auto"/>
+              <w:right w:val="single" w:sz="4" w:space="0" w:color="auto"/>
+            </w:tcBorders>
+          </w:tcPr>
+          <w:p>
+            <w:pPr>
+              <w:pStyle w:val="ListParagraph"/>
+              <w:numPr>
+                <w:ilvl w:val="0"/>
+                <w:numId w:val="2"/>
+              </w:numPr>
+              <w:rPr>
+                <w:b/>
+                <w:bCs/>
+              </w:rPr>
+            </w:pPr>
+            <w:r>
+              <w:rPr>
+                <w:b/>
+                <w:bCs/>
+              </w:rPr>
+              <w:t>Provide users with an appropriate UI</w:t>
+            </w:r>
+            <w:r>
+              <w:rPr>
+                <w:b/>
+                <w:bCs/>
+              </w:rPr>
+              <w:t xml:space="preserve">/UX </w:t>
+            </w:r>
+            <w:r>
+              <w:rPr>
+                <w:b/>
+                <w:bCs/>
+              </w:rPr>
+              <w:t xml:space="preserve">to meet the user requirements </w:t>
+            </w:r>
+          </w:p>
+          <w:p>
+            <w:pPr>
+              <w:pStyle w:val="ListParagraph"/>
+              <w:numPr>
+                <w:ilvl w:val="0"/>
+                <w:numId w:val="2"/>
+              </w:numPr>
+              <w:rPr>
+                <w:b/>
+                <w:bCs/>
+              </w:rPr>
+            </w:pPr>
+            <w:r>
+              <w:rPr>
+                <w:b/>
+                <w:bCs/>
+              </w:rPr>
+              <w:t>Staff should be able to manage bookings made by users and confirm or deny based on availability</w:t>
+            </w:r>
+          </w:p>
+          <w:p>
+            <w:pPr>
+              <w:pStyle w:val="ListParagraph"/>
+              <w:numPr>
+                <w:ilvl w:val="0"/>
+                <w:numId w:val="2"/>
+              </w:numPr>
+              <w:rPr>
+                <w:b/>
+                <w:bCs/>
+              </w:rPr>
+            </w:pPr>
+            <w:r>
+              <w:rPr>
+                <w:b/>
+                <w:bCs/>
+              </w:rPr>
+              <w:t xml:space="preserve">Customers should be able to </w:t>
+            </w:r>
+            <w:r>
+              <w:rPr>
+                <w:b/>
+                <w:bCs/>
+              </w:rPr>
+              <w:t xml:space="preserve">request to update information or cancel their bookings. </w:t>
+            </w:r>
+          </w:p>
+        </w:tc>
+        <w:tc>
+          <w:tcPr>
+            <w:tcW w:w="1893" w:type="dxa"/>
             <w:tcBorders>
               <w:top w:val="single" w:sz="4" w:space="0" w:color="auto"/>
               <w:left w:val="single" w:sz="4" w:space="0" w:color="auto"/>
@@ -2285,7 +3140,7 @@
         </w:trPr>
         <w:tc>
           <w:tcPr>
-            <w:tcW w:w="2145" w:type="dxa"/>
+            <w:tcW w:w="2132" w:type="dxa"/>
             <w:tcBorders>
               <w:top w:val="single" w:sz="4" w:space="0" w:color="auto"/>
               <w:left w:val="single" w:sz="4" w:space="0" w:color="auto"/>
@@ -2311,7 +3166,7 @@
         </w:tc>
         <w:tc>
           <w:tcPr>
-            <w:tcW w:w="2145" w:type="dxa"/>
+            <w:tcW w:w="2133" w:type="dxa"/>
             <w:tcBorders>
               <w:top w:val="single" w:sz="4" w:space="0" w:color="auto"/>
               <w:left w:val="single" w:sz="4" w:space="0" w:color="auto"/>
@@ -2337,26 +3192,92 @@
         </w:tc>
         <w:tc>
           <w:tcPr>
-            <w:tcW w:w="2145" w:type="dxa"/>
-            <w:tcBorders>
-              <w:top w:val="single" w:sz="4" w:space="0" w:color="auto"/>
-              <w:left w:val="single" w:sz="4" w:space="0" w:color="auto"/>
-              <w:bottom w:val="single" w:sz="4" w:space="0" w:color="auto"/>
-              <w:right w:val="single" w:sz="4" w:space="0" w:color="auto"/>
-            </w:tcBorders>
-          </w:tcPr>
-          <w:p>
-            <w:pPr>
-              <w:rPr>
-                <w:b/>
-                <w:bCs/>
-              </w:rPr>
-            </w:pPr>
-          </w:p>
-        </w:tc>
-        <w:tc>
-          <w:tcPr>
-            <w:tcW w:w="2145" w:type="dxa"/>
+            <w:tcW w:w="2768" w:type="dxa"/>
+            <w:tcBorders>
+              <w:top w:val="single" w:sz="4" w:space="0" w:color="auto"/>
+              <w:left w:val="single" w:sz="4" w:space="0" w:color="auto"/>
+              <w:bottom w:val="single" w:sz="4" w:space="0" w:color="auto"/>
+              <w:right w:val="single" w:sz="4" w:space="0" w:color="auto"/>
+            </w:tcBorders>
+          </w:tcPr>
+          <w:p>
+            <w:pPr>
+              <w:pStyle w:val="ListParagraph"/>
+              <w:numPr>
+                <w:ilvl w:val="0"/>
+                <w:numId w:val="2"/>
+              </w:numPr>
+              <w:rPr>
+                <w:b/>
+                <w:bCs/>
+              </w:rPr>
+            </w:pPr>
+            <w:r>
+              <w:rPr>
+                <w:b/>
+                <w:bCs/>
+              </w:rPr>
+              <w:t>Provide verified users with a form-based page to edit room information</w:t>
+            </w:r>
+          </w:p>
+          <w:p>
+            <w:pPr>
+              <w:pStyle w:val="ListParagraph"/>
+              <w:numPr>
+                <w:ilvl w:val="0"/>
+                <w:numId w:val="2"/>
+              </w:numPr>
+              <w:rPr>
+                <w:b/>
+                <w:bCs/>
+              </w:rPr>
+            </w:pPr>
+            <w:r>
+              <w:rPr>
+                <w:b/>
+                <w:bCs/>
+              </w:rPr>
+              <w:t>The solution should provide the user with an appropriate UI/UX to fit the user</w:t>
+            </w:r>
+            <w:r>
+              <w:rPr>
+                <w:b/>
+                <w:bCs/>
+              </w:rPr>
+              <w:t xml:space="preserve"> requirements</w:t>
+            </w:r>
+          </w:p>
+          <w:p>
+            <w:pPr>
+              <w:pStyle w:val="ListParagraph"/>
+              <w:numPr>
+                <w:ilvl w:val="0"/>
+                <w:numId w:val="2"/>
+              </w:numPr>
+              <w:rPr>
+                <w:b/>
+                <w:bCs/>
+              </w:rPr>
+            </w:pPr>
+            <w:r>
+              <w:rPr>
+                <w:b/>
+                <w:bCs/>
+              </w:rPr>
+              <w:t>Check that the data entered passes all validation checks</w:t>
+            </w:r>
+            <w:r>
+              <w:rPr>
+                <w:b/>
+                <w:bCs/>
+              </w:rPr>
+              <w:t xml:space="preserve"> </w:t>
+            </w:r>
+          </w:p>
+        </w:tc>
+        <w:tc>
+          <w:tcPr>
+            <w:tcW w:w="1893" w:type="dxa"/>
             <w:tcBorders>
               <w:top w:val="single" w:sz="4" w:space="0" w:color="auto"/>
               <w:left w:val="single" w:sz="4" w:space="0" w:color="auto"/>
@@ -2380,86 +3301,207 @@
         </w:trPr>
         <w:tc>
           <w:tcPr>
-            <w:tcW w:w="2145" w:type="dxa"/>
-            <w:tcBorders>
-              <w:top w:val="single" w:sz="4" w:space="0" w:color="auto"/>
-              <w:left w:val="single" w:sz="4" w:space="0" w:color="auto"/>
-              <w:bottom w:val="single" w:sz="4" w:space="0" w:color="auto"/>
-              <w:right w:val="single" w:sz="4" w:space="0" w:color="auto"/>
-            </w:tcBorders>
-          </w:tcPr>
-          <w:p>
-            <w:pPr>
-              <w:rPr>
-                <w:b/>
-                <w:bCs/>
-              </w:rPr>
-            </w:pPr>
+            <w:tcW w:w="2132" w:type="dxa"/>
+            <w:tcBorders>
+              <w:top w:val="single" w:sz="4" w:space="0" w:color="auto"/>
+              <w:left w:val="single" w:sz="4" w:space="0" w:color="auto"/>
+              <w:bottom w:val="single" w:sz="4" w:space="0" w:color="auto"/>
+              <w:right w:val="single" w:sz="4" w:space="0" w:color="auto"/>
+            </w:tcBorders>
+          </w:tcPr>
+          <w:p>
+            <w:pPr>
+              <w:rPr>
+                <w:b/>
+                <w:bCs/>
+              </w:rPr>
+            </w:pPr>
+            <w:r>
+              <w:rPr>
+                <w:b/>
+                <w:bCs/>
+              </w:rPr>
+              <w:t>View available rooms</w:t>
+            </w:r>
+          </w:p>
+        </w:tc>
+        <w:tc>
+          <w:tcPr>
+            <w:tcW w:w="2133" w:type="dxa"/>
+            <w:tcBorders>
+              <w:top w:val="single" w:sz="4" w:space="0" w:color="auto"/>
+              <w:left w:val="single" w:sz="4" w:space="0" w:color="auto"/>
+              <w:bottom w:val="single" w:sz="4" w:space="0" w:color="auto"/>
+              <w:right w:val="single" w:sz="4" w:space="0" w:color="auto"/>
+            </w:tcBorders>
+          </w:tcPr>
+          <w:p>
+            <w:pPr>
+              <w:rPr>
+                <w:b/>
+                <w:bCs/>
+              </w:rPr>
+            </w:pPr>
+            <w:r>
+              <w:rPr>
+                <w:b/>
+                <w:bCs/>
+              </w:rPr>
+              <w:t xml:space="preserve">As Jon I want to be able to view the rooms available for me to book so that I </w:t>
+            </w:r>
             <w:r>
               <w:rPr>
                 <w:b/>
                 <w:bCs/>
               </w:rPr>
               <w:lastRenderedPageBreak/>
-              <w:t>View available rooms</w:t>
-            </w:r>
-          </w:p>
-        </w:tc>
-        <w:tc>
-          <w:tcPr>
-            <w:tcW w:w="2145" w:type="dxa"/>
-            <w:tcBorders>
-              <w:top w:val="single" w:sz="4" w:space="0" w:color="auto"/>
-              <w:left w:val="single" w:sz="4" w:space="0" w:color="auto"/>
-              <w:bottom w:val="single" w:sz="4" w:space="0" w:color="auto"/>
-              <w:right w:val="single" w:sz="4" w:space="0" w:color="auto"/>
-            </w:tcBorders>
-          </w:tcPr>
-          <w:p>
-            <w:pPr>
-              <w:rPr>
-                <w:b/>
-                <w:bCs/>
-              </w:rPr>
-            </w:pPr>
-          </w:p>
-        </w:tc>
-        <w:tc>
-          <w:tcPr>
-            <w:tcW w:w="2145" w:type="dxa"/>
-            <w:tcBorders>
-              <w:top w:val="single" w:sz="4" w:space="0" w:color="auto"/>
-              <w:left w:val="single" w:sz="4" w:space="0" w:color="auto"/>
-              <w:bottom w:val="single" w:sz="4" w:space="0" w:color="auto"/>
-              <w:right w:val="single" w:sz="4" w:space="0" w:color="auto"/>
-            </w:tcBorders>
-          </w:tcPr>
-          <w:p>
-            <w:pPr>
-              <w:rPr>
-                <w:b/>
-                <w:bCs/>
-              </w:rPr>
-            </w:pPr>
-          </w:p>
-        </w:tc>
-        <w:tc>
-          <w:tcPr>
-            <w:tcW w:w="2145" w:type="dxa"/>
-            <w:tcBorders>
-              <w:top w:val="single" w:sz="4" w:space="0" w:color="auto"/>
-              <w:left w:val="single" w:sz="4" w:space="0" w:color="auto"/>
-              <w:bottom w:val="single" w:sz="4" w:space="0" w:color="auto"/>
-              <w:right w:val="single" w:sz="4" w:space="0" w:color="auto"/>
-            </w:tcBorders>
-          </w:tcPr>
-          <w:p>
-            <w:pPr>
-              <w:rPr>
-                <w:b/>
-                <w:bCs/>
-              </w:rPr>
-            </w:pPr>
+              <w:t xml:space="preserve">can choose a room that is best suited to my needs. </w:t>
+            </w:r>
+          </w:p>
+          <w:p>
+            <w:pPr>
+              <w:rPr>
+                <w:b/>
+                <w:bCs/>
+              </w:rPr>
+            </w:pPr>
+            <w:r>
+              <w:rPr>
+                <w:b/>
+                <w:bCs/>
+              </w:rPr>
+              <w:t xml:space="preserve">As Sam, I would need to view the available rooms so that I can confirm or deny customer booking requests. </w:t>
+            </w:r>
+          </w:p>
+        </w:tc>
+        <w:tc>
+          <w:tcPr>
+            <w:tcW w:w="2768" w:type="dxa"/>
+            <w:tcBorders>
+              <w:top w:val="single" w:sz="4" w:space="0" w:color="auto"/>
+              <w:left w:val="single" w:sz="4" w:space="0" w:color="auto"/>
+              <w:bottom w:val="single" w:sz="4" w:space="0" w:color="auto"/>
+              <w:right w:val="single" w:sz="4" w:space="0" w:color="auto"/>
+            </w:tcBorders>
+          </w:tcPr>
+          <w:p>
+            <w:pPr>
+              <w:pStyle w:val="ListParagraph"/>
+              <w:numPr>
+                <w:ilvl w:val="0"/>
+                <w:numId w:val="2"/>
+              </w:numPr>
+              <w:rPr>
+                <w:b/>
+                <w:bCs/>
+              </w:rPr>
+            </w:pPr>
+            <w:r>
+              <w:rPr>
+                <w:b/>
+                <w:bCs/>
+              </w:rPr>
+              <w:lastRenderedPageBreak/>
+              <w:t xml:space="preserve">The solution should provide the user with an appropriate UI/UX to fit the </w:t>
+            </w:r>
+            <w:r>
+              <w:rPr>
+                <w:b/>
+                <w:bCs/>
+              </w:rPr>
+              <w:lastRenderedPageBreak/>
+              <w:t>user requirements</w:t>
+            </w:r>
+          </w:p>
+          <w:p>
+            <w:pPr>
+              <w:pStyle w:val="ListParagraph"/>
+              <w:numPr>
+                <w:ilvl w:val="0"/>
+                <w:numId w:val="2"/>
+              </w:numPr>
+              <w:rPr>
+                <w:b/>
+                <w:bCs/>
+              </w:rPr>
+            </w:pPr>
+            <w:r>
+              <w:rPr>
+                <w:b/>
+                <w:bCs/>
+              </w:rPr>
+              <w:t xml:space="preserve">The user should be able to filter the available rooms to find rooms that fit </w:t>
+            </w:r>
+            <w:r>
+              <w:rPr>
+                <w:b/>
+                <w:bCs/>
+              </w:rPr>
+              <w:t>their specific needs</w:t>
+            </w:r>
+          </w:p>
+        </w:tc>
+        <w:tc>
+          <w:tcPr>
+            <w:tcW w:w="1893" w:type="dxa"/>
+            <w:tcBorders>
+              <w:top w:val="single" w:sz="4" w:space="0" w:color="auto"/>
+              <w:left w:val="single" w:sz="4" w:space="0" w:color="auto"/>
+              <w:bottom w:val="single" w:sz="4" w:space="0" w:color="auto"/>
+              <w:right w:val="single" w:sz="4" w:space="0" w:color="auto"/>
+            </w:tcBorders>
+          </w:tcPr>
+          <w:p>
+            <w:pPr>
+              <w:rPr>
+                <w:b/>
+                <w:bCs/>
+              </w:rPr>
+            </w:pPr>
+            <w:r>
+              <w:rPr>
+                <w:b/>
+                <w:bCs/>
+              </w:rPr>
+              <w:lastRenderedPageBreak/>
+              <w:t xml:space="preserve">This feature will be beneficial as it will allow </w:t>
+            </w:r>
+            <w:r>
+              <w:rPr>
+                <w:b/>
+                <w:bCs/>
+              </w:rPr>
+              <w:t xml:space="preserve">all users </w:t>
+            </w:r>
+            <w:r>
+              <w:rPr>
+                <w:b/>
+                <w:bCs/>
+              </w:rPr>
+              <w:t xml:space="preserve">to have a </w:t>
+            </w:r>
+            <w:r>
+              <w:rPr>
+                <w:b/>
+                <w:bCs/>
+              </w:rPr>
+              <w:lastRenderedPageBreak/>
+              <w:t xml:space="preserve">better overview of which </w:t>
+            </w:r>
+            <w:r>
+              <w:rPr>
+                <w:b/>
+                <w:bCs/>
+              </w:rPr>
+              <w:t>rooms</w:t>
+            </w:r>
+            <w:r>
+              <w:rPr>
+                <w:b/>
+                <w:bCs/>
+              </w:rPr>
+              <w:t xml:space="preserve"> are available.   </w:t>
+            </w:r>
           </w:p>
         </w:tc>
       </w:tr>
@@ -2469,85 +3511,208 @@
         </w:trPr>
         <w:tc>
           <w:tcPr>
-            <w:tcW w:w="2145" w:type="dxa"/>
-            <w:tcBorders>
-              <w:top w:val="single" w:sz="4" w:space="0" w:color="auto"/>
-              <w:left w:val="single" w:sz="4" w:space="0" w:color="auto"/>
-              <w:bottom w:val="single" w:sz="4" w:space="0" w:color="auto"/>
-              <w:right w:val="single" w:sz="4" w:space="0" w:color="auto"/>
-            </w:tcBorders>
-          </w:tcPr>
-          <w:p>
-            <w:pPr>
-              <w:rPr>
-                <w:b/>
-                <w:bCs/>
-              </w:rPr>
-            </w:pPr>
-            <w:r>
-              <w:rPr>
-                <w:b/>
-                <w:bCs/>
-              </w:rPr>
+            <w:tcW w:w="2132" w:type="dxa"/>
+            <w:tcBorders>
+              <w:top w:val="single" w:sz="4" w:space="0" w:color="auto"/>
+              <w:left w:val="single" w:sz="4" w:space="0" w:color="auto"/>
+              <w:bottom w:val="single" w:sz="4" w:space="0" w:color="auto"/>
+              <w:right w:val="single" w:sz="4" w:space="0" w:color="auto"/>
+            </w:tcBorders>
+          </w:tcPr>
+          <w:p>
+            <w:pPr>
+              <w:rPr>
+                <w:b/>
+                <w:bCs/>
+              </w:rPr>
+            </w:pPr>
+            <w:r>
+              <w:rPr>
+                <w:b/>
+                <w:bCs/>
+              </w:rPr>
+              <w:lastRenderedPageBreak/>
               <w:t xml:space="preserve">Set Payment method </w:t>
             </w:r>
           </w:p>
         </w:tc>
         <w:tc>
           <w:tcPr>
-            <w:tcW w:w="2145" w:type="dxa"/>
-            <w:tcBorders>
-              <w:top w:val="single" w:sz="4" w:space="0" w:color="auto"/>
-              <w:left w:val="single" w:sz="4" w:space="0" w:color="auto"/>
-              <w:bottom w:val="single" w:sz="4" w:space="0" w:color="auto"/>
-              <w:right w:val="single" w:sz="4" w:space="0" w:color="auto"/>
-            </w:tcBorders>
-          </w:tcPr>
-          <w:p>
-            <w:pPr>
-              <w:rPr>
-                <w:b/>
-                <w:bCs/>
-              </w:rPr>
-            </w:pPr>
-          </w:p>
-        </w:tc>
-        <w:tc>
-          <w:tcPr>
-            <w:tcW w:w="2145" w:type="dxa"/>
-            <w:tcBorders>
-              <w:top w:val="single" w:sz="4" w:space="0" w:color="auto"/>
-              <w:left w:val="single" w:sz="4" w:space="0" w:color="auto"/>
-              <w:bottom w:val="single" w:sz="4" w:space="0" w:color="auto"/>
-              <w:right w:val="single" w:sz="4" w:space="0" w:color="auto"/>
-            </w:tcBorders>
-          </w:tcPr>
-          <w:p>
-            <w:pPr>
-              <w:rPr>
-                <w:b/>
-                <w:bCs/>
-              </w:rPr>
-            </w:pPr>
-          </w:p>
-        </w:tc>
-        <w:tc>
-          <w:tcPr>
-            <w:tcW w:w="2145" w:type="dxa"/>
-            <w:tcBorders>
-              <w:top w:val="single" w:sz="4" w:space="0" w:color="auto"/>
-              <w:left w:val="single" w:sz="4" w:space="0" w:color="auto"/>
-              <w:bottom w:val="single" w:sz="4" w:space="0" w:color="auto"/>
-              <w:right w:val="single" w:sz="4" w:space="0" w:color="auto"/>
-            </w:tcBorders>
-          </w:tcPr>
-          <w:p>
-            <w:pPr>
-              <w:rPr>
-                <w:b/>
-                <w:bCs/>
-              </w:rPr>
-            </w:pPr>
+            <w:tcW w:w="2133" w:type="dxa"/>
+            <w:tcBorders>
+              <w:top w:val="single" w:sz="4" w:space="0" w:color="auto"/>
+              <w:left w:val="single" w:sz="4" w:space="0" w:color="auto"/>
+              <w:bottom w:val="single" w:sz="4" w:space="0" w:color="auto"/>
+              <w:right w:val="single" w:sz="4" w:space="0" w:color="auto"/>
+            </w:tcBorders>
+          </w:tcPr>
+          <w:p>
+            <w:pPr>
+              <w:rPr>
+                <w:b/>
+                <w:bCs/>
+              </w:rPr>
+            </w:pPr>
+            <w:r>
+              <w:rPr>
+                <w:b/>
+                <w:bCs/>
+              </w:rPr>
+              <w:t xml:space="preserve">As Jon, I want to set </w:t>
+            </w:r>
+            <w:r>
+              <w:rPr>
+                <w:b/>
+                <w:bCs/>
+              </w:rPr>
+              <w:t xml:space="preserve">and save </w:t>
+            </w:r>
+            <w:r>
+              <w:rPr>
+                <w:b/>
+                <w:bCs/>
+              </w:rPr>
+              <w:t xml:space="preserve">my payment method to book a room </w:t>
+            </w:r>
+            <w:r>
+              <w:rPr>
+                <w:b/>
+                <w:bCs/>
+              </w:rPr>
+              <w:t>so that I have easier access when purchasing again in the future.</w:t>
+            </w:r>
+          </w:p>
+        </w:tc>
+        <w:tc>
+          <w:tcPr>
+            <w:tcW w:w="2768" w:type="dxa"/>
+            <w:tcBorders>
+              <w:top w:val="single" w:sz="4" w:space="0" w:color="auto"/>
+              <w:left w:val="single" w:sz="4" w:space="0" w:color="auto"/>
+              <w:bottom w:val="single" w:sz="4" w:space="0" w:color="auto"/>
+              <w:right w:val="single" w:sz="4" w:space="0" w:color="auto"/>
+            </w:tcBorders>
+          </w:tcPr>
+          <w:p>
+            <w:pPr>
+              <w:pStyle w:val="ListParagraph"/>
+              <w:numPr>
+                <w:ilvl w:val="0"/>
+                <w:numId w:val="2"/>
+              </w:numPr>
+              <w:rPr>
+                <w:b/>
+                <w:bCs/>
+              </w:rPr>
+            </w:pPr>
+            <w:r>
+              <w:rPr>
+                <w:b/>
+                <w:bCs/>
+              </w:rPr>
+              <w:t xml:space="preserve">Provide user with a form-based page to enter </w:t>
+            </w:r>
+            <w:r>
+              <w:rPr>
+                <w:b/>
+                <w:bCs/>
+              </w:rPr>
+              <w:t>payment</w:t>
+            </w:r>
+            <w:r>
+              <w:rPr>
+                <w:b/>
+                <w:bCs/>
+              </w:rPr>
+              <w:t xml:space="preserve"> details</w:t>
+            </w:r>
+          </w:p>
+          <w:p>
+            <w:pPr>
+              <w:pStyle w:val="ListParagraph"/>
+              <w:numPr>
+                <w:ilvl w:val="0"/>
+                <w:numId w:val="2"/>
+              </w:numPr>
+              <w:rPr>
+                <w:b/>
+                <w:bCs/>
+              </w:rPr>
+            </w:pPr>
+            <w:r>
+              <w:rPr>
+                <w:b/>
+                <w:bCs/>
+              </w:rPr>
+              <w:t>The solution should provide the user with an appropriate UI/UX to fit the user</w:t>
+            </w:r>
+            <w:r>
+              <w:rPr>
+                <w:b/>
+                <w:bCs/>
+              </w:rPr>
+              <w:t xml:space="preserve"> requirements </w:t>
+            </w:r>
+          </w:p>
+          <w:p>
+            <w:pPr>
+              <w:pStyle w:val="ListParagraph"/>
+              <w:numPr>
+                <w:ilvl w:val="0"/>
+                <w:numId w:val="2"/>
+              </w:numPr>
+              <w:rPr>
+                <w:b/>
+                <w:bCs/>
+              </w:rPr>
+            </w:pPr>
+            <w:r>
+              <w:rPr>
+                <w:b/>
+                <w:bCs/>
+              </w:rPr>
+              <w:t>Verify that the information entered is in the correct format</w:t>
+            </w:r>
+          </w:p>
+        </w:tc>
+        <w:tc>
+          <w:tcPr>
+            <w:tcW w:w="1893" w:type="dxa"/>
+            <w:tcBorders>
+              <w:top w:val="single" w:sz="4" w:space="0" w:color="auto"/>
+              <w:left w:val="single" w:sz="4" w:space="0" w:color="auto"/>
+              <w:bottom w:val="single" w:sz="4" w:space="0" w:color="auto"/>
+              <w:right w:val="single" w:sz="4" w:space="0" w:color="auto"/>
+            </w:tcBorders>
+          </w:tcPr>
+          <w:p>
+            <w:pPr>
+              <w:rPr>
+                <w:b/>
+                <w:bCs/>
+              </w:rPr>
+            </w:pPr>
+            <w:r>
+              <w:rPr>
+                <w:b/>
+                <w:bCs/>
+              </w:rPr>
+              <w:t xml:space="preserve">This will be beneficial for the client as the function would allow for the user to </w:t>
+            </w:r>
+            <w:r>
+              <w:rPr>
+                <w:b/>
+                <w:bCs/>
+              </w:rPr>
+              <w:t>set a</w:t>
+            </w:r>
+            <w:r>
+              <w:rPr>
+                <w:b/>
+                <w:bCs/>
+              </w:rPr>
+              <w:t xml:space="preserve"> payment method in order to make purchases through the solution instead of in person. </w:t>
+            </w:r>
           </w:p>
         </w:tc>
       </w:tr>
@@ -2557,7 +3722,7 @@
         </w:trPr>
         <w:tc>
           <w:tcPr>
-            <w:tcW w:w="2145" w:type="dxa"/>
+            <w:tcW w:w="2132" w:type="dxa"/>
             <w:tcBorders>
               <w:top w:val="single" w:sz="4" w:space="0" w:color="auto"/>
               <w:left w:val="single" w:sz="4" w:space="0" w:color="auto"/>
@@ -2583,45 +3748,139 @@
         </w:tc>
         <w:tc>
           <w:tcPr>
-            <w:tcW w:w="2145" w:type="dxa"/>
-            <w:tcBorders>
-              <w:top w:val="single" w:sz="4" w:space="0" w:color="auto"/>
-              <w:left w:val="single" w:sz="4" w:space="0" w:color="auto"/>
-              <w:bottom w:val="single" w:sz="4" w:space="0" w:color="auto"/>
-              <w:right w:val="single" w:sz="4" w:space="0" w:color="auto"/>
-            </w:tcBorders>
-          </w:tcPr>
-          <w:p>
-            <w:pPr>
-              <w:rPr>
-                <w:b/>
-                <w:bCs/>
-              </w:rPr>
-            </w:pPr>
-          </w:p>
-        </w:tc>
-        <w:tc>
-          <w:tcPr>
-            <w:tcW w:w="2145" w:type="dxa"/>
-            <w:tcBorders>
-              <w:top w:val="single" w:sz="4" w:space="0" w:color="auto"/>
-              <w:left w:val="single" w:sz="4" w:space="0" w:color="auto"/>
-              <w:bottom w:val="single" w:sz="4" w:space="0" w:color="auto"/>
-              <w:right w:val="single" w:sz="4" w:space="0" w:color="auto"/>
-            </w:tcBorders>
-          </w:tcPr>
-          <w:p>
-            <w:pPr>
-              <w:rPr>
-                <w:b/>
-                <w:bCs/>
-              </w:rPr>
-            </w:pPr>
-          </w:p>
-        </w:tc>
-        <w:tc>
-          <w:tcPr>
-            <w:tcW w:w="2145" w:type="dxa"/>
+            <w:tcW w:w="2133" w:type="dxa"/>
+            <w:tcBorders>
+              <w:top w:val="single" w:sz="4" w:space="0" w:color="auto"/>
+              <w:left w:val="single" w:sz="4" w:space="0" w:color="auto"/>
+              <w:bottom w:val="single" w:sz="4" w:space="0" w:color="auto"/>
+              <w:right w:val="single" w:sz="4" w:space="0" w:color="auto"/>
+            </w:tcBorders>
+          </w:tcPr>
+          <w:p>
+            <w:pPr>
+              <w:rPr>
+                <w:b/>
+                <w:bCs/>
+              </w:rPr>
+            </w:pPr>
+            <w:r>
+              <w:rPr>
+                <w:b/>
+                <w:bCs/>
+              </w:rPr>
+              <w:t xml:space="preserve">As Jon, I want to have the option to update or remove a payment option so that I can change my details if I need to in the future. </w:t>
+            </w:r>
+          </w:p>
+        </w:tc>
+        <w:tc>
+          <w:tcPr>
+            <w:tcW w:w="2768" w:type="dxa"/>
+            <w:tcBorders>
+              <w:top w:val="single" w:sz="4" w:space="0" w:color="auto"/>
+              <w:left w:val="single" w:sz="4" w:space="0" w:color="auto"/>
+              <w:bottom w:val="single" w:sz="4" w:space="0" w:color="auto"/>
+              <w:right w:val="single" w:sz="4" w:space="0" w:color="auto"/>
+            </w:tcBorders>
+          </w:tcPr>
+          <w:p>
+            <w:pPr>
+              <w:pStyle w:val="ListParagraph"/>
+              <w:numPr>
+                <w:ilvl w:val="0"/>
+                <w:numId w:val="2"/>
+              </w:numPr>
+              <w:rPr>
+                <w:b/>
+                <w:bCs/>
+              </w:rPr>
+            </w:pPr>
+            <w:r>
+              <w:rPr>
+                <w:b/>
+                <w:bCs/>
+              </w:rPr>
+              <w:t xml:space="preserve">Provide user with a form-based page to </w:t>
+            </w:r>
+            <w:r>
+              <w:rPr>
+                <w:b/>
+                <w:bCs/>
+              </w:rPr>
+              <w:t>update or delete</w:t>
+            </w:r>
+            <w:r>
+              <w:rPr>
+                <w:b/>
+                <w:bCs/>
+              </w:rPr>
+              <w:t xml:space="preserve"> </w:t>
+            </w:r>
+            <w:r>
+              <w:rPr>
+                <w:b/>
+                <w:bCs/>
+              </w:rPr>
+              <w:t>payment</w:t>
+            </w:r>
+            <w:r>
+              <w:rPr>
+                <w:b/>
+                <w:bCs/>
+              </w:rPr>
+              <w:t xml:space="preserve"> </w:t>
+            </w:r>
+            <w:r>
+              <w:rPr>
+                <w:b/>
+                <w:bCs/>
+              </w:rPr>
+              <w:t>methods</w:t>
+            </w:r>
+          </w:p>
+          <w:p>
+            <w:pPr>
+              <w:pStyle w:val="ListParagraph"/>
+              <w:numPr>
+                <w:ilvl w:val="0"/>
+                <w:numId w:val="2"/>
+              </w:numPr>
+              <w:rPr>
+                <w:b/>
+                <w:bCs/>
+              </w:rPr>
+            </w:pPr>
+            <w:r>
+              <w:rPr>
+                <w:b/>
+                <w:bCs/>
+              </w:rPr>
+              <w:t xml:space="preserve">The solution should provide the user with an appropriate UI/UX to fit the user requirements </w:t>
+            </w:r>
+          </w:p>
+          <w:p>
+            <w:pPr>
+              <w:pStyle w:val="ListParagraph"/>
+              <w:numPr>
+                <w:ilvl w:val="0"/>
+                <w:numId w:val="2"/>
+              </w:numPr>
+              <w:rPr>
+                <w:b/>
+                <w:bCs/>
+              </w:rPr>
+            </w:pPr>
+            <w:r>
+              <w:rPr>
+                <w:b/>
+                <w:bCs/>
+              </w:rPr>
+              <w:t>Verify that the information entered is in the correct format</w:t>
+            </w:r>
+          </w:p>
+        </w:tc>
+        <w:tc>
+          <w:tcPr>
+            <w:tcW w:w="1893" w:type="dxa"/>
             <w:tcBorders>
               <w:top w:val="single" w:sz="4" w:space="0" w:color="auto"/>
               <w:left w:val="single" w:sz="4" w:space="0" w:color="auto"/>
@@ -2645,7 +3904,7 @@
         </w:trPr>
         <w:tc>
           <w:tcPr>
-            <w:tcW w:w="2145" w:type="dxa"/>
+            <w:tcW w:w="2132" w:type="dxa"/>
             <w:tcBorders>
               <w:top w:val="single" w:sz="4" w:space="0" w:color="auto"/>
               <w:left w:val="single" w:sz="4" w:space="0" w:color="auto"/>
@@ -2667,292 +3926,191 @@
               </w:rPr>
               <w:t>View policies</w:t>
             </w:r>
-          </w:p>
-        </w:tc>
-        <w:tc>
-          <w:tcPr>
-            <w:tcW w:w="2145" w:type="dxa"/>
-            <w:tcBorders>
-              <w:top w:val="single" w:sz="4" w:space="0" w:color="auto"/>
-              <w:left w:val="single" w:sz="4" w:space="0" w:color="auto"/>
-              <w:bottom w:val="single" w:sz="4" w:space="0" w:color="auto"/>
-              <w:right w:val="single" w:sz="4" w:space="0" w:color="auto"/>
-            </w:tcBorders>
-          </w:tcPr>
-          <w:p>
-            <w:pPr>
-              <w:rPr>
-                <w:b/>
-                <w:bCs/>
-              </w:rPr>
-            </w:pPr>
-          </w:p>
-        </w:tc>
-        <w:tc>
-          <w:tcPr>
-            <w:tcW w:w="2145" w:type="dxa"/>
-            <w:tcBorders>
-              <w:top w:val="single" w:sz="4" w:space="0" w:color="auto"/>
-              <w:left w:val="single" w:sz="4" w:space="0" w:color="auto"/>
-              <w:bottom w:val="single" w:sz="4" w:space="0" w:color="auto"/>
-              <w:right w:val="single" w:sz="4" w:space="0" w:color="auto"/>
-            </w:tcBorders>
-          </w:tcPr>
-          <w:p>
-            <w:pPr>
-              <w:rPr>
-                <w:b/>
-                <w:bCs/>
-              </w:rPr>
-            </w:pPr>
-          </w:p>
-        </w:tc>
-        <w:tc>
-          <w:tcPr>
-            <w:tcW w:w="2145" w:type="dxa"/>
-            <w:tcBorders>
-              <w:top w:val="single" w:sz="4" w:space="0" w:color="auto"/>
-              <w:left w:val="single" w:sz="4" w:space="0" w:color="auto"/>
-              <w:bottom w:val="single" w:sz="4" w:space="0" w:color="auto"/>
-              <w:right w:val="single" w:sz="4" w:space="0" w:color="auto"/>
-            </w:tcBorders>
-          </w:tcPr>
-          <w:p>
-            <w:pPr>
-              <w:rPr>
-                <w:b/>
-                <w:bCs/>
-              </w:rPr>
-            </w:pPr>
-          </w:p>
-        </w:tc>
-      </w:tr>
-      <w:tr>
-        <w:trPr>
-          <w:trHeight w:val="360"/>
-        </w:trPr>
-        <w:tc>
-          <w:tcPr>
-            <w:tcW w:w="2145" w:type="dxa"/>
-            <w:tcBorders>
-              <w:top w:val="single" w:sz="4" w:space="0" w:color="auto"/>
-              <w:left w:val="single" w:sz="4" w:space="0" w:color="auto"/>
-              <w:bottom w:val="single" w:sz="4" w:space="0" w:color="auto"/>
-              <w:right w:val="single" w:sz="4" w:space="0" w:color="auto"/>
-            </w:tcBorders>
-          </w:tcPr>
-          <w:p>
-            <w:pPr>
-              <w:rPr>
-                <w:b/>
-                <w:bCs/>
-              </w:rPr>
-            </w:pPr>
-          </w:p>
-        </w:tc>
-        <w:tc>
-          <w:tcPr>
-            <w:tcW w:w="2145" w:type="dxa"/>
-            <w:tcBorders>
-              <w:top w:val="single" w:sz="4" w:space="0" w:color="auto"/>
-              <w:left w:val="single" w:sz="4" w:space="0" w:color="auto"/>
-              <w:bottom w:val="single" w:sz="4" w:space="0" w:color="auto"/>
-              <w:right w:val="single" w:sz="4" w:space="0" w:color="auto"/>
-            </w:tcBorders>
-          </w:tcPr>
-          <w:p>
-            <w:pPr>
-              <w:rPr>
-                <w:b/>
-                <w:bCs/>
-              </w:rPr>
-            </w:pPr>
-          </w:p>
-        </w:tc>
-        <w:tc>
-          <w:tcPr>
-            <w:tcW w:w="2145" w:type="dxa"/>
-            <w:tcBorders>
-              <w:top w:val="single" w:sz="4" w:space="0" w:color="auto"/>
-              <w:left w:val="single" w:sz="4" w:space="0" w:color="auto"/>
-              <w:bottom w:val="single" w:sz="4" w:space="0" w:color="auto"/>
-              <w:right w:val="single" w:sz="4" w:space="0" w:color="auto"/>
-            </w:tcBorders>
-          </w:tcPr>
-          <w:p>
-            <w:pPr>
-              <w:rPr>
-                <w:b/>
-                <w:bCs/>
-              </w:rPr>
-            </w:pPr>
-          </w:p>
-        </w:tc>
-        <w:tc>
-          <w:tcPr>
-            <w:tcW w:w="2145" w:type="dxa"/>
-            <w:tcBorders>
-              <w:top w:val="single" w:sz="4" w:space="0" w:color="auto"/>
-              <w:left w:val="single" w:sz="4" w:space="0" w:color="auto"/>
-              <w:bottom w:val="single" w:sz="4" w:space="0" w:color="auto"/>
-              <w:right w:val="single" w:sz="4" w:space="0" w:color="auto"/>
-            </w:tcBorders>
-          </w:tcPr>
-          <w:p>
-            <w:pPr>
-              <w:rPr>
-                <w:b/>
-                <w:bCs/>
-              </w:rPr>
-            </w:pPr>
-          </w:p>
-        </w:tc>
-      </w:tr>
-      <w:tr>
-        <w:trPr>
-          <w:trHeight w:val="360"/>
-        </w:trPr>
-        <w:tc>
-          <w:tcPr>
-            <w:tcW w:w="2145" w:type="dxa"/>
-            <w:tcBorders>
-              <w:top w:val="single" w:sz="4" w:space="0" w:color="auto"/>
-              <w:left w:val="single" w:sz="4" w:space="0" w:color="auto"/>
-              <w:bottom w:val="single" w:sz="4" w:space="0" w:color="auto"/>
-              <w:right w:val="single" w:sz="4" w:space="0" w:color="auto"/>
-            </w:tcBorders>
-          </w:tcPr>
-          <w:p>
-            <w:pPr>
-              <w:rPr>
-                <w:b/>
-                <w:bCs/>
-              </w:rPr>
-            </w:pPr>
-          </w:p>
-        </w:tc>
-        <w:tc>
-          <w:tcPr>
-            <w:tcW w:w="2145" w:type="dxa"/>
-            <w:tcBorders>
-              <w:top w:val="single" w:sz="4" w:space="0" w:color="auto"/>
-              <w:left w:val="single" w:sz="4" w:space="0" w:color="auto"/>
-              <w:bottom w:val="single" w:sz="4" w:space="0" w:color="auto"/>
-              <w:right w:val="single" w:sz="4" w:space="0" w:color="auto"/>
-            </w:tcBorders>
-          </w:tcPr>
-          <w:p>
-            <w:pPr>
-              <w:rPr>
-                <w:b/>
-                <w:bCs/>
-              </w:rPr>
-            </w:pPr>
-          </w:p>
-        </w:tc>
-        <w:tc>
-          <w:tcPr>
-            <w:tcW w:w="2145" w:type="dxa"/>
-            <w:tcBorders>
-              <w:top w:val="single" w:sz="4" w:space="0" w:color="auto"/>
-              <w:left w:val="single" w:sz="4" w:space="0" w:color="auto"/>
-              <w:bottom w:val="single" w:sz="4" w:space="0" w:color="auto"/>
-              <w:right w:val="single" w:sz="4" w:space="0" w:color="auto"/>
-            </w:tcBorders>
-          </w:tcPr>
-          <w:p>
-            <w:pPr>
-              <w:rPr>
-                <w:b/>
-                <w:bCs/>
-              </w:rPr>
-            </w:pPr>
-          </w:p>
-        </w:tc>
-        <w:tc>
-          <w:tcPr>
-            <w:tcW w:w="2145" w:type="dxa"/>
-            <w:tcBorders>
-              <w:top w:val="single" w:sz="4" w:space="0" w:color="auto"/>
-              <w:left w:val="single" w:sz="4" w:space="0" w:color="auto"/>
-              <w:bottom w:val="single" w:sz="4" w:space="0" w:color="auto"/>
-              <w:right w:val="single" w:sz="4" w:space="0" w:color="auto"/>
-            </w:tcBorders>
-          </w:tcPr>
-          <w:p>
-            <w:pPr>
-              <w:rPr>
-                <w:b/>
-                <w:bCs/>
-              </w:rPr>
-            </w:pPr>
-          </w:p>
-        </w:tc>
-      </w:tr>
-      <w:tr>
-        <w:trPr>
-          <w:trHeight w:val="360"/>
-        </w:trPr>
-        <w:tc>
-          <w:tcPr>
-            <w:tcW w:w="2145" w:type="dxa"/>
-            <w:tcBorders>
-              <w:top w:val="single" w:sz="4" w:space="0" w:color="auto"/>
-              <w:left w:val="single" w:sz="4" w:space="0" w:color="auto"/>
-              <w:bottom w:val="single" w:sz="4" w:space="0" w:color="auto"/>
-              <w:right w:val="single" w:sz="4" w:space="0" w:color="auto"/>
-            </w:tcBorders>
-          </w:tcPr>
-          <w:p>
-            <w:pPr>
-              <w:rPr>
-                <w:b/>
-                <w:bCs/>
-              </w:rPr>
-            </w:pPr>
-          </w:p>
-        </w:tc>
-        <w:tc>
-          <w:tcPr>
-            <w:tcW w:w="2145" w:type="dxa"/>
-            <w:tcBorders>
-              <w:top w:val="single" w:sz="4" w:space="0" w:color="auto"/>
-              <w:left w:val="single" w:sz="4" w:space="0" w:color="auto"/>
-              <w:bottom w:val="single" w:sz="4" w:space="0" w:color="auto"/>
-              <w:right w:val="single" w:sz="4" w:space="0" w:color="auto"/>
-            </w:tcBorders>
-          </w:tcPr>
-          <w:p>
-            <w:pPr>
-              <w:rPr>
-                <w:b/>
-                <w:bCs/>
-              </w:rPr>
-            </w:pPr>
-          </w:p>
-        </w:tc>
-        <w:tc>
-          <w:tcPr>
-            <w:tcW w:w="2145" w:type="dxa"/>
-            <w:tcBorders>
-              <w:top w:val="single" w:sz="4" w:space="0" w:color="auto"/>
-              <w:left w:val="single" w:sz="4" w:space="0" w:color="auto"/>
-              <w:bottom w:val="single" w:sz="4" w:space="0" w:color="auto"/>
-              <w:right w:val="single" w:sz="4" w:space="0" w:color="auto"/>
-            </w:tcBorders>
-          </w:tcPr>
-          <w:p>
-            <w:pPr>
-              <w:rPr>
-                <w:b/>
-                <w:bCs/>
-              </w:rPr>
-            </w:pPr>
-          </w:p>
-        </w:tc>
-        <w:tc>
-          <w:tcPr>
-            <w:tcW w:w="2145" w:type="dxa"/>
+            <w:r>
+              <w:rPr>
+                <w:b/>
+                <w:bCs/>
+              </w:rPr>
+              <w:t xml:space="preserve"> and Staff details </w:t>
+            </w:r>
+          </w:p>
+        </w:tc>
+        <w:tc>
+          <w:tcPr>
+            <w:tcW w:w="2133" w:type="dxa"/>
+            <w:tcBorders>
+              <w:top w:val="single" w:sz="4" w:space="0" w:color="auto"/>
+              <w:left w:val="single" w:sz="4" w:space="0" w:color="auto"/>
+              <w:bottom w:val="single" w:sz="4" w:space="0" w:color="auto"/>
+              <w:right w:val="single" w:sz="4" w:space="0" w:color="auto"/>
+            </w:tcBorders>
+          </w:tcPr>
+          <w:p>
+            <w:pPr>
+              <w:rPr>
+                <w:b/>
+                <w:bCs/>
+              </w:rPr>
+            </w:pPr>
+            <w:r>
+              <w:rPr>
+                <w:b/>
+                <w:bCs/>
+              </w:rPr>
+              <w:t xml:space="preserve">As Jon, I want to be able to view </w:t>
+            </w:r>
+            <w:r>
+              <w:rPr>
+                <w:b/>
+                <w:bCs/>
+              </w:rPr>
+              <w:lastRenderedPageBreak/>
+              <w:t xml:space="preserve">information about the staff so that I can speak to staff members who have more experience in specific situations. </w:t>
+            </w:r>
+          </w:p>
+          <w:p>
+            <w:pPr>
+              <w:rPr>
+                <w:b/>
+                <w:bCs/>
+              </w:rPr>
+            </w:pPr>
+            <w:r>
+              <w:rPr>
+                <w:b/>
+                <w:bCs/>
+              </w:rPr>
+              <w:t xml:space="preserve">As Rebecca, I would like to be able to view the booking policies online so that I can make sure that all customers are following the correct policies when booking with </w:t>
+            </w:r>
+            <w:proofErr w:type="spellStart"/>
+            <w:r>
+              <w:rPr>
+                <w:b/>
+                <w:bCs/>
+              </w:rPr>
+              <w:t>CityPoint</w:t>
+            </w:r>
+            <w:proofErr w:type="spellEnd"/>
+            <w:r>
+              <w:rPr>
+                <w:b/>
+                <w:bCs/>
+              </w:rPr>
+              <w:t xml:space="preserve"> Room Hire</w:t>
+            </w:r>
+          </w:p>
+        </w:tc>
+        <w:tc>
+          <w:tcPr>
+            <w:tcW w:w="2768" w:type="dxa"/>
+            <w:tcBorders>
+              <w:top w:val="single" w:sz="4" w:space="0" w:color="auto"/>
+              <w:left w:val="single" w:sz="4" w:space="0" w:color="auto"/>
+              <w:bottom w:val="single" w:sz="4" w:space="0" w:color="auto"/>
+              <w:right w:val="single" w:sz="4" w:space="0" w:color="auto"/>
+            </w:tcBorders>
+          </w:tcPr>
+          <w:p>
+            <w:pPr>
+              <w:pStyle w:val="ListParagraph"/>
+              <w:numPr>
+                <w:ilvl w:val="0"/>
+                <w:numId w:val="2"/>
+              </w:numPr>
+              <w:rPr>
+                <w:b/>
+                <w:bCs/>
+              </w:rPr>
+            </w:pPr>
+            <w:r>
+              <w:rPr>
+                <w:b/>
+                <w:bCs/>
+              </w:rPr>
+              <w:lastRenderedPageBreak/>
+              <w:t xml:space="preserve">The solution should provide </w:t>
+            </w:r>
+            <w:r>
+              <w:rPr>
+                <w:b/>
+                <w:bCs/>
+              </w:rPr>
+              <w:lastRenderedPageBreak/>
+              <w:t xml:space="preserve">the user with an appropriate UI/UX to fit the user requirements </w:t>
+            </w:r>
+          </w:p>
+          <w:p>
+            <w:pPr>
+              <w:pStyle w:val="ListParagraph"/>
+              <w:numPr>
+                <w:ilvl w:val="0"/>
+                <w:numId w:val="2"/>
+              </w:numPr>
+              <w:rPr>
+                <w:b/>
+                <w:bCs/>
+              </w:rPr>
+            </w:pPr>
+            <w:r>
+              <w:rPr>
+                <w:b/>
+                <w:bCs/>
+              </w:rPr>
+              <w:t>Allow for quick access to policies – a button or link</w:t>
+            </w:r>
+          </w:p>
+          <w:p>
+            <w:pPr>
+              <w:pStyle w:val="ListParagraph"/>
+              <w:numPr>
+                <w:ilvl w:val="0"/>
+                <w:numId w:val="2"/>
+              </w:numPr>
+              <w:rPr>
+                <w:b/>
+                <w:bCs/>
+              </w:rPr>
+            </w:pPr>
+            <w:r>
+              <w:rPr>
+                <w:b/>
+                <w:bCs/>
+              </w:rPr>
+              <w:t>Display policies in a clear, readable format</w:t>
+            </w:r>
+          </w:p>
+          <w:p>
+            <w:pPr>
+              <w:pStyle w:val="ListParagraph"/>
+              <w:numPr>
+                <w:ilvl w:val="0"/>
+                <w:numId w:val="2"/>
+              </w:numPr>
+              <w:rPr>
+                <w:b/>
+                <w:bCs/>
+              </w:rPr>
+            </w:pPr>
+            <w:r>
+              <w:rPr>
+                <w:b/>
+                <w:bCs/>
+              </w:rPr>
+              <w:t>Allow users to select staff profiles to view further information about staff</w:t>
+            </w:r>
+          </w:p>
+          <w:p>
+            <w:pPr>
+              <w:rPr>
+                <w:b/>
+                <w:bCs/>
+              </w:rPr>
+            </w:pPr>
+          </w:p>
+        </w:tc>
+        <w:tc>
+          <w:tcPr>
+            <w:tcW w:w="1893" w:type="dxa"/>
             <w:tcBorders>
               <w:top w:val="single" w:sz="4" w:space="0" w:color="auto"/>
               <w:left w:val="single" w:sz="4" w:space="0" w:color="auto"/>
@@ -2976,7 +4134,7 @@
       <w:pPr>
         <w:pStyle w:val="Heading1"/>
       </w:pPr>
-      <w:bookmarkStart w:id="11" w:name="_Toc220327354"/>
+      <w:bookmarkStart w:id="11" w:name="_Toc220335989"/>
       <w:r>
         <w:t>Non-functional requirements</w:t>
       </w:r>
@@ -3111,6 +4269,9 @@
             <w:pPr>
               <w:spacing w:after="160" w:line="278" w:lineRule="auto"/>
             </w:pPr>
+            <w:r>
+              <w:t>The solution should have a consistent and efficient load time</w:t>
+            </w:r>
           </w:p>
         </w:tc>
         <w:tc>
@@ -3125,8 +4286,33 @@
           </w:tcPr>
           <w:p>
             <w:pPr>
-              <w:spacing w:after="160" w:line="278" w:lineRule="auto"/>
-            </w:pPr>
+              <w:pStyle w:val="ListParagraph"/>
+              <w:numPr>
+                <w:ilvl w:val="0"/>
+                <w:numId w:val="2"/>
+              </w:numPr>
+            </w:pPr>
+            <w:r>
+              <w:t xml:space="preserve">Users </w:t>
+            </w:r>
+            <w:r>
+              <w:t xml:space="preserve">may have low </w:t>
+            </w:r>
+            <w:r>
+              <w:t>patience and would not want to wait a long time for pages to load</w:t>
+            </w:r>
+          </w:p>
+          <w:p>
+            <w:pPr>
+              <w:pStyle w:val="ListParagraph"/>
+              <w:numPr>
+                <w:ilvl w:val="0"/>
+                <w:numId w:val="2"/>
+              </w:numPr>
+            </w:pPr>
+            <w:r>
+              <w:t>Industry standard</w:t>
+            </w:r>
           </w:p>
         </w:tc>
         <w:tc>
@@ -3141,8 +4327,30 @@
           </w:tcPr>
           <w:p>
             <w:pPr>
-              <w:spacing w:after="160" w:line="278" w:lineRule="auto"/>
-            </w:pPr>
+              <w:pStyle w:val="ListParagraph"/>
+              <w:numPr>
+                <w:ilvl w:val="0"/>
+                <w:numId w:val="3"/>
+              </w:numPr>
+            </w:pPr>
+            <w:r>
+              <w:t>All pages should load within 15ms</w:t>
+            </w:r>
+            <w:r>
+              <w:t>.</w:t>
+            </w:r>
+          </w:p>
+          <w:p>
+            <w:pPr>
+              <w:pStyle w:val="ListParagraph"/>
+              <w:numPr>
+                <w:ilvl w:val="0"/>
+                <w:numId w:val="3"/>
+              </w:numPr>
+            </w:pPr>
+            <w:r>
+              <w:t>Over a large span of time, the load speed doesn’t drop below the 15ms target.</w:t>
+            </w:r>
           </w:p>
         </w:tc>
       </w:tr>
@@ -3264,6 +4472,9 @@
             <w:pPr>
               <w:spacing w:after="160" w:line="278" w:lineRule="auto"/>
             </w:pPr>
+            <w:r>
+              <w:t xml:space="preserve">User data should be encrypted before it is stored </w:t>
+            </w:r>
           </w:p>
         </w:tc>
         <w:tc>
@@ -3278,8 +4489,19 @@
           </w:tcPr>
           <w:p>
             <w:pPr>
-              <w:spacing w:after="160" w:line="278" w:lineRule="auto"/>
-            </w:pPr>
+              <w:pStyle w:val="ListParagraph"/>
+              <w:numPr>
+                <w:ilvl w:val="0"/>
+                <w:numId w:val="2"/>
+              </w:numPr>
+            </w:pPr>
+            <w:r>
+              <w:t xml:space="preserve">Users may have private information saved onto their </w:t>
+            </w:r>
+            <w:r>
+              <w:lastRenderedPageBreak/>
+              <w:t>account such as their payment information</w:t>
+            </w:r>
           </w:p>
         </w:tc>
         <w:tc>
@@ -3294,7 +4516,67 @@
           </w:tcPr>
           <w:p>
             <w:pPr>
-              <w:spacing w:after="160" w:line="278" w:lineRule="auto"/>
+              <w:pStyle w:val="ListParagraph"/>
+              <w:numPr>
+                <w:ilvl w:val="0"/>
+                <w:numId w:val="4"/>
+              </w:numPr>
+            </w:pPr>
+            <w:r>
+              <w:lastRenderedPageBreak/>
+              <w:t>There are no reports of privacy breaches</w:t>
+            </w:r>
+            <w:r>
+              <w:t xml:space="preserve"> </w:t>
+            </w:r>
+          </w:p>
+        </w:tc>
+      </w:tr>
+      <w:tr>
+        <w:trPr>
+          <w:trHeight w:val="8"/>
+        </w:trPr>
+        <w:tc>
+          <w:tcPr>
+            <w:tcW w:w="2744" w:type="dxa"/>
+            <w:tcBorders>
+              <w:top w:val="single" w:sz="4" w:space="0" w:color="auto"/>
+              <w:left w:val="single" w:sz="4" w:space="0" w:color="auto"/>
+              <w:bottom w:val="single" w:sz="4" w:space="0" w:color="auto"/>
+              <w:right w:val="single" w:sz="4" w:space="0" w:color="auto"/>
+            </w:tcBorders>
+          </w:tcPr>
+          <w:p/>
+        </w:tc>
+        <w:tc>
+          <w:tcPr>
+            <w:tcW w:w="2744" w:type="dxa"/>
+            <w:tcBorders>
+              <w:top w:val="single" w:sz="4" w:space="0" w:color="auto"/>
+              <w:left w:val="single" w:sz="4" w:space="0" w:color="auto"/>
+              <w:bottom w:val="single" w:sz="4" w:space="0" w:color="auto"/>
+              <w:right w:val="single" w:sz="4" w:space="0" w:color="auto"/>
+            </w:tcBorders>
+          </w:tcPr>
+          <w:p>
+            <w:pPr>
+              <w:pStyle w:val="ListParagraph"/>
+            </w:pPr>
+          </w:p>
+        </w:tc>
+        <w:tc>
+          <w:tcPr>
+            <w:tcW w:w="2748" w:type="dxa"/>
+            <w:tcBorders>
+              <w:top w:val="single" w:sz="4" w:space="0" w:color="auto"/>
+              <w:left w:val="single" w:sz="4" w:space="0" w:color="auto"/>
+              <w:bottom w:val="single" w:sz="4" w:space="0" w:color="auto"/>
+              <w:right w:val="single" w:sz="4" w:space="0" w:color="auto"/>
+            </w:tcBorders>
+          </w:tcPr>
+          <w:p>
+            <w:pPr>
+              <w:pStyle w:val="ListParagraph"/>
             </w:pPr>
           </w:p>
         </w:tc>
@@ -3447,7 +4729,11 @@
           </w:tcPr>
           <w:p>
             <w:pPr>
-              <w:spacing w:after="160" w:line="278" w:lineRule="auto"/>
+              <w:pStyle w:val="ListParagraph"/>
+              <w:numPr>
+                <w:ilvl w:val="0"/>
+                <w:numId w:val="10"/>
+              </w:numPr>
             </w:pPr>
           </w:p>
         </w:tc>
@@ -3600,7 +4886,11 @@
           </w:tcPr>
           <w:p>
             <w:pPr>
-              <w:spacing w:after="160" w:line="278" w:lineRule="auto"/>
+              <w:pStyle w:val="ListParagraph"/>
+              <w:numPr>
+                <w:ilvl w:val="0"/>
+                <w:numId w:val="9"/>
+              </w:numPr>
             </w:pPr>
           </w:p>
         </w:tc>
@@ -3723,6 +5013,9 @@
             <w:pPr>
               <w:spacing w:after="160" w:line="278" w:lineRule="auto"/>
             </w:pPr>
+            <w:r>
+              <w:t xml:space="preserve">The pages should consistently load within 15ms. </w:t>
+            </w:r>
           </w:p>
         </w:tc>
         <w:tc>
@@ -3737,8 +5030,15 @@
           </w:tcPr>
           <w:p>
             <w:pPr>
-              <w:spacing w:after="160" w:line="278" w:lineRule="auto"/>
-            </w:pPr>
+              <w:pStyle w:val="ListParagraph"/>
+              <w:numPr>
+                <w:ilvl w:val="0"/>
+                <w:numId w:val="2"/>
+              </w:numPr>
+            </w:pPr>
+            <w:r>
+              <w:t>The page should be able to consistently load at high speeds</w:t>
+            </w:r>
           </w:p>
         </w:tc>
         <w:tc>
@@ -3753,7 +5053,72 @@
           </w:tcPr>
           <w:p>
             <w:pPr>
-              <w:spacing w:after="160" w:line="278" w:lineRule="auto"/>
+              <w:pStyle w:val="ListParagraph"/>
+              <w:numPr>
+                <w:ilvl w:val="0"/>
+                <w:numId w:val="7"/>
+              </w:numPr>
+            </w:pPr>
+          </w:p>
+        </w:tc>
+      </w:tr>
+      <w:tr>
+        <w:trPr>
+          <w:trHeight w:val="8"/>
+        </w:trPr>
+        <w:tc>
+          <w:tcPr>
+            <w:tcW w:w="2744" w:type="dxa"/>
+            <w:tcBorders>
+              <w:top w:val="single" w:sz="4" w:space="0" w:color="auto"/>
+              <w:left w:val="single" w:sz="4" w:space="0" w:color="auto"/>
+              <w:bottom w:val="single" w:sz="4" w:space="0" w:color="auto"/>
+              <w:right w:val="single" w:sz="4" w:space="0" w:color="auto"/>
+            </w:tcBorders>
+          </w:tcPr>
+          <w:p>
+            <w:r>
+              <w:t>The pages should not crash</w:t>
+            </w:r>
+          </w:p>
+        </w:tc>
+        <w:tc>
+          <w:tcPr>
+            <w:tcW w:w="2744" w:type="dxa"/>
+            <w:tcBorders>
+              <w:top w:val="single" w:sz="4" w:space="0" w:color="auto"/>
+              <w:left w:val="single" w:sz="4" w:space="0" w:color="auto"/>
+              <w:bottom w:val="single" w:sz="4" w:space="0" w:color="auto"/>
+              <w:right w:val="single" w:sz="4" w:space="0" w:color="auto"/>
+            </w:tcBorders>
+          </w:tcPr>
+          <w:p>
+            <w:pPr>
+              <w:pStyle w:val="ListParagraph"/>
+              <w:numPr>
+                <w:ilvl w:val="0"/>
+                <w:numId w:val="2"/>
+              </w:numPr>
+            </w:pPr>
+          </w:p>
+        </w:tc>
+        <w:tc>
+          <w:tcPr>
+            <w:tcW w:w="2748" w:type="dxa"/>
+            <w:tcBorders>
+              <w:top w:val="single" w:sz="4" w:space="0" w:color="auto"/>
+              <w:left w:val="single" w:sz="4" w:space="0" w:color="auto"/>
+              <w:bottom w:val="single" w:sz="4" w:space="0" w:color="auto"/>
+              <w:right w:val="single" w:sz="4" w:space="0" w:color="auto"/>
+            </w:tcBorders>
+          </w:tcPr>
+          <w:p>
+            <w:pPr>
+              <w:pStyle w:val="ListParagraph"/>
+              <w:numPr>
+                <w:ilvl w:val="0"/>
+                <w:numId w:val="8"/>
+              </w:numPr>
             </w:pPr>
           </w:p>
         </w:tc>
@@ -3876,6 +5241,9 @@
             <w:pPr>
               <w:spacing w:after="160" w:line="278" w:lineRule="auto"/>
             </w:pPr>
+            <w:r>
+              <w:t>The solution should be easy to navigate</w:t>
+            </w:r>
           </w:p>
         </w:tc>
         <w:tc>
@@ -3906,7 +5274,64 @@
           </w:tcPr>
           <w:p>
             <w:pPr>
-              <w:spacing w:after="160" w:line="278" w:lineRule="auto"/>
+              <w:pStyle w:val="ListParagraph"/>
+              <w:numPr>
+                <w:ilvl w:val="0"/>
+                <w:numId w:val="12"/>
+              </w:numPr>
+            </w:pPr>
+          </w:p>
+        </w:tc>
+      </w:tr>
+      <w:tr>
+        <w:trPr>
+          <w:trHeight w:val="8"/>
+        </w:trPr>
+        <w:tc>
+          <w:tcPr>
+            <w:tcW w:w="2744" w:type="dxa"/>
+            <w:tcBorders>
+              <w:top w:val="single" w:sz="4" w:space="0" w:color="auto"/>
+              <w:left w:val="single" w:sz="4" w:space="0" w:color="auto"/>
+              <w:bottom w:val="single" w:sz="4" w:space="0" w:color="auto"/>
+              <w:right w:val="single" w:sz="4" w:space="0" w:color="auto"/>
+            </w:tcBorders>
+          </w:tcPr>
+          <w:p>
+            <w:r>
+              <w:t>The solution should have information displayed in a clear, readable format</w:t>
+            </w:r>
+          </w:p>
+        </w:tc>
+        <w:tc>
+          <w:tcPr>
+            <w:tcW w:w="2744" w:type="dxa"/>
+            <w:tcBorders>
+              <w:top w:val="single" w:sz="4" w:space="0" w:color="auto"/>
+              <w:left w:val="single" w:sz="4" w:space="0" w:color="auto"/>
+              <w:bottom w:val="single" w:sz="4" w:space="0" w:color="auto"/>
+              <w:right w:val="single" w:sz="4" w:space="0" w:color="auto"/>
+            </w:tcBorders>
+          </w:tcPr>
+          <w:p/>
+        </w:tc>
+        <w:tc>
+          <w:tcPr>
+            <w:tcW w:w="2748" w:type="dxa"/>
+            <w:tcBorders>
+              <w:top w:val="single" w:sz="4" w:space="0" w:color="auto"/>
+              <w:left w:val="single" w:sz="4" w:space="0" w:color="auto"/>
+              <w:bottom w:val="single" w:sz="4" w:space="0" w:color="auto"/>
+              <w:right w:val="single" w:sz="4" w:space="0" w:color="auto"/>
+            </w:tcBorders>
+          </w:tcPr>
+          <w:p>
+            <w:pPr>
+              <w:pStyle w:val="ListParagraph"/>
+              <w:numPr>
+                <w:ilvl w:val="0"/>
+                <w:numId w:val="13"/>
+              </w:numPr>
             </w:pPr>
           </w:p>
         </w:tc>
@@ -4029,6 +5454,10 @@
             <w:pPr>
               <w:spacing w:after="160" w:line="278" w:lineRule="auto"/>
             </w:pPr>
+            <w:r>
+              <w:lastRenderedPageBreak/>
+              <w:t>The user should be able to switch the languages used on the solution</w:t>
+            </w:r>
           </w:p>
         </w:tc>
         <w:tc>
@@ -4043,8 +5472,15 @@
           </w:tcPr>
           <w:p>
             <w:pPr>
-              <w:spacing w:after="160" w:line="278" w:lineRule="auto"/>
-            </w:pPr>
+              <w:pStyle w:val="ListParagraph"/>
+              <w:numPr>
+                <w:ilvl w:val="0"/>
+                <w:numId w:val="2"/>
+              </w:numPr>
+            </w:pPr>
+            <w:r>
+              <w:t>The system should be accessible to people who do not speak the default language of the web application</w:t>
+            </w:r>
           </w:p>
         </w:tc>
         <w:tc>
@@ -4059,8 +5495,27 @@
           </w:tcPr>
           <w:p>
             <w:pPr>
-              <w:spacing w:after="160" w:line="278" w:lineRule="auto"/>
-            </w:pPr>
+              <w:pStyle w:val="ListParagraph"/>
+              <w:numPr>
+                <w:ilvl w:val="0"/>
+                <w:numId w:val="5"/>
+              </w:numPr>
+            </w:pPr>
+            <w:r>
+              <w:t>The webpage should have an option to select a language</w:t>
+            </w:r>
+          </w:p>
+          <w:p>
+            <w:pPr>
+              <w:pStyle w:val="ListParagraph"/>
+              <w:numPr>
+                <w:ilvl w:val="0"/>
+                <w:numId w:val="5"/>
+              </w:numPr>
+            </w:pPr>
+            <w:r>
+              <w:t>The webpage should offer a large range of languages</w:t>
+            </w:r>
           </w:p>
         </w:tc>
       </w:tr>
@@ -4082,6 +5537,9 @@
             <w:pPr>
               <w:spacing w:after="160" w:line="278" w:lineRule="auto"/>
             </w:pPr>
+            <w:r>
+              <w:t xml:space="preserve">The solution should have text-to-speech options for those who are visually impaired. </w:t>
+            </w:r>
           </w:p>
         </w:tc>
         <w:tc>
@@ -4096,8 +5554,15 @@
           </w:tcPr>
           <w:p>
             <w:pPr>
-              <w:spacing w:after="160" w:line="278" w:lineRule="auto"/>
-            </w:pPr>
+              <w:pStyle w:val="ListParagraph"/>
+              <w:numPr>
+                <w:ilvl w:val="0"/>
+                <w:numId w:val="2"/>
+              </w:numPr>
+            </w:pPr>
+            <w:r>
+              <w:t>The system should be accessible for those who have difficulties with reading</w:t>
+            </w:r>
           </w:p>
         </w:tc>
         <w:tc>
@@ -4112,8 +5577,25 @@
           </w:tcPr>
           <w:p>
             <w:pPr>
-              <w:spacing w:after="160" w:line="278" w:lineRule="auto"/>
-            </w:pPr>
+              <w:pStyle w:val="ListParagraph"/>
+              <w:numPr>
+                <w:ilvl w:val="0"/>
+                <w:numId w:val="6"/>
+              </w:numPr>
+            </w:pPr>
+            <w:r>
+              <w:t xml:space="preserve">The solution should offer a </w:t>
+            </w:r>
+            <w:r>
+              <w:rPr>
+                <w:i/>
+                <w:iCs/>
+              </w:rPr>
+              <w:t>clear</w:t>
+            </w:r>
+            <w:r>
+              <w:t xml:space="preserve"> text-to-speech option on the page</w:t>
+            </w:r>
           </w:p>
         </w:tc>
       </w:tr>
@@ -4123,33 +5605,44 @@
       <w:pPr>
         <w:pStyle w:val="Heading1"/>
       </w:pPr>
+      <w:bookmarkStart w:id="12" w:name="_Toc220335990"/>
       <w:r>
-        <w:t xml:space="preserve">Hierarchy Diagram </w:t>
+        <w:t>Hierarchy Diagram</w:t>
+      </w:r>
+      <w:bookmarkEnd w:id="12"/>
+      <w:r>
+        <w:t xml:space="preserve"> </w:t>
       </w:r>
     </w:p>
     <w:p>
       <w:pPr>
         <w:pStyle w:val="Heading1"/>
       </w:pPr>
+      <w:bookmarkStart w:id="13" w:name="_Toc220335991"/>
       <w:r>
         <w:t>Risk management plan</w:t>
       </w:r>
+      <w:bookmarkEnd w:id="13"/>
     </w:p>
     <w:p>
       <w:pPr>
         <w:pStyle w:val="Heading1"/>
       </w:pPr>
+      <w:bookmarkStart w:id="14" w:name="_Toc220335992"/>
       <w:r>
         <w:t>UI Considerations</w:t>
       </w:r>
+      <w:bookmarkEnd w:id="14"/>
     </w:p>
     <w:p>
       <w:pPr>
         <w:pStyle w:val="Heading1"/>
       </w:pPr>
+      <w:bookmarkStart w:id="15" w:name="_Toc220335993"/>
       <w:r>
         <w:t>Legal</w:t>
       </w:r>
+      <w:bookmarkEnd w:id="15"/>
     </w:p>
     <w:sectPr>
       <w:pgSz w:w="11906" w:h="16838"/>
@@ -4278,6 +5771,273 @@
     </w:lvl>
   </w:abstractNum>
   <w:abstractNum w:abstractNumId="1" w15:restartNumberingAfterBreak="0">
+    <w:nsid w:val="25C35E33"/>
+    <w:multiLevelType w:val="hybridMultilevel"/>
+    <w:tmpl w:val="A7AAADE4"/>
+    <w:lvl w:ilvl="0" w:tplc="0809000F">
+      <w:start w:val="1"/>
+      <w:numFmt w:val="decimal"/>
+      <w:lvlText w:val="%1."/>
+      <w:lvlJc w:val="left"/>
+      <w:pPr>
+        <w:ind w:left="720" w:hanging="360"/>
+      </w:pPr>
+      <w:rPr>
+        <w:rFonts w:hint="default"/>
+      </w:rPr>
+    </w:lvl>
+    <w:lvl w:ilvl="1" w:tplc="08090019" w:tentative="1">
+      <w:start w:val="1"/>
+      <w:numFmt w:val="lowerLetter"/>
+      <w:lvlText w:val="%2."/>
+      <w:lvlJc w:val="left"/>
+      <w:pPr>
+        <w:ind w:left="1440" w:hanging="360"/>
+      </w:pPr>
+    </w:lvl>
+    <w:lvl w:ilvl="2" w:tplc="0809001B" w:tentative="1">
+      <w:start w:val="1"/>
+      <w:numFmt w:val="lowerRoman"/>
+      <w:lvlText w:val="%3."/>
+      <w:lvlJc w:val="right"/>
+      <w:pPr>
+        <w:ind w:left="2160" w:hanging="180"/>
+      </w:pPr>
+    </w:lvl>
+    <w:lvl w:ilvl="3" w:tplc="0809000F" w:tentative="1">
+      <w:start w:val="1"/>
+      <w:numFmt w:val="decimal"/>
+      <w:lvlText w:val="%4."/>
+      <w:lvlJc w:val="left"/>
+      <w:pPr>
+        <w:ind w:left="2880" w:hanging="360"/>
+      </w:pPr>
+    </w:lvl>
+    <w:lvl w:ilvl="4" w:tplc="08090019" w:tentative="1">
+      <w:start w:val="1"/>
+      <w:numFmt w:val="lowerLetter"/>
+      <w:lvlText w:val="%5."/>
+      <w:lvlJc w:val="left"/>
+      <w:pPr>
+        <w:ind w:left="3600" w:hanging="360"/>
+      </w:pPr>
+    </w:lvl>
+    <w:lvl w:ilvl="5" w:tplc="0809001B" w:tentative="1">
+      <w:start w:val="1"/>
+      <w:numFmt w:val="lowerRoman"/>
+      <w:lvlText w:val="%6."/>
+      <w:lvlJc w:val="right"/>
+      <w:pPr>
+        <w:ind w:left="4320" w:hanging="180"/>
+      </w:pPr>
+    </w:lvl>
+    <w:lvl w:ilvl="6" w:tplc="0809000F" w:tentative="1">
+      <w:start w:val="1"/>
+      <w:numFmt w:val="decimal"/>
+      <w:lvlText w:val="%7."/>
+      <w:lvlJc w:val="left"/>
+      <w:pPr>
+        <w:ind w:left="5040" w:hanging="360"/>
+      </w:pPr>
+    </w:lvl>
+    <w:lvl w:ilvl="7" w:tplc="08090019" w:tentative="1">
+      <w:start w:val="1"/>
+      <w:numFmt w:val="lowerLetter"/>
+      <w:lvlText w:val="%8."/>
+      <w:lvlJc w:val="left"/>
+      <w:pPr>
+        <w:ind w:left="5760" w:hanging="360"/>
+      </w:pPr>
+    </w:lvl>
+    <w:lvl w:ilvl="8" w:tplc="0809001B" w:tentative="1">
+      <w:start w:val="1"/>
+      <w:numFmt w:val="lowerRoman"/>
+      <w:lvlText w:val="%9."/>
+      <w:lvlJc w:val="right"/>
+      <w:pPr>
+        <w:ind w:left="6480" w:hanging="180"/>
+      </w:pPr>
+    </w:lvl>
+  </w:abstractNum>
+  <w:abstractNum w:abstractNumId="2" w15:restartNumberingAfterBreak="0">
+    <w:nsid w:val="2AA37793"/>
+    <w:multiLevelType w:val="hybridMultilevel"/>
+    <w:tmpl w:val="A1E67B76"/>
+    <w:lvl w:ilvl="0" w:tplc="0809000F">
+      <w:start w:val="1"/>
+      <w:numFmt w:val="decimal"/>
+      <w:lvlText w:val="%1."/>
+      <w:lvlJc w:val="left"/>
+      <w:pPr>
+        <w:ind w:left="720" w:hanging="360"/>
+      </w:pPr>
+      <w:rPr>
+        <w:rFonts w:hint="default"/>
+      </w:rPr>
+    </w:lvl>
+    <w:lvl w:ilvl="1" w:tplc="08090019" w:tentative="1">
+      <w:start w:val="1"/>
+      <w:numFmt w:val="lowerLetter"/>
+      <w:lvlText w:val="%2."/>
+      <w:lvlJc w:val="left"/>
+      <w:pPr>
+        <w:ind w:left="1440" w:hanging="360"/>
+      </w:pPr>
+    </w:lvl>
+    <w:lvl w:ilvl="2" w:tplc="0809001B" w:tentative="1">
+      <w:start w:val="1"/>
+      <w:numFmt w:val="lowerRoman"/>
+      <w:lvlText w:val="%3."/>
+      <w:lvlJc w:val="right"/>
+      <w:pPr>
+        <w:ind w:left="2160" w:hanging="180"/>
+      </w:pPr>
+    </w:lvl>
+    <w:lvl w:ilvl="3" w:tplc="0809000F" w:tentative="1">
+      <w:start w:val="1"/>
+      <w:numFmt w:val="decimal"/>
+      <w:lvlText w:val="%4."/>
+      <w:lvlJc w:val="left"/>
+      <w:pPr>
+        <w:ind w:left="2880" w:hanging="360"/>
+      </w:pPr>
+    </w:lvl>
+    <w:lvl w:ilvl="4" w:tplc="08090019" w:tentative="1">
+      <w:start w:val="1"/>
+      <w:numFmt w:val="lowerLetter"/>
+      <w:lvlText w:val="%5."/>
+      <w:lvlJc w:val="left"/>
+      <w:pPr>
+        <w:ind w:left="3600" w:hanging="360"/>
+      </w:pPr>
+    </w:lvl>
+    <w:lvl w:ilvl="5" w:tplc="0809001B" w:tentative="1">
+      <w:start w:val="1"/>
+      <w:numFmt w:val="lowerRoman"/>
+      <w:lvlText w:val="%6."/>
+      <w:lvlJc w:val="right"/>
+      <w:pPr>
+        <w:ind w:left="4320" w:hanging="180"/>
+      </w:pPr>
+    </w:lvl>
+    <w:lvl w:ilvl="6" w:tplc="0809000F" w:tentative="1">
+      <w:start w:val="1"/>
+      <w:numFmt w:val="decimal"/>
+      <w:lvlText w:val="%7."/>
+      <w:lvlJc w:val="left"/>
+      <w:pPr>
+        <w:ind w:left="5040" w:hanging="360"/>
+      </w:pPr>
+    </w:lvl>
+    <w:lvl w:ilvl="7" w:tplc="08090019" w:tentative="1">
+      <w:start w:val="1"/>
+      <w:numFmt w:val="lowerLetter"/>
+      <w:lvlText w:val="%8."/>
+      <w:lvlJc w:val="left"/>
+      <w:pPr>
+        <w:ind w:left="5760" w:hanging="360"/>
+      </w:pPr>
+    </w:lvl>
+    <w:lvl w:ilvl="8" w:tplc="0809001B" w:tentative="1">
+      <w:start w:val="1"/>
+      <w:numFmt w:val="lowerRoman"/>
+      <w:lvlText w:val="%9."/>
+      <w:lvlJc w:val="right"/>
+      <w:pPr>
+        <w:ind w:left="6480" w:hanging="180"/>
+      </w:pPr>
+    </w:lvl>
+  </w:abstractNum>
+  <w:abstractNum w:abstractNumId="3" w15:restartNumberingAfterBreak="0">
+    <w:nsid w:val="2DE60F44"/>
+    <w:multiLevelType w:val="hybridMultilevel"/>
+    <w:tmpl w:val="AB52FD5A"/>
+    <w:lvl w:ilvl="0" w:tplc="0809000F">
+      <w:start w:val="1"/>
+      <w:numFmt w:val="decimal"/>
+      <w:lvlText w:val="%1."/>
+      <w:lvlJc w:val="left"/>
+      <w:pPr>
+        <w:ind w:left="720" w:hanging="360"/>
+      </w:pPr>
+      <w:rPr>
+        <w:rFonts w:hint="default"/>
+      </w:rPr>
+    </w:lvl>
+    <w:lvl w:ilvl="1" w:tplc="08090019" w:tentative="1">
+      <w:start w:val="1"/>
+      <w:numFmt w:val="lowerLetter"/>
+      <w:lvlText w:val="%2."/>
+      <w:lvlJc w:val="left"/>
+      <w:pPr>
+        <w:ind w:left="1440" w:hanging="360"/>
+      </w:pPr>
+    </w:lvl>
+    <w:lvl w:ilvl="2" w:tplc="0809001B" w:tentative="1">
+      <w:start w:val="1"/>
+      <w:numFmt w:val="lowerRoman"/>
+      <w:lvlText w:val="%3."/>
+      <w:lvlJc w:val="right"/>
+      <w:pPr>
+        <w:ind w:left="2160" w:hanging="180"/>
+      </w:pPr>
+    </w:lvl>
+    <w:lvl w:ilvl="3" w:tplc="0809000F" w:tentative="1">
+      <w:start w:val="1"/>
+      <w:numFmt w:val="decimal"/>
+      <w:lvlText w:val="%4."/>
+      <w:lvlJc w:val="left"/>
+      <w:pPr>
+        <w:ind w:left="2880" w:hanging="360"/>
+      </w:pPr>
+    </w:lvl>
+    <w:lvl w:ilvl="4" w:tplc="08090019" w:tentative="1">
+      <w:start w:val="1"/>
+      <w:numFmt w:val="lowerLetter"/>
+      <w:lvlText w:val="%5."/>
+      <w:lvlJc w:val="left"/>
+      <w:pPr>
+        <w:ind w:left="3600" w:hanging="360"/>
+      </w:pPr>
+    </w:lvl>
+    <w:lvl w:ilvl="5" w:tplc="0809001B" w:tentative="1">
+      <w:start w:val="1"/>
+      <w:numFmt w:val="lowerRoman"/>
+      <w:lvlText w:val="%6."/>
+      <w:lvlJc w:val="right"/>
+      <w:pPr>
+        <w:ind w:left="4320" w:hanging="180"/>
+      </w:pPr>
+    </w:lvl>
+    <w:lvl w:ilvl="6" w:tplc="0809000F" w:tentative="1">
+      <w:start w:val="1"/>
+      <w:numFmt w:val="decimal"/>
+      <w:lvlText w:val="%7."/>
+      <w:lvlJc w:val="left"/>
+      <w:pPr>
+        <w:ind w:left="5040" w:hanging="360"/>
+      </w:pPr>
+    </w:lvl>
+    <w:lvl w:ilvl="7" w:tplc="08090019" w:tentative="1">
+      <w:start w:val="1"/>
+      <w:numFmt w:val="lowerLetter"/>
+      <w:lvlText w:val="%8."/>
+      <w:lvlJc w:val="left"/>
+      <w:pPr>
+        <w:ind w:left="5760" w:hanging="360"/>
+      </w:pPr>
+    </w:lvl>
+    <w:lvl w:ilvl="8" w:tplc="0809001B" w:tentative="1">
+      <w:start w:val="1"/>
+      <w:numFmt w:val="lowerRoman"/>
+      <w:lvlText w:val="%9."/>
+      <w:lvlJc w:val="right"/>
+      <w:pPr>
+        <w:ind w:left="6480" w:hanging="180"/>
+      </w:pPr>
+    </w:lvl>
+  </w:abstractNum>
+  <w:abstractNum w:abstractNumId="4" w15:restartNumberingAfterBreak="0">
     <w:nsid w:val="2F8B2599"/>
     <w:multiLevelType w:val="hybridMultilevel"/>
     <w:tmpl w:val="A49C6626"/>
@@ -4292,7 +6052,7 @@
         <w:rFonts w:ascii="Aptos" w:eastAsiaTheme="minorHAnsi" w:hAnsi="Aptos" w:cstheme="minorBidi" w:hint="default"/>
       </w:rPr>
     </w:lvl>
-    <w:lvl w:ilvl="1" w:tplc="08090003" w:tentative="1">
+    <w:lvl w:ilvl="1" w:tplc="08090003">
       <w:start w:val="1"/>
       <w:numFmt w:val="bullet"/>
       <w:lvlText w:val="o"/>
@@ -4387,13 +6147,758 @@
       <w:rPr>
         <w:rFonts w:ascii="Wingdings" w:hAnsi="Wingdings" w:hint="default"/>
       </w:rPr>
+    </w:lvl>
+  </w:abstractNum>
+  <w:abstractNum w:abstractNumId="5" w15:restartNumberingAfterBreak="0">
+    <w:nsid w:val="3D995B35"/>
+    <w:multiLevelType w:val="hybridMultilevel"/>
+    <w:tmpl w:val="5D669ABE"/>
+    <w:lvl w:ilvl="0" w:tplc="0809000F">
+      <w:start w:val="1"/>
+      <w:numFmt w:val="decimal"/>
+      <w:lvlText w:val="%1."/>
+      <w:lvlJc w:val="left"/>
+      <w:pPr>
+        <w:ind w:left="720" w:hanging="360"/>
+      </w:pPr>
+      <w:rPr>
+        <w:rFonts w:hint="default"/>
+      </w:rPr>
+    </w:lvl>
+    <w:lvl w:ilvl="1" w:tplc="08090019" w:tentative="1">
+      <w:start w:val="1"/>
+      <w:numFmt w:val="lowerLetter"/>
+      <w:lvlText w:val="%2."/>
+      <w:lvlJc w:val="left"/>
+      <w:pPr>
+        <w:ind w:left="1440" w:hanging="360"/>
+      </w:pPr>
+    </w:lvl>
+    <w:lvl w:ilvl="2" w:tplc="0809001B" w:tentative="1">
+      <w:start w:val="1"/>
+      <w:numFmt w:val="lowerRoman"/>
+      <w:lvlText w:val="%3."/>
+      <w:lvlJc w:val="right"/>
+      <w:pPr>
+        <w:ind w:left="2160" w:hanging="180"/>
+      </w:pPr>
+    </w:lvl>
+    <w:lvl w:ilvl="3" w:tplc="0809000F" w:tentative="1">
+      <w:start w:val="1"/>
+      <w:numFmt w:val="decimal"/>
+      <w:lvlText w:val="%4."/>
+      <w:lvlJc w:val="left"/>
+      <w:pPr>
+        <w:ind w:left="2880" w:hanging="360"/>
+      </w:pPr>
+    </w:lvl>
+    <w:lvl w:ilvl="4" w:tplc="08090019" w:tentative="1">
+      <w:start w:val="1"/>
+      <w:numFmt w:val="lowerLetter"/>
+      <w:lvlText w:val="%5."/>
+      <w:lvlJc w:val="left"/>
+      <w:pPr>
+        <w:ind w:left="3600" w:hanging="360"/>
+      </w:pPr>
+    </w:lvl>
+    <w:lvl w:ilvl="5" w:tplc="0809001B" w:tentative="1">
+      <w:start w:val="1"/>
+      <w:numFmt w:val="lowerRoman"/>
+      <w:lvlText w:val="%6."/>
+      <w:lvlJc w:val="right"/>
+      <w:pPr>
+        <w:ind w:left="4320" w:hanging="180"/>
+      </w:pPr>
+    </w:lvl>
+    <w:lvl w:ilvl="6" w:tplc="0809000F" w:tentative="1">
+      <w:start w:val="1"/>
+      <w:numFmt w:val="decimal"/>
+      <w:lvlText w:val="%7."/>
+      <w:lvlJc w:val="left"/>
+      <w:pPr>
+        <w:ind w:left="5040" w:hanging="360"/>
+      </w:pPr>
+    </w:lvl>
+    <w:lvl w:ilvl="7" w:tplc="08090019" w:tentative="1">
+      <w:start w:val="1"/>
+      <w:numFmt w:val="lowerLetter"/>
+      <w:lvlText w:val="%8."/>
+      <w:lvlJc w:val="left"/>
+      <w:pPr>
+        <w:ind w:left="5760" w:hanging="360"/>
+      </w:pPr>
+    </w:lvl>
+    <w:lvl w:ilvl="8" w:tplc="0809001B" w:tentative="1">
+      <w:start w:val="1"/>
+      <w:numFmt w:val="lowerRoman"/>
+      <w:lvlText w:val="%9."/>
+      <w:lvlJc w:val="right"/>
+      <w:pPr>
+        <w:ind w:left="6480" w:hanging="180"/>
+      </w:pPr>
+    </w:lvl>
+  </w:abstractNum>
+  <w:abstractNum w:abstractNumId="6" w15:restartNumberingAfterBreak="0">
+    <w:nsid w:val="433F1BB9"/>
+    <w:multiLevelType w:val="hybridMultilevel"/>
+    <w:tmpl w:val="440A9942"/>
+    <w:lvl w:ilvl="0" w:tplc="0809000F">
+      <w:start w:val="1"/>
+      <w:numFmt w:val="decimal"/>
+      <w:lvlText w:val="%1."/>
+      <w:lvlJc w:val="left"/>
+      <w:pPr>
+        <w:ind w:left="720" w:hanging="360"/>
+      </w:pPr>
+      <w:rPr>
+        <w:rFonts w:hint="default"/>
+      </w:rPr>
+    </w:lvl>
+    <w:lvl w:ilvl="1" w:tplc="08090019" w:tentative="1">
+      <w:start w:val="1"/>
+      <w:numFmt w:val="lowerLetter"/>
+      <w:lvlText w:val="%2."/>
+      <w:lvlJc w:val="left"/>
+      <w:pPr>
+        <w:ind w:left="1440" w:hanging="360"/>
+      </w:pPr>
+    </w:lvl>
+    <w:lvl w:ilvl="2" w:tplc="0809001B" w:tentative="1">
+      <w:start w:val="1"/>
+      <w:numFmt w:val="lowerRoman"/>
+      <w:lvlText w:val="%3."/>
+      <w:lvlJc w:val="right"/>
+      <w:pPr>
+        <w:ind w:left="2160" w:hanging="180"/>
+      </w:pPr>
+    </w:lvl>
+    <w:lvl w:ilvl="3" w:tplc="0809000F" w:tentative="1">
+      <w:start w:val="1"/>
+      <w:numFmt w:val="decimal"/>
+      <w:lvlText w:val="%4."/>
+      <w:lvlJc w:val="left"/>
+      <w:pPr>
+        <w:ind w:left="2880" w:hanging="360"/>
+      </w:pPr>
+    </w:lvl>
+    <w:lvl w:ilvl="4" w:tplc="08090019" w:tentative="1">
+      <w:start w:val="1"/>
+      <w:numFmt w:val="lowerLetter"/>
+      <w:lvlText w:val="%5."/>
+      <w:lvlJc w:val="left"/>
+      <w:pPr>
+        <w:ind w:left="3600" w:hanging="360"/>
+      </w:pPr>
+    </w:lvl>
+    <w:lvl w:ilvl="5" w:tplc="0809001B" w:tentative="1">
+      <w:start w:val="1"/>
+      <w:numFmt w:val="lowerRoman"/>
+      <w:lvlText w:val="%6."/>
+      <w:lvlJc w:val="right"/>
+      <w:pPr>
+        <w:ind w:left="4320" w:hanging="180"/>
+      </w:pPr>
+    </w:lvl>
+    <w:lvl w:ilvl="6" w:tplc="0809000F" w:tentative="1">
+      <w:start w:val="1"/>
+      <w:numFmt w:val="decimal"/>
+      <w:lvlText w:val="%7."/>
+      <w:lvlJc w:val="left"/>
+      <w:pPr>
+        <w:ind w:left="5040" w:hanging="360"/>
+      </w:pPr>
+    </w:lvl>
+    <w:lvl w:ilvl="7" w:tplc="08090019" w:tentative="1">
+      <w:start w:val="1"/>
+      <w:numFmt w:val="lowerLetter"/>
+      <w:lvlText w:val="%8."/>
+      <w:lvlJc w:val="left"/>
+      <w:pPr>
+        <w:ind w:left="5760" w:hanging="360"/>
+      </w:pPr>
+    </w:lvl>
+    <w:lvl w:ilvl="8" w:tplc="0809001B" w:tentative="1">
+      <w:start w:val="1"/>
+      <w:numFmt w:val="lowerRoman"/>
+      <w:lvlText w:val="%9."/>
+      <w:lvlJc w:val="right"/>
+      <w:pPr>
+        <w:ind w:left="6480" w:hanging="180"/>
+      </w:pPr>
+    </w:lvl>
+  </w:abstractNum>
+  <w:abstractNum w:abstractNumId="7" w15:restartNumberingAfterBreak="0">
+    <w:nsid w:val="520B3C97"/>
+    <w:multiLevelType w:val="hybridMultilevel"/>
+    <w:tmpl w:val="D1C8A6A8"/>
+    <w:lvl w:ilvl="0" w:tplc="0809000F">
+      <w:start w:val="1"/>
+      <w:numFmt w:val="decimal"/>
+      <w:lvlText w:val="%1."/>
+      <w:lvlJc w:val="left"/>
+      <w:pPr>
+        <w:ind w:left="720" w:hanging="360"/>
+      </w:pPr>
+      <w:rPr>
+        <w:rFonts w:hint="default"/>
+      </w:rPr>
+    </w:lvl>
+    <w:lvl w:ilvl="1" w:tplc="08090019" w:tentative="1">
+      <w:start w:val="1"/>
+      <w:numFmt w:val="lowerLetter"/>
+      <w:lvlText w:val="%2."/>
+      <w:lvlJc w:val="left"/>
+      <w:pPr>
+        <w:ind w:left="1440" w:hanging="360"/>
+      </w:pPr>
+    </w:lvl>
+    <w:lvl w:ilvl="2" w:tplc="0809001B" w:tentative="1">
+      <w:start w:val="1"/>
+      <w:numFmt w:val="lowerRoman"/>
+      <w:lvlText w:val="%3."/>
+      <w:lvlJc w:val="right"/>
+      <w:pPr>
+        <w:ind w:left="2160" w:hanging="180"/>
+      </w:pPr>
+    </w:lvl>
+    <w:lvl w:ilvl="3" w:tplc="0809000F" w:tentative="1">
+      <w:start w:val="1"/>
+      <w:numFmt w:val="decimal"/>
+      <w:lvlText w:val="%4."/>
+      <w:lvlJc w:val="left"/>
+      <w:pPr>
+        <w:ind w:left="2880" w:hanging="360"/>
+      </w:pPr>
+    </w:lvl>
+    <w:lvl w:ilvl="4" w:tplc="08090019" w:tentative="1">
+      <w:start w:val="1"/>
+      <w:numFmt w:val="lowerLetter"/>
+      <w:lvlText w:val="%5."/>
+      <w:lvlJc w:val="left"/>
+      <w:pPr>
+        <w:ind w:left="3600" w:hanging="360"/>
+      </w:pPr>
+    </w:lvl>
+    <w:lvl w:ilvl="5" w:tplc="0809001B" w:tentative="1">
+      <w:start w:val="1"/>
+      <w:numFmt w:val="lowerRoman"/>
+      <w:lvlText w:val="%6."/>
+      <w:lvlJc w:val="right"/>
+      <w:pPr>
+        <w:ind w:left="4320" w:hanging="180"/>
+      </w:pPr>
+    </w:lvl>
+    <w:lvl w:ilvl="6" w:tplc="0809000F" w:tentative="1">
+      <w:start w:val="1"/>
+      <w:numFmt w:val="decimal"/>
+      <w:lvlText w:val="%7."/>
+      <w:lvlJc w:val="left"/>
+      <w:pPr>
+        <w:ind w:left="5040" w:hanging="360"/>
+      </w:pPr>
+    </w:lvl>
+    <w:lvl w:ilvl="7" w:tplc="08090019" w:tentative="1">
+      <w:start w:val="1"/>
+      <w:numFmt w:val="lowerLetter"/>
+      <w:lvlText w:val="%8."/>
+      <w:lvlJc w:val="left"/>
+      <w:pPr>
+        <w:ind w:left="5760" w:hanging="360"/>
+      </w:pPr>
+    </w:lvl>
+    <w:lvl w:ilvl="8" w:tplc="0809001B" w:tentative="1">
+      <w:start w:val="1"/>
+      <w:numFmt w:val="lowerRoman"/>
+      <w:lvlText w:val="%9."/>
+      <w:lvlJc w:val="right"/>
+      <w:pPr>
+        <w:ind w:left="6480" w:hanging="180"/>
+      </w:pPr>
+    </w:lvl>
+  </w:abstractNum>
+  <w:abstractNum w:abstractNumId="8" w15:restartNumberingAfterBreak="0">
+    <w:nsid w:val="552D5725"/>
+    <w:multiLevelType w:val="hybridMultilevel"/>
+    <w:tmpl w:val="0F8A84F8"/>
+    <w:lvl w:ilvl="0" w:tplc="0809000F">
+      <w:start w:val="1"/>
+      <w:numFmt w:val="decimal"/>
+      <w:lvlText w:val="%1."/>
+      <w:lvlJc w:val="left"/>
+      <w:pPr>
+        <w:ind w:left="720" w:hanging="360"/>
+      </w:pPr>
+      <w:rPr>
+        <w:rFonts w:hint="default"/>
+      </w:rPr>
+    </w:lvl>
+    <w:lvl w:ilvl="1" w:tplc="08090019" w:tentative="1">
+      <w:start w:val="1"/>
+      <w:numFmt w:val="lowerLetter"/>
+      <w:lvlText w:val="%2."/>
+      <w:lvlJc w:val="left"/>
+      <w:pPr>
+        <w:ind w:left="1440" w:hanging="360"/>
+      </w:pPr>
+    </w:lvl>
+    <w:lvl w:ilvl="2" w:tplc="0809001B" w:tentative="1">
+      <w:start w:val="1"/>
+      <w:numFmt w:val="lowerRoman"/>
+      <w:lvlText w:val="%3."/>
+      <w:lvlJc w:val="right"/>
+      <w:pPr>
+        <w:ind w:left="2160" w:hanging="180"/>
+      </w:pPr>
+    </w:lvl>
+    <w:lvl w:ilvl="3" w:tplc="0809000F" w:tentative="1">
+      <w:start w:val="1"/>
+      <w:numFmt w:val="decimal"/>
+      <w:lvlText w:val="%4."/>
+      <w:lvlJc w:val="left"/>
+      <w:pPr>
+        <w:ind w:left="2880" w:hanging="360"/>
+      </w:pPr>
+    </w:lvl>
+    <w:lvl w:ilvl="4" w:tplc="08090019" w:tentative="1">
+      <w:start w:val="1"/>
+      <w:numFmt w:val="lowerLetter"/>
+      <w:lvlText w:val="%5."/>
+      <w:lvlJc w:val="left"/>
+      <w:pPr>
+        <w:ind w:left="3600" w:hanging="360"/>
+      </w:pPr>
+    </w:lvl>
+    <w:lvl w:ilvl="5" w:tplc="0809001B" w:tentative="1">
+      <w:start w:val="1"/>
+      <w:numFmt w:val="lowerRoman"/>
+      <w:lvlText w:val="%6."/>
+      <w:lvlJc w:val="right"/>
+      <w:pPr>
+        <w:ind w:left="4320" w:hanging="180"/>
+      </w:pPr>
+    </w:lvl>
+    <w:lvl w:ilvl="6" w:tplc="0809000F" w:tentative="1">
+      <w:start w:val="1"/>
+      <w:numFmt w:val="decimal"/>
+      <w:lvlText w:val="%7."/>
+      <w:lvlJc w:val="left"/>
+      <w:pPr>
+        <w:ind w:left="5040" w:hanging="360"/>
+      </w:pPr>
+    </w:lvl>
+    <w:lvl w:ilvl="7" w:tplc="08090019" w:tentative="1">
+      <w:start w:val="1"/>
+      <w:numFmt w:val="lowerLetter"/>
+      <w:lvlText w:val="%8."/>
+      <w:lvlJc w:val="left"/>
+      <w:pPr>
+        <w:ind w:left="5760" w:hanging="360"/>
+      </w:pPr>
+    </w:lvl>
+    <w:lvl w:ilvl="8" w:tplc="0809001B" w:tentative="1">
+      <w:start w:val="1"/>
+      <w:numFmt w:val="lowerRoman"/>
+      <w:lvlText w:val="%9."/>
+      <w:lvlJc w:val="right"/>
+      <w:pPr>
+        <w:ind w:left="6480" w:hanging="180"/>
+      </w:pPr>
+    </w:lvl>
+  </w:abstractNum>
+  <w:abstractNum w:abstractNumId="9" w15:restartNumberingAfterBreak="0">
+    <w:nsid w:val="55CB2499"/>
+    <w:multiLevelType w:val="hybridMultilevel"/>
+    <w:tmpl w:val="3B0C9FE8"/>
+    <w:lvl w:ilvl="0" w:tplc="0809000F">
+      <w:start w:val="1"/>
+      <w:numFmt w:val="decimal"/>
+      <w:lvlText w:val="%1."/>
+      <w:lvlJc w:val="left"/>
+      <w:pPr>
+        <w:ind w:left="720" w:hanging="360"/>
+      </w:pPr>
+      <w:rPr>
+        <w:rFonts w:hint="default"/>
+      </w:rPr>
+    </w:lvl>
+    <w:lvl w:ilvl="1" w:tplc="08090019" w:tentative="1">
+      <w:start w:val="1"/>
+      <w:numFmt w:val="lowerLetter"/>
+      <w:lvlText w:val="%2."/>
+      <w:lvlJc w:val="left"/>
+      <w:pPr>
+        <w:ind w:left="1440" w:hanging="360"/>
+      </w:pPr>
+    </w:lvl>
+    <w:lvl w:ilvl="2" w:tplc="0809001B" w:tentative="1">
+      <w:start w:val="1"/>
+      <w:numFmt w:val="lowerRoman"/>
+      <w:lvlText w:val="%3."/>
+      <w:lvlJc w:val="right"/>
+      <w:pPr>
+        <w:ind w:left="2160" w:hanging="180"/>
+      </w:pPr>
+    </w:lvl>
+    <w:lvl w:ilvl="3" w:tplc="0809000F" w:tentative="1">
+      <w:start w:val="1"/>
+      <w:numFmt w:val="decimal"/>
+      <w:lvlText w:val="%4."/>
+      <w:lvlJc w:val="left"/>
+      <w:pPr>
+        <w:ind w:left="2880" w:hanging="360"/>
+      </w:pPr>
+    </w:lvl>
+    <w:lvl w:ilvl="4" w:tplc="08090019" w:tentative="1">
+      <w:start w:val="1"/>
+      <w:numFmt w:val="lowerLetter"/>
+      <w:lvlText w:val="%5."/>
+      <w:lvlJc w:val="left"/>
+      <w:pPr>
+        <w:ind w:left="3600" w:hanging="360"/>
+      </w:pPr>
+    </w:lvl>
+    <w:lvl w:ilvl="5" w:tplc="0809001B" w:tentative="1">
+      <w:start w:val="1"/>
+      <w:numFmt w:val="lowerRoman"/>
+      <w:lvlText w:val="%6."/>
+      <w:lvlJc w:val="right"/>
+      <w:pPr>
+        <w:ind w:left="4320" w:hanging="180"/>
+      </w:pPr>
+    </w:lvl>
+    <w:lvl w:ilvl="6" w:tplc="0809000F" w:tentative="1">
+      <w:start w:val="1"/>
+      <w:numFmt w:val="decimal"/>
+      <w:lvlText w:val="%7."/>
+      <w:lvlJc w:val="left"/>
+      <w:pPr>
+        <w:ind w:left="5040" w:hanging="360"/>
+      </w:pPr>
+    </w:lvl>
+    <w:lvl w:ilvl="7" w:tplc="08090019" w:tentative="1">
+      <w:start w:val="1"/>
+      <w:numFmt w:val="lowerLetter"/>
+      <w:lvlText w:val="%8."/>
+      <w:lvlJc w:val="left"/>
+      <w:pPr>
+        <w:ind w:left="5760" w:hanging="360"/>
+      </w:pPr>
+    </w:lvl>
+    <w:lvl w:ilvl="8" w:tplc="0809001B" w:tentative="1">
+      <w:start w:val="1"/>
+      <w:numFmt w:val="lowerRoman"/>
+      <w:lvlText w:val="%9."/>
+      <w:lvlJc w:val="right"/>
+      <w:pPr>
+        <w:ind w:left="6480" w:hanging="180"/>
+      </w:pPr>
+    </w:lvl>
+  </w:abstractNum>
+  <w:abstractNum w:abstractNumId="10" w15:restartNumberingAfterBreak="0">
+    <w:nsid w:val="5A8D1928"/>
+    <w:multiLevelType w:val="hybridMultilevel"/>
+    <w:tmpl w:val="3E9EADE6"/>
+    <w:lvl w:ilvl="0" w:tplc="0809000F">
+      <w:start w:val="1"/>
+      <w:numFmt w:val="decimal"/>
+      <w:lvlText w:val="%1."/>
+      <w:lvlJc w:val="left"/>
+      <w:pPr>
+        <w:ind w:left="720" w:hanging="360"/>
+      </w:pPr>
+      <w:rPr>
+        <w:rFonts w:hint="default"/>
+      </w:rPr>
+    </w:lvl>
+    <w:lvl w:ilvl="1" w:tplc="08090019" w:tentative="1">
+      <w:start w:val="1"/>
+      <w:numFmt w:val="lowerLetter"/>
+      <w:lvlText w:val="%2."/>
+      <w:lvlJc w:val="left"/>
+      <w:pPr>
+        <w:ind w:left="1440" w:hanging="360"/>
+      </w:pPr>
+    </w:lvl>
+    <w:lvl w:ilvl="2" w:tplc="0809001B" w:tentative="1">
+      <w:start w:val="1"/>
+      <w:numFmt w:val="lowerRoman"/>
+      <w:lvlText w:val="%3."/>
+      <w:lvlJc w:val="right"/>
+      <w:pPr>
+        <w:ind w:left="2160" w:hanging="180"/>
+      </w:pPr>
+    </w:lvl>
+    <w:lvl w:ilvl="3" w:tplc="0809000F" w:tentative="1">
+      <w:start w:val="1"/>
+      <w:numFmt w:val="decimal"/>
+      <w:lvlText w:val="%4."/>
+      <w:lvlJc w:val="left"/>
+      <w:pPr>
+        <w:ind w:left="2880" w:hanging="360"/>
+      </w:pPr>
+    </w:lvl>
+    <w:lvl w:ilvl="4" w:tplc="08090019" w:tentative="1">
+      <w:start w:val="1"/>
+      <w:numFmt w:val="lowerLetter"/>
+      <w:lvlText w:val="%5."/>
+      <w:lvlJc w:val="left"/>
+      <w:pPr>
+        <w:ind w:left="3600" w:hanging="360"/>
+      </w:pPr>
+    </w:lvl>
+    <w:lvl w:ilvl="5" w:tplc="0809001B" w:tentative="1">
+      <w:start w:val="1"/>
+      <w:numFmt w:val="lowerRoman"/>
+      <w:lvlText w:val="%6."/>
+      <w:lvlJc w:val="right"/>
+      <w:pPr>
+        <w:ind w:left="4320" w:hanging="180"/>
+      </w:pPr>
+    </w:lvl>
+    <w:lvl w:ilvl="6" w:tplc="0809000F" w:tentative="1">
+      <w:start w:val="1"/>
+      <w:numFmt w:val="decimal"/>
+      <w:lvlText w:val="%7."/>
+      <w:lvlJc w:val="left"/>
+      <w:pPr>
+        <w:ind w:left="5040" w:hanging="360"/>
+      </w:pPr>
+    </w:lvl>
+    <w:lvl w:ilvl="7" w:tplc="08090019" w:tentative="1">
+      <w:start w:val="1"/>
+      <w:numFmt w:val="lowerLetter"/>
+      <w:lvlText w:val="%8."/>
+      <w:lvlJc w:val="left"/>
+      <w:pPr>
+        <w:ind w:left="5760" w:hanging="360"/>
+      </w:pPr>
+    </w:lvl>
+    <w:lvl w:ilvl="8" w:tplc="0809001B" w:tentative="1">
+      <w:start w:val="1"/>
+      <w:numFmt w:val="lowerRoman"/>
+      <w:lvlText w:val="%9."/>
+      <w:lvlJc w:val="right"/>
+      <w:pPr>
+        <w:ind w:left="6480" w:hanging="180"/>
+      </w:pPr>
+    </w:lvl>
+  </w:abstractNum>
+  <w:abstractNum w:abstractNumId="11" w15:restartNumberingAfterBreak="0">
+    <w:nsid w:val="5F033FBF"/>
+    <w:multiLevelType w:val="hybridMultilevel"/>
+    <w:tmpl w:val="76CE193E"/>
+    <w:lvl w:ilvl="0" w:tplc="0809000F">
+      <w:start w:val="1"/>
+      <w:numFmt w:val="decimal"/>
+      <w:lvlText w:val="%1."/>
+      <w:lvlJc w:val="left"/>
+      <w:pPr>
+        <w:ind w:left="720" w:hanging="360"/>
+      </w:pPr>
+      <w:rPr>
+        <w:rFonts w:hint="default"/>
+      </w:rPr>
+    </w:lvl>
+    <w:lvl w:ilvl="1" w:tplc="08090019" w:tentative="1">
+      <w:start w:val="1"/>
+      <w:numFmt w:val="lowerLetter"/>
+      <w:lvlText w:val="%2."/>
+      <w:lvlJc w:val="left"/>
+      <w:pPr>
+        <w:ind w:left="1440" w:hanging="360"/>
+      </w:pPr>
+    </w:lvl>
+    <w:lvl w:ilvl="2" w:tplc="0809001B" w:tentative="1">
+      <w:start w:val="1"/>
+      <w:numFmt w:val="lowerRoman"/>
+      <w:lvlText w:val="%3."/>
+      <w:lvlJc w:val="right"/>
+      <w:pPr>
+        <w:ind w:left="2160" w:hanging="180"/>
+      </w:pPr>
+    </w:lvl>
+    <w:lvl w:ilvl="3" w:tplc="0809000F" w:tentative="1">
+      <w:start w:val="1"/>
+      <w:numFmt w:val="decimal"/>
+      <w:lvlText w:val="%4."/>
+      <w:lvlJc w:val="left"/>
+      <w:pPr>
+        <w:ind w:left="2880" w:hanging="360"/>
+      </w:pPr>
+    </w:lvl>
+    <w:lvl w:ilvl="4" w:tplc="08090019" w:tentative="1">
+      <w:start w:val="1"/>
+      <w:numFmt w:val="lowerLetter"/>
+      <w:lvlText w:val="%5."/>
+      <w:lvlJc w:val="left"/>
+      <w:pPr>
+        <w:ind w:left="3600" w:hanging="360"/>
+      </w:pPr>
+    </w:lvl>
+    <w:lvl w:ilvl="5" w:tplc="0809001B" w:tentative="1">
+      <w:start w:val="1"/>
+      <w:numFmt w:val="lowerRoman"/>
+      <w:lvlText w:val="%6."/>
+      <w:lvlJc w:val="right"/>
+      <w:pPr>
+        <w:ind w:left="4320" w:hanging="180"/>
+      </w:pPr>
+    </w:lvl>
+    <w:lvl w:ilvl="6" w:tplc="0809000F" w:tentative="1">
+      <w:start w:val="1"/>
+      <w:numFmt w:val="decimal"/>
+      <w:lvlText w:val="%7."/>
+      <w:lvlJc w:val="left"/>
+      <w:pPr>
+        <w:ind w:left="5040" w:hanging="360"/>
+      </w:pPr>
+    </w:lvl>
+    <w:lvl w:ilvl="7" w:tplc="08090019" w:tentative="1">
+      <w:start w:val="1"/>
+      <w:numFmt w:val="lowerLetter"/>
+      <w:lvlText w:val="%8."/>
+      <w:lvlJc w:val="left"/>
+      <w:pPr>
+        <w:ind w:left="5760" w:hanging="360"/>
+      </w:pPr>
+    </w:lvl>
+    <w:lvl w:ilvl="8" w:tplc="0809001B" w:tentative="1">
+      <w:start w:val="1"/>
+      <w:numFmt w:val="lowerRoman"/>
+      <w:lvlText w:val="%9."/>
+      <w:lvlJc w:val="right"/>
+      <w:pPr>
+        <w:ind w:left="6480" w:hanging="180"/>
+      </w:pPr>
+    </w:lvl>
+  </w:abstractNum>
+  <w:abstractNum w:abstractNumId="12" w15:restartNumberingAfterBreak="0">
+    <w:nsid w:val="628723D6"/>
+    <w:multiLevelType w:val="hybridMultilevel"/>
+    <w:tmpl w:val="3766A9BE"/>
+    <w:lvl w:ilvl="0" w:tplc="0809000F">
+      <w:start w:val="1"/>
+      <w:numFmt w:val="decimal"/>
+      <w:lvlText w:val="%1."/>
+      <w:lvlJc w:val="left"/>
+      <w:pPr>
+        <w:ind w:left="720" w:hanging="360"/>
+      </w:pPr>
+      <w:rPr>
+        <w:rFonts w:hint="default"/>
+      </w:rPr>
+    </w:lvl>
+    <w:lvl w:ilvl="1" w:tplc="08090019" w:tentative="1">
+      <w:start w:val="1"/>
+      <w:numFmt w:val="lowerLetter"/>
+      <w:lvlText w:val="%2."/>
+      <w:lvlJc w:val="left"/>
+      <w:pPr>
+        <w:ind w:left="1440" w:hanging="360"/>
+      </w:pPr>
+    </w:lvl>
+    <w:lvl w:ilvl="2" w:tplc="0809001B" w:tentative="1">
+      <w:start w:val="1"/>
+      <w:numFmt w:val="lowerRoman"/>
+      <w:lvlText w:val="%3."/>
+      <w:lvlJc w:val="right"/>
+      <w:pPr>
+        <w:ind w:left="2160" w:hanging="180"/>
+      </w:pPr>
+    </w:lvl>
+    <w:lvl w:ilvl="3" w:tplc="0809000F" w:tentative="1">
+      <w:start w:val="1"/>
+      <w:numFmt w:val="decimal"/>
+      <w:lvlText w:val="%4."/>
+      <w:lvlJc w:val="left"/>
+      <w:pPr>
+        <w:ind w:left="2880" w:hanging="360"/>
+      </w:pPr>
+    </w:lvl>
+    <w:lvl w:ilvl="4" w:tplc="08090019" w:tentative="1">
+      <w:start w:val="1"/>
+      <w:numFmt w:val="lowerLetter"/>
+      <w:lvlText w:val="%5."/>
+      <w:lvlJc w:val="left"/>
+      <w:pPr>
+        <w:ind w:left="3600" w:hanging="360"/>
+      </w:pPr>
+    </w:lvl>
+    <w:lvl w:ilvl="5" w:tplc="0809001B" w:tentative="1">
+      <w:start w:val="1"/>
+      <w:numFmt w:val="lowerRoman"/>
+      <w:lvlText w:val="%6."/>
+      <w:lvlJc w:val="right"/>
+      <w:pPr>
+        <w:ind w:left="4320" w:hanging="180"/>
+      </w:pPr>
+    </w:lvl>
+    <w:lvl w:ilvl="6" w:tplc="0809000F" w:tentative="1">
+      <w:start w:val="1"/>
+      <w:numFmt w:val="decimal"/>
+      <w:lvlText w:val="%7."/>
+      <w:lvlJc w:val="left"/>
+      <w:pPr>
+        <w:ind w:left="5040" w:hanging="360"/>
+      </w:pPr>
+    </w:lvl>
+    <w:lvl w:ilvl="7" w:tplc="08090019" w:tentative="1">
+      <w:start w:val="1"/>
+      <w:numFmt w:val="lowerLetter"/>
+      <w:lvlText w:val="%8."/>
+      <w:lvlJc w:val="left"/>
+      <w:pPr>
+        <w:ind w:left="5760" w:hanging="360"/>
+      </w:pPr>
+    </w:lvl>
+    <w:lvl w:ilvl="8" w:tplc="0809001B" w:tentative="1">
+      <w:start w:val="1"/>
+      <w:numFmt w:val="lowerRoman"/>
+      <w:lvlText w:val="%9."/>
+      <w:lvlJc w:val="right"/>
+      <w:pPr>
+        <w:ind w:left="6480" w:hanging="180"/>
+      </w:pPr>
     </w:lvl>
   </w:abstractNum>
   <w:num w:numId="1" w16cid:durableId="2023239908">
     <w:abstractNumId w:val="0"/>
   </w:num>
   <w:num w:numId="2" w16cid:durableId="1394083679">
+    <w:abstractNumId w:val="4"/>
+  </w:num>
+  <w:num w:numId="3" w16cid:durableId="1068304247">
+    <w:abstractNumId w:val="12"/>
+  </w:num>
+  <w:num w:numId="4" w16cid:durableId="1350257287">
     <w:abstractNumId w:val="1"/>
+  </w:num>
+  <w:num w:numId="5" w16cid:durableId="512719580">
+    <w:abstractNumId w:val="6"/>
+  </w:num>
+  <w:num w:numId="6" w16cid:durableId="1848128392">
+    <w:abstractNumId w:val="9"/>
+  </w:num>
+  <w:num w:numId="7" w16cid:durableId="1219973215">
+    <w:abstractNumId w:val="8"/>
+  </w:num>
+  <w:num w:numId="8" w16cid:durableId="8064703">
+    <w:abstractNumId w:val="7"/>
+  </w:num>
+  <w:num w:numId="9" w16cid:durableId="837382859">
+    <w:abstractNumId w:val="10"/>
+  </w:num>
+  <w:num w:numId="10" w16cid:durableId="1745907453">
+    <w:abstractNumId w:val="11"/>
+  </w:num>
+  <w:num w:numId="11" w16cid:durableId="139466877">
+    <w:abstractNumId w:val="5"/>
+  </w:num>
+  <w:num w:numId="12" w16cid:durableId="40789684">
+    <w:abstractNumId w:val="3"/>
+  </w:num>
+  <w:num w:numId="13" w16cid:durableId="1784811509">
+    <w:abstractNumId w:val="2"/>
   </w:num>
 </w:numbering>
 </file>
@@ -5000,6 +7505,7 @@
   <w:style w:type="character" w:default="1" w:styleId="DefaultParagraphFont">
     <w:name w:val="Default Paragraph Font"/>
     <w:uiPriority w:val="1"/>
+    <w:semiHidden/>
     <w:unhideWhenUsed/>
   </w:style>
   <w:style w:type="table" w:default="1" w:styleId="TableNormal">
@@ -5556,6 +8062,7 @@
   <w:rsids>
     <w:rsidRoot w:val="00606098"/>
     <w:rsid w:val="00606098"/>
+    <w:rsid w:val="00A00728"/>
     <w:rsid w:val="00BB675D"/>
   </w:rsids>
   <m:mathPr>

</xml_diff>

<commit_message>
updated the project proposal
</commit_message>
<xml_diff>
--- a/Project Proposal.docx
+++ b/Project Proposal.docx
@@ -1,6 +1,6 @@
 
 <file path=word/document.xml><?xml version="1.0" encoding="utf-8"?>
-<w:document xmlns:wpc="http://schemas.microsoft.com/office/word/2010/wordprocessingCanvas" xmlns:cx="http://schemas.microsoft.com/office/drawing/2014/chartex" xmlns:cx1="http://schemas.microsoft.com/office/drawing/2015/9/8/chartex" xmlns:cx2="http://schemas.microsoft.com/office/drawing/2015/10/21/chartex" xmlns:cx3="http://schemas.microsoft.com/office/drawing/2016/5/9/chartex" xmlns:cx4="http://schemas.microsoft.com/office/drawing/2016/5/10/chartex" xmlns:cx5="http://schemas.microsoft.com/office/drawing/2016/5/11/chartex" xmlns:cx6="http://schemas.microsoft.com/office/drawing/2016/5/12/chartex" xmlns:cx7="http://schemas.microsoft.com/office/drawing/2016/5/13/chartex" xmlns:cx8="http://schemas.microsoft.com/office/drawing/2016/5/14/chartex" xmlns:mc="http://schemas.openxmlformats.org/markup-compatibility/2006" xmlns:aink="http://schemas.microsoft.com/office/drawing/2016/ink" xmlns:am3d="http://schemas.microsoft.com/office/drawing/2017/model3d" xmlns:o="urn:schemas-microsoft-com:office:office" xmlns:oel="http://schemas.microsoft.com/office/2019/extlst" xmlns:r="http://schemas.openxmlformats.org/officeDocument/2006/relationships" xmlns:m="http://schemas.openxmlformats.org/officeDocument/2006/math" xmlns:v="urn:schemas-microsoft-com:vml" xmlns:wp14="http://schemas.microsoft.com/office/word/2010/wordprocessingDrawing" xmlns:wp="http://schemas.openxmlformats.org/drawingml/2006/wordprocessingDrawing" xmlns:w10="urn:schemas-microsoft-com:office:word" xmlns:w="http://schemas.openxmlformats.org/wordprocessingml/2006/main" xmlns:w14="http://schemas.microsoft.com/office/word/2010/wordml" xmlns:w15="http://schemas.microsoft.com/office/word/2012/wordml" xmlns:w16cex="http://schemas.microsoft.com/office/word/2018/wordml/cex" xmlns:w16cid="http://schemas.microsoft.com/office/word/2016/wordml/cid" xmlns:w16="http://schemas.microsoft.com/office/word/2018/wordml" xmlns:w16sdtdh="http://schemas.microsoft.com/office/word/2020/wordml/sdtdatahash" xmlns:w16se="http://schemas.microsoft.com/office/word/2015/wordml/symex" xmlns:wpg="http://schemas.microsoft.com/office/word/2010/wordprocessingGroup" xmlns:wpi="http://schemas.microsoft.com/office/word/2010/wordprocessingInk" xmlns:wne="http://schemas.microsoft.com/office/word/2006/wordml" xmlns:wps="http://schemas.microsoft.com/office/word/2010/wordprocessingShape" mc:Ignorable="w14 w15 w16se w16cid w16 w16cex w16sdtdh wp14">
+<w:document xmlns:wpc="http://schemas.microsoft.com/office/word/2010/wordprocessingCanvas" xmlns:cx="http://schemas.microsoft.com/office/drawing/2014/chartex" xmlns:cx1="http://schemas.microsoft.com/office/drawing/2015/9/8/chartex" xmlns:cx2="http://schemas.microsoft.com/office/drawing/2015/10/21/chartex" xmlns:cx3="http://schemas.microsoft.com/office/drawing/2016/5/9/chartex" xmlns:cx4="http://schemas.microsoft.com/office/drawing/2016/5/10/chartex" xmlns:cx5="http://schemas.microsoft.com/office/drawing/2016/5/11/chartex" xmlns:cx6="http://schemas.microsoft.com/office/drawing/2016/5/12/chartex" xmlns:cx7="http://schemas.microsoft.com/office/drawing/2016/5/13/chartex" xmlns:cx8="http://schemas.microsoft.com/office/drawing/2016/5/14/chartex" xmlns:mc="http://schemas.openxmlformats.org/markup-compatibility/2006" xmlns:aink="http://schemas.microsoft.com/office/drawing/2016/ink" xmlns:am3d="http://schemas.microsoft.com/office/drawing/2017/model3d" xmlns:o="urn:schemas-microsoft-com:office:office" xmlns:oel="http://schemas.microsoft.com/office/2019/extlst" xmlns:r="http://schemas.openxmlformats.org/officeDocument/2006/relationships" xmlns:m="http://schemas.openxmlformats.org/officeDocument/2006/math" xmlns:v="urn:schemas-microsoft-com:vml" xmlns:wp14="http://schemas.microsoft.com/office/word/2010/wordprocessingDrawing" xmlns:wp="http://schemas.openxmlformats.org/drawingml/2006/wordprocessingDrawing" xmlns:w10="urn:schemas-microsoft-com:office:word" xmlns:w="http://schemas.openxmlformats.org/wordprocessingml/2006/main" xmlns:w14="http://schemas.microsoft.com/office/word/2010/wordml" xmlns:w15="http://schemas.microsoft.com/office/word/2012/wordml" xmlns:w16cex="http://schemas.microsoft.com/office/word/2018/wordml/cex" xmlns:w16cid="http://schemas.microsoft.com/office/word/2016/wordml/cid" xmlns:w16="http://schemas.microsoft.com/office/word/2018/wordml" xmlns:w16du="http://schemas.microsoft.com/office/word/2023/wordml/word16du" xmlns:w16sdtdh="http://schemas.microsoft.com/office/word/2020/wordml/sdtdatahash" xmlns:w16sdtfl="http://schemas.microsoft.com/office/word/2024/wordml/sdtformatlock" xmlns:w16se="http://schemas.microsoft.com/office/word/2015/wordml/symex" xmlns:wpg="http://schemas.microsoft.com/office/word/2010/wordprocessingGroup" xmlns:wpi="http://schemas.microsoft.com/office/word/2010/wordprocessingInk" xmlns:wne="http://schemas.microsoft.com/office/word/2006/wordml" xmlns:wps="http://schemas.microsoft.com/office/word/2010/wordprocessingShape" mc:Ignorable="w14 w15 w16se w16cid w16 w16cex w16sdtdh w16sdtfl w16du wp14">
   <w:body>
     <w:sdt>
       <w:sdtPr>
@@ -106,7 +106,6 @@
             <w:dataBinding w:prefixMappings="xmlns:ns0='http://purl.org/dc/elements/1.1/' xmlns:ns1='http://schemas.openxmlformats.org/package/2006/metadata/core-properties' " w:xpath="/ns1:coreProperties[1]/ns0:subject[1]" w:storeItemID="{6C3C8BC8-F283-45AE-878A-BAB7291924A1}"/>
             <w:text/>
           </w:sdtPr>
-          <w:sdtEndPr/>
           <w:sdtContent>
             <w:p>
               <w:pPr>
@@ -2009,16 +2008,8 @@
           <w:p>
             <w:pPr>
               <w:spacing w:after="160" w:line="278" w:lineRule="auto"/>
-              <w:rPr>
-                <w:b/>
-                <w:bCs/>
-              </w:rPr>
-            </w:pPr>
-            <w:r>
-              <w:rPr>
-                <w:b/>
-                <w:bCs/>
-              </w:rPr>
+            </w:pPr>
+            <w:r>
               <w:t>Register</w:t>
             </w:r>
           </w:p>
@@ -2037,60 +2028,27 @@
           <w:p>
             <w:pPr>
               <w:spacing w:after="160" w:line="278" w:lineRule="auto"/>
-              <w:rPr>
-                <w:b/>
-                <w:bCs/>
-              </w:rPr>
-            </w:pPr>
-            <w:r>
-              <w:rPr>
-                <w:b/>
-                <w:bCs/>
-              </w:rPr>
+            </w:pPr>
+            <w:r>
               <w:t xml:space="preserve">As </w:t>
             </w:r>
             <w:r>
-              <w:rPr>
-                <w:b/>
-                <w:bCs/>
-              </w:rPr>
               <w:t>Jon, I want to be able to create an account so</w:t>
             </w:r>
             <w:r>
-              <w:rPr>
-                <w:b/>
-                <w:bCs/>
-              </w:rPr>
               <w:t xml:space="preserve"> th</w:t>
             </w:r>
             <w:r>
-              <w:rPr>
-                <w:b/>
-                <w:bCs/>
-              </w:rPr>
-              <w:t xml:space="preserve">at I can better </w:t>
-            </w:r>
-            <w:r>
-              <w:rPr>
-                <w:b/>
-                <w:bCs/>
-              </w:rPr>
-              <w:t>organise</w:t>
-            </w:r>
-            <w:r>
-              <w:rPr>
-                <w:b/>
-                <w:bCs/>
+              <w:t>at I can better organise</w:t>
+            </w:r>
+            <w:r>
+              <w:rPr>
                 <w:i/>
                 <w:iCs/>
               </w:rPr>
               <w:t xml:space="preserve"> </w:t>
             </w:r>
             <w:r>
-              <w:rPr>
-                <w:b/>
-                <w:bCs/>
-              </w:rPr>
               <w:t xml:space="preserve">information about the venues I have booked. </w:t>
             </w:r>
           </w:p>
@@ -2112,23 +2070,11 @@
                 <w:ilvl w:val="0"/>
                 <w:numId w:val="2"/>
               </w:numPr>
-              <w:rPr>
-                <w:b/>
-                <w:bCs/>
-              </w:rPr>
-            </w:pPr>
-            <w:r>
-              <w:rPr>
-                <w:b/>
-                <w:bCs/>
-              </w:rPr>
+            </w:pPr>
+            <w:r>
               <w:t xml:space="preserve">Provide the user with a </w:t>
             </w:r>
             <w:r>
-              <w:rPr>
-                <w:b/>
-                <w:bCs/>
-              </w:rPr>
               <w:t xml:space="preserve">functional registration screen </w:t>
             </w:r>
           </w:p>
@@ -2139,24 +2085,9 @@
                 <w:ilvl w:val="0"/>
                 <w:numId w:val="2"/>
               </w:numPr>
-              <w:rPr>
-                <w:b/>
-                <w:bCs/>
-              </w:rPr>
-            </w:pPr>
-            <w:r>
-              <w:rPr>
-                <w:b/>
-                <w:bCs/>
-              </w:rPr>
-              <w:t>Check that the data entered passes all validation checks</w:t>
-            </w:r>
-            <w:r>
-              <w:rPr>
-                <w:b/>
-                <w:bCs/>
-              </w:rPr>
-              <w:t xml:space="preserve"> </w:t>
+            </w:pPr>
+            <w:r>
+              <w:t xml:space="preserve">Check that the data entered passes all validation checks </w:t>
             </w:r>
           </w:p>
           <w:p>
@@ -2166,44 +2097,20 @@
                 <w:ilvl w:val="0"/>
                 <w:numId w:val="2"/>
               </w:numPr>
-              <w:rPr>
-                <w:b/>
-                <w:bCs/>
-              </w:rPr>
-            </w:pPr>
-            <w:r>
-              <w:rPr>
-                <w:b/>
-                <w:bCs/>
-              </w:rPr>
+            </w:pPr>
+            <w:r>
               <w:t xml:space="preserve">Save </w:t>
             </w:r>
             <w:r>
-              <w:rPr>
-                <w:b/>
-                <w:bCs/>
-              </w:rPr>
               <w:t>account</w:t>
             </w:r>
             <w:r>
-              <w:rPr>
-                <w:b/>
-                <w:bCs/>
-              </w:rPr>
               <w:t xml:space="preserve"> </w:t>
             </w:r>
             <w:r>
-              <w:rPr>
-                <w:b/>
-                <w:bCs/>
-              </w:rPr>
               <w:t>information</w:t>
             </w:r>
             <w:r>
-              <w:rPr>
-                <w:b/>
-                <w:bCs/>
-              </w:rPr>
               <w:t xml:space="preserve"> onto a database</w:t>
             </w:r>
           </w:p>
@@ -2221,30 +2128,14 @@
           <w:p>
             <w:pPr>
               <w:spacing w:after="160" w:line="278" w:lineRule="auto"/>
-              <w:rPr>
-                <w:b/>
-                <w:bCs/>
-              </w:rPr>
-            </w:pPr>
-            <w:r>
-              <w:rPr>
-                <w:b/>
-                <w:bCs/>
-              </w:rPr>
+            </w:pPr>
+            <w:r>
               <w:t xml:space="preserve">This feature will benefit the </w:t>
             </w:r>
             <w:r>
-              <w:rPr>
-                <w:b/>
-                <w:bCs/>
-              </w:rPr>
               <w:t>customer</w:t>
             </w:r>
             <w:r>
-              <w:rPr>
-                <w:b/>
-                <w:bCs/>
-              </w:rPr>
               <w:t xml:space="preserve"> as it gives users the option to create an account for simpler management of their data.</w:t>
             </w:r>
           </w:p>
@@ -2267,16 +2158,8 @@
           <w:p>
             <w:pPr>
               <w:spacing w:after="160" w:line="278" w:lineRule="auto"/>
-              <w:rPr>
-                <w:b/>
-                <w:bCs/>
-              </w:rPr>
-            </w:pPr>
-            <w:r>
-              <w:rPr>
-                <w:b/>
-                <w:bCs/>
-              </w:rPr>
+            </w:pPr>
+            <w:r>
               <w:t>Login</w:t>
             </w:r>
           </w:p>
@@ -2294,30 +2177,14 @@
           <w:p>
             <w:pPr>
               <w:spacing w:after="160" w:line="278" w:lineRule="auto"/>
-              <w:rPr>
-                <w:b/>
-                <w:bCs/>
-              </w:rPr>
-            </w:pPr>
-            <w:r>
-              <w:rPr>
-                <w:b/>
-                <w:bCs/>
-              </w:rPr>
+            </w:pPr>
+            <w:r>
               <w:t>As Jon, I would like to be able to log into my account to view my booking</w:t>
             </w:r>
             <w:r>
-              <w:rPr>
-                <w:b/>
-                <w:bCs/>
-              </w:rPr>
               <w:t xml:space="preserve"> data</w:t>
             </w:r>
             <w:r>
-              <w:rPr>
-                <w:b/>
-                <w:bCs/>
-              </w:rPr>
               <w:t xml:space="preserve"> so that I do not lose track of important booking details. </w:t>
             </w:r>
           </w:p>
@@ -2339,16 +2206,8 @@
                 <w:ilvl w:val="0"/>
                 <w:numId w:val="2"/>
               </w:numPr>
-              <w:rPr>
-                <w:b/>
-                <w:bCs/>
-              </w:rPr>
-            </w:pPr>
-            <w:r>
-              <w:rPr>
-                <w:b/>
-                <w:bCs/>
-              </w:rPr>
+            </w:pPr>
+            <w:r>
               <w:t>Provide the user with a functional login screen</w:t>
             </w:r>
           </w:p>
@@ -2359,16 +2218,8 @@
                 <w:ilvl w:val="0"/>
                 <w:numId w:val="2"/>
               </w:numPr>
-              <w:rPr>
-                <w:b/>
-                <w:bCs/>
-              </w:rPr>
-            </w:pPr>
-            <w:r>
-              <w:rPr>
-                <w:b/>
-                <w:bCs/>
-              </w:rPr>
+            </w:pPr>
+            <w:r>
               <w:t>Allow users to enter data into specified fields</w:t>
             </w:r>
           </w:p>
@@ -2379,16 +2230,8 @@
                 <w:ilvl w:val="0"/>
                 <w:numId w:val="2"/>
               </w:numPr>
-              <w:rPr>
-                <w:b/>
-                <w:bCs/>
-              </w:rPr>
-            </w:pPr>
-            <w:r>
-              <w:rPr>
-                <w:b/>
-                <w:bCs/>
-              </w:rPr>
+            </w:pPr>
+            <w:r>
               <w:t>Check that the data entered passes all validation checks</w:t>
             </w:r>
           </w:p>
@@ -2399,67 +2242,31 @@
                 <w:ilvl w:val="0"/>
                 <w:numId w:val="2"/>
               </w:numPr>
-              <w:rPr>
-                <w:b/>
-                <w:bCs/>
-              </w:rPr>
-            </w:pPr>
-            <w:r>
-              <w:rPr>
-                <w:b/>
-                <w:bCs/>
-              </w:rPr>
+            </w:pPr>
+            <w:r>
               <w:t xml:space="preserve">Check </w:t>
             </w:r>
             <w:r>
-              <w:rPr>
-                <w:b/>
-                <w:bCs/>
-              </w:rPr>
               <w:t>if</w:t>
             </w:r>
             <w:r>
-              <w:rPr>
-                <w:b/>
-                <w:bCs/>
-              </w:rPr>
               <w:t xml:space="preserve"> the </w:t>
             </w:r>
             <w:r>
-              <w:rPr>
-                <w:b/>
-                <w:bCs/>
-              </w:rPr>
               <w:t>account information</w:t>
             </w:r>
             <w:r>
-              <w:rPr>
-                <w:b/>
-                <w:bCs/>
-              </w:rPr>
               <w:t xml:space="preserve"> matches </w:t>
             </w:r>
             <w:r>
-              <w:rPr>
-                <w:b/>
-                <w:bCs/>
-              </w:rPr>
-              <w:t xml:space="preserve">any </w:t>
-            </w:r>
-            <w:r>
-              <w:rPr>
-                <w:b/>
-                <w:bCs/>
-              </w:rPr>
+              <w:t>any account data</w:t>
+            </w:r>
+            <w:r>
+              <w:t xml:space="preserve"> </w:t>
+            </w:r>
+            <w:r>
               <w:lastRenderedPageBreak/>
-              <w:t>account data</w:t>
-            </w:r>
-            <w:r>
-              <w:rPr>
-                <w:b/>
-                <w:bCs/>
-              </w:rPr>
-              <w:t xml:space="preserve"> saved onto the database</w:t>
+              <w:t>saved onto the database</w:t>
             </w:r>
           </w:p>
         </w:tc>
@@ -2476,40 +2283,16 @@
           <w:p>
             <w:pPr>
               <w:spacing w:after="160" w:line="278" w:lineRule="auto"/>
-              <w:rPr>
-                <w:b/>
-                <w:bCs/>
-              </w:rPr>
-            </w:pPr>
-            <w:r>
-              <w:rPr>
-                <w:b/>
-                <w:bCs/>
-              </w:rPr>
+            </w:pPr>
+            <w:r>
               <w:lastRenderedPageBreak/>
               <w:t xml:space="preserve">This feature will benefit the </w:t>
             </w:r>
             <w:r>
-              <w:rPr>
-                <w:b/>
-                <w:bCs/>
-              </w:rPr>
               <w:t>customer</w:t>
             </w:r>
             <w:r>
-              <w:rPr>
-                <w:b/>
-                <w:bCs/>
-              </w:rPr>
-              <w:t xml:space="preserve"> as it allows for users to sign into their accounts to update and view data about their bookings, and view information </w:t>
-            </w:r>
-            <w:r>
-              <w:rPr>
-                <w:b/>
-                <w:bCs/>
-              </w:rPr>
-              <w:lastRenderedPageBreak/>
-              <w:t xml:space="preserve">about room availability. </w:t>
+              <w:t xml:space="preserve"> as it allows for users to sign into their accounts to update and view data about their bookings, and view information about room availability. </w:t>
             </w:r>
           </w:p>
         </w:tc>
@@ -2531,25 +2314,9 @@
           <w:p>
             <w:pPr>
               <w:spacing w:after="160" w:line="278" w:lineRule="auto"/>
-              <w:rPr>
-                <w:b/>
-                <w:bCs/>
-              </w:rPr>
-            </w:pPr>
-            <w:r>
-              <w:rPr>
-                <w:b/>
-                <w:bCs/>
-              </w:rPr>
-              <w:lastRenderedPageBreak/>
-              <w:t>Create booking</w:t>
-            </w:r>
-            <w:r>
-              <w:rPr>
-                <w:b/>
-                <w:bCs/>
-              </w:rPr>
-              <w:t>s</w:t>
+            </w:pPr>
+            <w:r>
+              <w:t>Create bookings</w:t>
             </w:r>
           </w:p>
         </w:tc>
@@ -2566,30 +2333,14 @@
           <w:p>
             <w:pPr>
               <w:spacing w:after="160" w:line="278" w:lineRule="auto"/>
-              <w:rPr>
-                <w:b/>
-                <w:bCs/>
-              </w:rPr>
-            </w:pPr>
-            <w:r>
-              <w:rPr>
-                <w:b/>
-                <w:bCs/>
-              </w:rPr>
+            </w:pPr>
+            <w:r>
               <w:t xml:space="preserve">As Jon, I want to be able to create bookings through </w:t>
             </w:r>
             <w:r>
-              <w:rPr>
-                <w:b/>
-                <w:bCs/>
-              </w:rPr>
               <w:t xml:space="preserve">my </w:t>
             </w:r>
             <w:r>
-              <w:rPr>
-                <w:b/>
-                <w:bCs/>
-              </w:rPr>
               <w:t xml:space="preserve">account for simpler management of my data. </w:t>
             </w:r>
           </w:p>
@@ -2611,16 +2362,8 @@
                 <w:ilvl w:val="0"/>
                 <w:numId w:val="2"/>
               </w:numPr>
-              <w:rPr>
-                <w:b/>
-                <w:bCs/>
-              </w:rPr>
-            </w:pPr>
-            <w:r>
-              <w:rPr>
-                <w:b/>
-                <w:bCs/>
-              </w:rPr>
+            </w:pPr>
+            <w:r>
               <w:t>Provide user with a form-based page to enter booking details</w:t>
             </w:r>
           </w:p>
@@ -2631,24 +2374,9 @@
                 <w:ilvl w:val="0"/>
                 <w:numId w:val="2"/>
               </w:numPr>
-              <w:rPr>
-                <w:b/>
-                <w:bCs/>
-              </w:rPr>
-            </w:pPr>
-            <w:r>
-              <w:rPr>
-                <w:b/>
-                <w:bCs/>
-              </w:rPr>
-              <w:t>The solution should provide the user with an appropriate UI/UX to fit the user</w:t>
-            </w:r>
-            <w:r>
-              <w:rPr>
-                <w:b/>
-                <w:bCs/>
-              </w:rPr>
-              <w:t xml:space="preserve"> requirements</w:t>
+            </w:pPr>
+            <w:r>
+              <w:t>The solution should provide the user with an appropriate UI/UX to fit the user requirements</w:t>
             </w:r>
           </w:p>
           <w:p>
@@ -2658,16 +2386,8 @@
                 <w:ilvl w:val="0"/>
                 <w:numId w:val="2"/>
               </w:numPr>
-              <w:rPr>
-                <w:b/>
-                <w:bCs/>
-              </w:rPr>
-            </w:pPr>
-            <w:r>
-              <w:rPr>
-                <w:b/>
-                <w:bCs/>
-              </w:rPr>
+            </w:pPr>
+            <w:r>
               <w:t>Verify that the information entered is in the correct format</w:t>
             </w:r>
           </w:p>
@@ -2678,16 +2398,8 @@
                 <w:ilvl w:val="0"/>
                 <w:numId w:val="2"/>
               </w:numPr>
-              <w:rPr>
-                <w:b/>
-                <w:bCs/>
-              </w:rPr>
-            </w:pPr>
-            <w:r>
-              <w:rPr>
-                <w:b/>
-                <w:bCs/>
-              </w:rPr>
+            </w:pPr>
+            <w:r>
               <w:t>Check that the data entered passes all validation checks</w:t>
             </w:r>
           </w:p>
@@ -2705,30 +2417,14 @@
           <w:p>
             <w:pPr>
               <w:spacing w:after="160" w:line="278" w:lineRule="auto"/>
-              <w:rPr>
-                <w:b/>
-                <w:bCs/>
-              </w:rPr>
-            </w:pPr>
-            <w:r>
-              <w:rPr>
-                <w:b/>
-                <w:bCs/>
-              </w:rPr>
+            </w:pPr>
+            <w:r>
               <w:t xml:space="preserve">This feature will benefit the </w:t>
             </w:r>
             <w:r>
-              <w:rPr>
-                <w:b/>
-                <w:bCs/>
-              </w:rPr>
               <w:t>customer</w:t>
             </w:r>
             <w:r>
-              <w:rPr>
-                <w:b/>
-                <w:bCs/>
-              </w:rPr>
               <w:t xml:space="preserve"> as it allows for users to create bookings online rather than in-person allowing for a better automated process. </w:t>
             </w:r>
           </w:p>
@@ -2751,16 +2447,8 @@
           <w:p>
             <w:pPr>
               <w:spacing w:after="160" w:line="278" w:lineRule="auto"/>
-              <w:rPr>
-                <w:b/>
-                <w:bCs/>
-              </w:rPr>
-            </w:pPr>
-            <w:r>
-              <w:rPr>
-                <w:b/>
-                <w:bCs/>
-              </w:rPr>
+            </w:pPr>
+            <w:r>
               <w:t>View bookings</w:t>
             </w:r>
           </w:p>
@@ -2778,39 +2466,19 @@
           <w:p>
             <w:pPr>
               <w:spacing w:after="160" w:line="278" w:lineRule="auto"/>
-              <w:rPr>
-                <w:b/>
-                <w:bCs/>
-              </w:rPr>
-            </w:pPr>
-            <w:r>
-              <w:rPr>
-                <w:b/>
-                <w:bCs/>
-              </w:rPr>
+            </w:pPr>
+            <w:r>
               <w:t xml:space="preserve">As Jon, I want to be able to view my bookings via my account, so that everything is organised and in a clear format. </w:t>
             </w:r>
           </w:p>
           <w:p>
             <w:pPr>
               <w:spacing w:after="160" w:line="278" w:lineRule="auto"/>
-              <w:rPr>
-                <w:b/>
-                <w:bCs/>
-              </w:rPr>
-            </w:pPr>
-            <w:r>
-              <w:rPr>
-                <w:b/>
-                <w:bCs/>
-              </w:rPr>
+            </w:pPr>
+            <w:r>
               <w:t xml:space="preserve">As Sam, I want to be able to view bookings made by customers </w:t>
             </w:r>
             <w:r>
-              <w:rPr>
-                <w:b/>
-                <w:bCs/>
-              </w:rPr>
               <w:t xml:space="preserve">online so that this information is easier to manage. </w:t>
             </w:r>
           </w:p>
@@ -2832,24 +2500,9 @@
                 <w:ilvl w:val="0"/>
                 <w:numId w:val="2"/>
               </w:numPr>
-              <w:rPr>
-                <w:b/>
-                <w:bCs/>
-              </w:rPr>
-            </w:pPr>
-            <w:r>
-              <w:rPr>
-                <w:b/>
-                <w:bCs/>
-              </w:rPr>
-              <w:t>The solution should provide the user with an appropriate UI/UX to fit the user</w:t>
-            </w:r>
-            <w:r>
-              <w:rPr>
-                <w:b/>
-                <w:bCs/>
-              </w:rPr>
-              <w:t xml:space="preserve"> requirements</w:t>
+            </w:pPr>
+            <w:r>
+              <w:t>The solution should provide the user with an appropriate UI/UX to fit the user requirements</w:t>
             </w:r>
           </w:p>
           <w:p>
@@ -2859,16 +2512,8 @@
                 <w:ilvl w:val="0"/>
                 <w:numId w:val="2"/>
               </w:numPr>
-              <w:rPr>
-                <w:b/>
-                <w:bCs/>
-              </w:rPr>
-            </w:pPr>
-            <w:r>
-              <w:rPr>
-                <w:b/>
-                <w:bCs/>
-              </w:rPr>
+            </w:pPr>
+            <w:r>
               <w:t>Allow users to filter their bookings to display their data in a preferred format</w:t>
             </w:r>
           </w:p>
@@ -2886,62 +2531,26 @@
           <w:p>
             <w:pPr>
               <w:spacing w:after="160" w:line="278" w:lineRule="auto"/>
-              <w:rPr>
-                <w:b/>
-                <w:bCs/>
-              </w:rPr>
-            </w:pPr>
-            <w:r>
-              <w:rPr>
-                <w:b/>
-                <w:bCs/>
-              </w:rPr>
+            </w:pPr>
+            <w:r>
               <w:t xml:space="preserve">This feature will benefit the </w:t>
             </w:r>
             <w:r>
-              <w:rPr>
-                <w:b/>
-                <w:bCs/>
-              </w:rPr>
               <w:t>customer</w:t>
             </w:r>
             <w:r>
-              <w:rPr>
-                <w:b/>
-                <w:bCs/>
-              </w:rPr>
               <w:t xml:space="preserve"> as it will allow for users to view which booking they have previously made so they do not </w:t>
             </w:r>
             <w:r>
-              <w:rPr>
-                <w:b/>
-                <w:bCs/>
-              </w:rPr>
               <w:t>lose track of events.</w:t>
             </w:r>
           </w:p>
           <w:p>
             <w:pPr>
               <w:spacing w:after="160" w:line="278" w:lineRule="auto"/>
-              <w:rPr>
-                <w:b/>
-                <w:bCs/>
-              </w:rPr>
-            </w:pPr>
-            <w:r>
-              <w:rPr>
-                <w:b/>
-                <w:bCs/>
-              </w:rPr>
-              <w:t xml:space="preserve">This feature will be beneficial as it will allow staff to have a better overview of which slots </w:t>
-            </w:r>
-            <w:r>
-              <w:rPr>
-                <w:b/>
-                <w:bCs/>
-              </w:rPr>
-              <w:lastRenderedPageBreak/>
-              <w:t xml:space="preserve">have been booked/are unavailable.   </w:t>
+            </w:pPr>
+            <w:r>
+              <w:t xml:space="preserve">This feature will be beneficial as it will allow staff to have a better overview of which slots have been booked/are unavailable.   </w:t>
             </w:r>
           </w:p>
         </w:tc>
@@ -2963,16 +2572,8 @@
           <w:p>
             <w:pPr>
               <w:spacing w:after="160" w:line="278" w:lineRule="auto"/>
-              <w:rPr>
-                <w:b/>
-                <w:bCs/>
-              </w:rPr>
-            </w:pPr>
-            <w:r>
-              <w:rPr>
-                <w:b/>
-                <w:bCs/>
-              </w:rPr>
+            </w:pPr>
+            <w:r>
               <w:lastRenderedPageBreak/>
               <w:t>Manage bookings</w:t>
             </w:r>
@@ -2991,32 +2592,16 @@
           <w:p>
             <w:pPr>
               <w:spacing w:after="160" w:line="278" w:lineRule="auto"/>
-              <w:rPr>
-                <w:b/>
-                <w:bCs/>
-              </w:rPr>
-            </w:pPr>
-            <w:r>
-              <w:rPr>
-                <w:b/>
-                <w:bCs/>
-              </w:rPr>
+            </w:pPr>
+            <w:r>
               <w:t xml:space="preserve">As Sam, I would like to manage customer bookings so that I can confirm or deny customer requests. </w:t>
             </w:r>
           </w:p>
           <w:p>
             <w:pPr>
               <w:spacing w:after="160" w:line="278" w:lineRule="auto"/>
-              <w:rPr>
-                <w:b/>
-                <w:bCs/>
-              </w:rPr>
-            </w:pPr>
-            <w:r>
-              <w:rPr>
-                <w:b/>
-                <w:bCs/>
-              </w:rPr>
+            </w:pPr>
+            <w:r>
               <w:t xml:space="preserve">As Jon, I would like to be able to manage my personal bookings, so that I can delete or update information. </w:t>
             </w:r>
           </w:p>
@@ -3038,30 +2623,14 @@
                 <w:ilvl w:val="0"/>
                 <w:numId w:val="2"/>
               </w:numPr>
-              <w:rPr>
-                <w:b/>
-                <w:bCs/>
-              </w:rPr>
-            </w:pPr>
-            <w:r>
-              <w:rPr>
-                <w:b/>
-                <w:bCs/>
-              </w:rPr>
+            </w:pPr>
+            <w:r>
               <w:t>Provide users with an appropriate UI</w:t>
             </w:r>
             <w:r>
-              <w:rPr>
-                <w:b/>
-                <w:bCs/>
-              </w:rPr>
               <w:t xml:space="preserve">/UX </w:t>
             </w:r>
             <w:r>
-              <w:rPr>
-                <w:b/>
-                <w:bCs/>
-              </w:rPr>
               <w:t xml:space="preserve">to meet the user requirements </w:t>
             </w:r>
           </w:p>
@@ -3072,16 +2641,8 @@
                 <w:ilvl w:val="0"/>
                 <w:numId w:val="2"/>
               </w:numPr>
-              <w:rPr>
-                <w:b/>
-                <w:bCs/>
-              </w:rPr>
-            </w:pPr>
-            <w:r>
-              <w:rPr>
-                <w:b/>
-                <w:bCs/>
-              </w:rPr>
+            </w:pPr>
+            <w:r>
               <w:t>Staff should be able to manage bookings made by users and confirm or deny based on availability</w:t>
             </w:r>
           </w:p>
@@ -3092,23 +2653,11 @@
                 <w:ilvl w:val="0"/>
                 <w:numId w:val="2"/>
               </w:numPr>
-              <w:rPr>
-                <w:b/>
-                <w:bCs/>
-              </w:rPr>
-            </w:pPr>
-            <w:r>
-              <w:rPr>
-                <w:b/>
-                <w:bCs/>
-              </w:rPr>
+            </w:pPr>
+            <w:r>
               <w:t xml:space="preserve">Customers should be able to </w:t>
             </w:r>
             <w:r>
-              <w:rPr>
-                <w:b/>
-                <w:bCs/>
-              </w:rPr>
               <w:t xml:space="preserve">request to update information or cancel their bookings. </w:t>
             </w:r>
           </w:p>
@@ -3126,10 +2675,6 @@
           <w:p>
             <w:pPr>
               <w:spacing w:after="160" w:line="278" w:lineRule="auto"/>
-              <w:rPr>
-                <w:b/>
-                <w:bCs/>
-              </w:rPr>
             </w:pPr>
           </w:p>
         </w:tc>
@@ -3149,17 +2694,7 @@
             </w:tcBorders>
           </w:tcPr>
           <w:p>
-            <w:pPr>
-              <w:rPr>
-                <w:b/>
-                <w:bCs/>
-              </w:rPr>
-            </w:pPr>
-            <w:r>
-              <w:rPr>
-                <w:b/>
-                <w:bCs/>
-              </w:rPr>
+            <w:r>
               <w:t>Update room information</w:t>
             </w:r>
           </w:p>
@@ -3175,18 +2710,16 @@
             </w:tcBorders>
           </w:tcPr>
           <w:p>
-            <w:pPr>
-              <w:rPr>
-                <w:b/>
-                <w:bCs/>
-              </w:rPr>
-            </w:pPr>
-            <w:r>
-              <w:rPr>
-                <w:b/>
-                <w:bCs/>
-              </w:rPr>
-              <w:t xml:space="preserve">As Rebecca, I want to be able to update information about the rooms available so that the customers are up-to-date with our available services. </w:t>
+            <w:r>
+              <w:t xml:space="preserve">As Rebecca, I want to be able to update information about the rooms available so that the customers are </w:t>
+            </w:r>
+            <w:proofErr w:type="gramStart"/>
+            <w:r>
+              <w:t>up-to-date</w:t>
+            </w:r>
+            <w:proofErr w:type="gramEnd"/>
+            <w:r>
+              <w:t xml:space="preserve"> with our available services. </w:t>
             </w:r>
           </w:p>
         </w:tc>
@@ -3207,16 +2740,8 @@
                 <w:ilvl w:val="0"/>
                 <w:numId w:val="2"/>
               </w:numPr>
-              <w:rPr>
-                <w:b/>
-                <w:bCs/>
-              </w:rPr>
-            </w:pPr>
-            <w:r>
-              <w:rPr>
-                <w:b/>
-                <w:bCs/>
-              </w:rPr>
+            </w:pPr>
+            <w:r>
               <w:t>Provide verified users with a form-based page to edit room information</w:t>
             </w:r>
           </w:p>
@@ -3227,24 +2752,9 @@
                 <w:ilvl w:val="0"/>
                 <w:numId w:val="2"/>
               </w:numPr>
-              <w:rPr>
-                <w:b/>
-                <w:bCs/>
-              </w:rPr>
-            </w:pPr>
-            <w:r>
-              <w:rPr>
-                <w:b/>
-                <w:bCs/>
-              </w:rPr>
-              <w:t>The solution should provide the user with an appropriate UI/UX to fit the user</w:t>
-            </w:r>
-            <w:r>
-              <w:rPr>
-                <w:b/>
-                <w:bCs/>
-              </w:rPr>
-              <w:t xml:space="preserve"> requirements</w:t>
+            </w:pPr>
+            <w:r>
+              <w:t>The solution should provide the user with an appropriate UI/UX to fit the user requirements</w:t>
             </w:r>
           </w:p>
           <w:p>
@@ -3254,24 +2764,9 @@
                 <w:ilvl w:val="0"/>
                 <w:numId w:val="2"/>
               </w:numPr>
-              <w:rPr>
-                <w:b/>
-                <w:bCs/>
-              </w:rPr>
-            </w:pPr>
-            <w:r>
-              <w:rPr>
-                <w:b/>
-                <w:bCs/>
-              </w:rPr>
-              <w:t>Check that the data entered passes all validation checks</w:t>
-            </w:r>
-            <w:r>
-              <w:rPr>
-                <w:b/>
-                <w:bCs/>
-              </w:rPr>
-              <w:t xml:space="preserve"> </w:t>
+            </w:pPr>
+            <w:r>
+              <w:t xml:space="preserve">Check that the data entered passes all validation checks </w:t>
             </w:r>
           </w:p>
         </w:tc>
@@ -3285,14 +2780,7 @@
               <w:right w:val="single" w:sz="4" w:space="0" w:color="auto"/>
             </w:tcBorders>
           </w:tcPr>
-          <w:p>
-            <w:pPr>
-              <w:rPr>
-                <w:b/>
-                <w:bCs/>
-              </w:rPr>
-            </w:pPr>
-          </w:p>
+          <w:p/>
         </w:tc>
       </w:tr>
       <w:tr>
@@ -3310,17 +2798,7 @@
             </w:tcBorders>
           </w:tcPr>
           <w:p>
-            <w:pPr>
-              <w:rPr>
-                <w:b/>
-                <w:bCs/>
-              </w:rPr>
-            </w:pPr>
-            <w:r>
-              <w:rPr>
-                <w:b/>
-                <w:bCs/>
-              </w:rPr>
+            <w:r>
               <w:t>View available rooms</w:t>
             </w:r>
           </w:p>
@@ -3336,41 +2814,17 @@
             </w:tcBorders>
           </w:tcPr>
           <w:p>
-            <w:pPr>
-              <w:rPr>
-                <w:b/>
-                <w:bCs/>
-              </w:rPr>
-            </w:pPr>
-            <w:r>
-              <w:rPr>
-                <w:b/>
-                <w:bCs/>
-              </w:rPr>
-              <w:t xml:space="preserve">As Jon I want to be able to view the rooms available for me to book so that I </w:t>
-            </w:r>
-            <w:r>
-              <w:rPr>
-                <w:b/>
-                <w:bCs/>
-              </w:rPr>
+            <w:r>
+              <w:t xml:space="preserve">As Jon I want to be able to view the rooms available for me to book so that I can choose a room that is best suited to my needs. </w:t>
+            </w:r>
+          </w:p>
+          <w:p>
+            <w:r>
+              <w:t xml:space="preserve">As Sam, I would need to view the available rooms so that I can </w:t>
+            </w:r>
+            <w:r>
               <w:lastRenderedPageBreak/>
-              <w:t xml:space="preserve">can choose a room that is best suited to my needs. </w:t>
-            </w:r>
-          </w:p>
-          <w:p>
-            <w:pPr>
-              <w:rPr>
-                <w:b/>
-                <w:bCs/>
-              </w:rPr>
-            </w:pPr>
-            <w:r>
-              <w:rPr>
-                <w:b/>
-                <w:bCs/>
-              </w:rPr>
-              <w:t xml:space="preserve">As Sam, I would need to view the available rooms so that I can confirm or deny customer booking requests. </w:t>
+              <w:t xml:space="preserve">confirm or deny customer booking requests. </w:t>
             </w:r>
           </w:p>
         </w:tc>
@@ -3391,26 +2845,10 @@
                 <w:ilvl w:val="0"/>
                 <w:numId w:val="2"/>
               </w:numPr>
-              <w:rPr>
-                <w:b/>
-                <w:bCs/>
-              </w:rPr>
-            </w:pPr>
-            <w:r>
-              <w:rPr>
-                <w:b/>
-                <w:bCs/>
-              </w:rPr>
+            </w:pPr>
+            <w:r>
               <w:lastRenderedPageBreak/>
-              <w:t xml:space="preserve">The solution should provide the user with an appropriate UI/UX to fit the </w:t>
-            </w:r>
-            <w:r>
-              <w:rPr>
-                <w:b/>
-                <w:bCs/>
-              </w:rPr>
-              <w:lastRenderedPageBreak/>
-              <w:t>user requirements</w:t>
+              <w:t>The solution should provide the user with an appropriate UI/UX to fit the user requirements</w:t>
             </w:r>
           </w:p>
           <w:p>
@@ -3420,23 +2858,12 @@
                 <w:ilvl w:val="0"/>
                 <w:numId w:val="2"/>
               </w:numPr>
-              <w:rPr>
-                <w:b/>
-                <w:bCs/>
-              </w:rPr>
-            </w:pPr>
-            <w:r>
-              <w:rPr>
-                <w:b/>
-                <w:bCs/>
-              </w:rPr>
+            </w:pPr>
+            <w:r>
               <w:t xml:space="preserve">The user should be able to filter the available rooms to find rooms that fit </w:t>
             </w:r>
             <w:r>
-              <w:rPr>
-                <w:b/>
-                <w:bCs/>
-              </w:rPr>
+              <w:lastRenderedPageBreak/>
               <w:t>their specific needs</w:t>
             </w:r>
           </w:p>
@@ -3452,55 +2879,9 @@
             </w:tcBorders>
           </w:tcPr>
           <w:p>
-            <w:pPr>
-              <w:rPr>
-                <w:b/>
-                <w:bCs/>
-              </w:rPr>
-            </w:pPr>
-            <w:r>
-              <w:rPr>
-                <w:b/>
-                <w:bCs/>
-              </w:rPr>
+            <w:r>
               <w:lastRenderedPageBreak/>
-              <w:t xml:space="preserve">This feature will be beneficial as it will allow </w:t>
-            </w:r>
-            <w:r>
-              <w:rPr>
-                <w:b/>
-                <w:bCs/>
-              </w:rPr>
-              <w:t xml:space="preserve">all users </w:t>
-            </w:r>
-            <w:r>
-              <w:rPr>
-                <w:b/>
-                <w:bCs/>
-              </w:rPr>
-              <w:t xml:space="preserve">to have a </w:t>
-            </w:r>
-            <w:r>
-              <w:rPr>
-                <w:b/>
-                <w:bCs/>
-              </w:rPr>
-              <w:lastRenderedPageBreak/>
-              <w:t xml:space="preserve">better overview of which </w:t>
-            </w:r>
-            <w:r>
-              <w:rPr>
-                <w:b/>
-                <w:bCs/>
-              </w:rPr>
-              <w:t>rooms</w:t>
-            </w:r>
-            <w:r>
-              <w:rPr>
-                <w:b/>
-                <w:bCs/>
-              </w:rPr>
-              <w:t xml:space="preserve"> are available.   </w:t>
+              <w:t xml:space="preserve">This feature will be beneficial as it will allow all users to have a better overview of which rooms are available.   </w:t>
             </w:r>
           </w:p>
         </w:tc>
@@ -3520,18 +2901,7 @@
             </w:tcBorders>
           </w:tcPr>
           <w:p>
-            <w:pPr>
-              <w:rPr>
-                <w:b/>
-                <w:bCs/>
-              </w:rPr>
-            </w:pPr>
-            <w:r>
-              <w:rPr>
-                <w:b/>
-                <w:bCs/>
-              </w:rPr>
-              <w:lastRenderedPageBreak/>
+            <w:r>
               <w:t xml:space="preserve">Set Payment method </w:t>
             </w:r>
           </w:p>
@@ -3547,38 +2917,16 @@
             </w:tcBorders>
           </w:tcPr>
           <w:p>
-            <w:pPr>
-              <w:rPr>
-                <w:b/>
-                <w:bCs/>
-              </w:rPr>
-            </w:pPr>
-            <w:r>
-              <w:rPr>
-                <w:b/>
-                <w:bCs/>
-              </w:rPr>
+            <w:r>
               <w:t xml:space="preserve">As Jon, I want to set </w:t>
             </w:r>
             <w:r>
-              <w:rPr>
-                <w:b/>
-                <w:bCs/>
-              </w:rPr>
               <w:t xml:space="preserve">and save </w:t>
             </w:r>
             <w:r>
-              <w:rPr>
-                <w:b/>
-                <w:bCs/>
-              </w:rPr>
               <w:t xml:space="preserve">my payment method to book a room </w:t>
             </w:r>
             <w:r>
-              <w:rPr>
-                <w:b/>
-                <w:bCs/>
-              </w:rPr>
               <w:t>so that I have easier access when purchasing again in the future.</w:t>
             </w:r>
           </w:p>
@@ -3600,31 +2948,9 @@
                 <w:ilvl w:val="0"/>
                 <w:numId w:val="2"/>
               </w:numPr>
-              <w:rPr>
-                <w:b/>
-                <w:bCs/>
-              </w:rPr>
-            </w:pPr>
-            <w:r>
-              <w:rPr>
-                <w:b/>
-                <w:bCs/>
-              </w:rPr>
-              <w:t xml:space="preserve">Provide user with a form-based page to enter </w:t>
-            </w:r>
-            <w:r>
-              <w:rPr>
-                <w:b/>
-                <w:bCs/>
-              </w:rPr>
-              <w:t>payment</w:t>
-            </w:r>
-            <w:r>
-              <w:rPr>
-                <w:b/>
-                <w:bCs/>
-              </w:rPr>
-              <w:t xml:space="preserve"> details</w:t>
+            </w:pPr>
+            <w:r>
+              <w:t>Provide user with a form-based page to enter payment details</w:t>
             </w:r>
           </w:p>
           <w:p>
@@ -3634,24 +2960,9 @@
                 <w:ilvl w:val="0"/>
                 <w:numId w:val="2"/>
               </w:numPr>
-              <w:rPr>
-                <w:b/>
-                <w:bCs/>
-              </w:rPr>
-            </w:pPr>
-            <w:r>
-              <w:rPr>
-                <w:b/>
-                <w:bCs/>
-              </w:rPr>
-              <w:t>The solution should provide the user with an appropriate UI/UX to fit the user</w:t>
-            </w:r>
-            <w:r>
-              <w:rPr>
-                <w:b/>
-                <w:bCs/>
-              </w:rPr>
-              <w:t xml:space="preserve"> requirements </w:t>
+            </w:pPr>
+            <w:r>
+              <w:t xml:space="preserve">The solution should provide the user with an appropriate UI/UX to fit the user requirements </w:t>
             </w:r>
           </w:p>
           <w:p>
@@ -3661,16 +2972,8 @@
                 <w:ilvl w:val="0"/>
                 <w:numId w:val="2"/>
               </w:numPr>
-              <w:rPr>
-                <w:b/>
-                <w:bCs/>
-              </w:rPr>
-            </w:pPr>
-            <w:r>
-              <w:rPr>
-                <w:b/>
-                <w:bCs/>
-              </w:rPr>
+            </w:pPr>
+            <w:r>
               <w:t>Verify that the information entered is in the correct format</w:t>
             </w:r>
           </w:p>
@@ -3686,32 +2989,22 @@
             </w:tcBorders>
           </w:tcPr>
           <w:p>
-            <w:pPr>
-              <w:rPr>
-                <w:b/>
-                <w:bCs/>
-              </w:rPr>
-            </w:pPr>
-            <w:r>
-              <w:rPr>
-                <w:b/>
-                <w:bCs/>
-              </w:rPr>
+            <w:r>
               <w:t xml:space="preserve">This will be beneficial for the client as the function would allow for the user to </w:t>
             </w:r>
             <w:r>
-              <w:rPr>
-                <w:b/>
-                <w:bCs/>
-              </w:rPr>
               <w:t>set a</w:t>
             </w:r>
             <w:r>
-              <w:rPr>
-                <w:b/>
-                <w:bCs/>
-              </w:rPr>
-              <w:t xml:space="preserve"> payment method in order to make purchases through the solution instead of in person. </w:t>
+              <w:t xml:space="preserve"> payment method </w:t>
+            </w:r>
+            <w:proofErr w:type="gramStart"/>
+            <w:r>
+              <w:t>in order to</w:t>
+            </w:r>
+            <w:proofErr w:type="gramEnd"/>
+            <w:r>
+              <w:t xml:space="preserve"> make purchases through the solution instead of in person. </w:t>
             </w:r>
           </w:p>
         </w:tc>
@@ -3731,17 +3024,7 @@
             </w:tcBorders>
           </w:tcPr>
           <w:p>
-            <w:pPr>
-              <w:rPr>
-                <w:b/>
-                <w:bCs/>
-              </w:rPr>
-            </w:pPr>
-            <w:r>
-              <w:rPr>
-                <w:b/>
-                <w:bCs/>
-              </w:rPr>
+            <w:r>
               <w:t>Update payment method</w:t>
             </w:r>
           </w:p>
@@ -3757,17 +3040,7 @@
             </w:tcBorders>
           </w:tcPr>
           <w:p>
-            <w:pPr>
-              <w:rPr>
-                <w:b/>
-                <w:bCs/>
-              </w:rPr>
-            </w:pPr>
-            <w:r>
-              <w:rPr>
-                <w:b/>
-                <w:bCs/>
-              </w:rPr>
+            <w:r>
               <w:t xml:space="preserve">As Jon, I want to have the option to update or remove a payment option so that I can change my details if I need to in the future. </w:t>
             </w:r>
           </w:p>
@@ -3789,52 +3062,9 @@
                 <w:ilvl w:val="0"/>
                 <w:numId w:val="2"/>
               </w:numPr>
-              <w:rPr>
-                <w:b/>
-                <w:bCs/>
-              </w:rPr>
-            </w:pPr>
-            <w:r>
-              <w:rPr>
-                <w:b/>
-                <w:bCs/>
-              </w:rPr>
-              <w:t xml:space="preserve">Provide user with a form-based page to </w:t>
-            </w:r>
-            <w:r>
-              <w:rPr>
-                <w:b/>
-                <w:bCs/>
-              </w:rPr>
-              <w:t>update or delete</w:t>
-            </w:r>
-            <w:r>
-              <w:rPr>
-                <w:b/>
-                <w:bCs/>
-              </w:rPr>
-              <w:t xml:space="preserve"> </w:t>
-            </w:r>
-            <w:r>
-              <w:rPr>
-                <w:b/>
-                <w:bCs/>
-              </w:rPr>
-              <w:t>payment</w:t>
-            </w:r>
-            <w:r>
-              <w:rPr>
-                <w:b/>
-                <w:bCs/>
-              </w:rPr>
-              <w:t xml:space="preserve"> </w:t>
-            </w:r>
-            <w:r>
-              <w:rPr>
-                <w:b/>
-                <w:bCs/>
-              </w:rPr>
-              <w:t>methods</w:t>
+            </w:pPr>
+            <w:r>
+              <w:t>Provide user with a form-based page to update or delete payment methods</w:t>
             </w:r>
           </w:p>
           <w:p>
@@ -3844,16 +3074,8 @@
                 <w:ilvl w:val="0"/>
                 <w:numId w:val="2"/>
               </w:numPr>
-              <w:rPr>
-                <w:b/>
-                <w:bCs/>
-              </w:rPr>
-            </w:pPr>
-            <w:r>
-              <w:rPr>
-                <w:b/>
-                <w:bCs/>
-              </w:rPr>
+            </w:pPr>
+            <w:r>
               <w:t xml:space="preserve">The solution should provide the user with an appropriate UI/UX to fit the user requirements </w:t>
             </w:r>
           </w:p>
@@ -3864,16 +3086,8 @@
                 <w:ilvl w:val="0"/>
                 <w:numId w:val="2"/>
               </w:numPr>
-              <w:rPr>
-                <w:b/>
-                <w:bCs/>
-              </w:rPr>
-            </w:pPr>
-            <w:r>
-              <w:rPr>
-                <w:b/>
-                <w:bCs/>
-              </w:rPr>
+            </w:pPr>
+            <w:r>
               <w:t>Verify that the information entered is in the correct format</w:t>
             </w:r>
           </w:p>
@@ -3888,14 +3102,7 @@
               <w:right w:val="single" w:sz="4" w:space="0" w:color="auto"/>
             </w:tcBorders>
           </w:tcPr>
-          <w:p>
-            <w:pPr>
-              <w:rPr>
-                <w:b/>
-                <w:bCs/>
-              </w:rPr>
-            </w:pPr>
-          </w:p>
+          <w:p/>
         </w:tc>
       </w:tr>
       <w:tr>
@@ -3913,24 +3120,10 @@
             </w:tcBorders>
           </w:tcPr>
           <w:p>
-            <w:pPr>
-              <w:rPr>
-                <w:b/>
-                <w:bCs/>
-              </w:rPr>
-            </w:pPr>
-            <w:r>
-              <w:rPr>
-                <w:b/>
-                <w:bCs/>
-              </w:rPr>
+            <w:r>
               <w:t>View policies</w:t>
             </w:r>
             <w:r>
-              <w:rPr>
-                <w:b/>
-                <w:bCs/>
-              </w:rPr>
               <w:t xml:space="preserve"> and Staff details </w:t>
             </w:r>
           </w:p>
@@ -3946,56 +3139,24 @@
             </w:tcBorders>
           </w:tcPr>
           <w:p>
-            <w:pPr>
-              <w:rPr>
-                <w:b/>
-                <w:bCs/>
-              </w:rPr>
-            </w:pPr>
-            <w:r>
-              <w:rPr>
-                <w:b/>
-                <w:bCs/>
-              </w:rPr>
-              <w:t xml:space="preserve">As Jon, I want to be able to view </w:t>
-            </w:r>
-            <w:r>
-              <w:rPr>
-                <w:b/>
-                <w:bCs/>
-              </w:rPr>
+            <w:r>
+              <w:t xml:space="preserve">As Jon, I want to be able to view information about the staff so that I can speak to staff members who have more experience in specific situations. </w:t>
+            </w:r>
+          </w:p>
+          <w:p>
+            <w:r>
+              <w:t xml:space="preserve">As Rebecca, I would like to be able to view the </w:t>
+            </w:r>
+            <w:r>
               <w:lastRenderedPageBreak/>
-              <w:t xml:space="preserve">information about the staff so that I can speak to staff members who have more experience in specific situations. </w:t>
-            </w:r>
-          </w:p>
-          <w:p>
-            <w:pPr>
-              <w:rPr>
-                <w:b/>
-                <w:bCs/>
-              </w:rPr>
-            </w:pPr>
-            <w:r>
-              <w:rPr>
-                <w:b/>
-                <w:bCs/>
-              </w:rPr>
-              <w:t xml:space="preserve">As Rebecca, I would like to be able to view the booking policies online so that I can make sure that all customers are following the correct policies when booking with </w:t>
+              <w:t xml:space="preserve">booking policies online so that I can make sure that all customers are following the correct policies when booking with </w:t>
             </w:r>
             <w:proofErr w:type="spellStart"/>
             <w:r>
-              <w:rPr>
-                <w:b/>
-                <w:bCs/>
-              </w:rPr>
               <w:t>CityPoint</w:t>
             </w:r>
             <w:proofErr w:type="spellEnd"/>
             <w:r>
-              <w:rPr>
-                <w:b/>
-                <w:bCs/>
-              </w:rPr>
               <w:t xml:space="preserve"> Room Hire</w:t>
             </w:r>
           </w:p>
@@ -4017,26 +3178,10 @@
                 <w:ilvl w:val="0"/>
                 <w:numId w:val="2"/>
               </w:numPr>
-              <w:rPr>
-                <w:b/>
-                <w:bCs/>
-              </w:rPr>
-            </w:pPr>
-            <w:r>
-              <w:rPr>
-                <w:b/>
-                <w:bCs/>
-              </w:rPr>
+            </w:pPr>
+            <w:r>
               <w:lastRenderedPageBreak/>
-              <w:t xml:space="preserve">The solution should provide </w:t>
-            </w:r>
-            <w:r>
-              <w:rPr>
-                <w:b/>
-                <w:bCs/>
-              </w:rPr>
-              <w:lastRenderedPageBreak/>
-              <w:t xml:space="preserve">the user with an appropriate UI/UX to fit the user requirements </w:t>
+              <w:t xml:space="preserve">The solution should provide the user with an appropriate UI/UX to fit the user requirements </w:t>
             </w:r>
           </w:p>
           <w:p>
@@ -4046,16 +3191,8 @@
                 <w:ilvl w:val="0"/>
                 <w:numId w:val="2"/>
               </w:numPr>
-              <w:rPr>
-                <w:b/>
-                <w:bCs/>
-              </w:rPr>
-            </w:pPr>
-            <w:r>
-              <w:rPr>
-                <w:b/>
-                <w:bCs/>
-              </w:rPr>
+            </w:pPr>
+            <w:r>
               <w:t>Allow for quick access to policies – a button or link</w:t>
             </w:r>
           </w:p>
@@ -4066,16 +3203,9 @@
                 <w:ilvl w:val="0"/>
                 <w:numId w:val="2"/>
               </w:numPr>
-              <w:rPr>
-                <w:b/>
-                <w:bCs/>
-              </w:rPr>
-            </w:pPr>
-            <w:r>
-              <w:rPr>
-                <w:b/>
-                <w:bCs/>
-              </w:rPr>
+            </w:pPr>
+            <w:r>
+              <w:lastRenderedPageBreak/>
               <w:t>Display policies in a clear, readable format</w:t>
             </w:r>
           </w:p>
@@ -4086,27 +3216,12 @@
                 <w:ilvl w:val="0"/>
                 <w:numId w:val="2"/>
               </w:numPr>
-              <w:rPr>
-                <w:b/>
-                <w:bCs/>
-              </w:rPr>
-            </w:pPr>
-            <w:r>
-              <w:rPr>
-                <w:b/>
-                <w:bCs/>
-              </w:rPr>
+            </w:pPr>
+            <w:r>
               <w:t>Allow users to select staff profiles to view further information about staff</w:t>
             </w:r>
           </w:p>
-          <w:p>
-            <w:pPr>
-              <w:rPr>
-                <w:b/>
-                <w:bCs/>
-              </w:rPr>
-            </w:pPr>
-          </w:p>
+          <w:p/>
         </w:tc>
         <w:tc>
           <w:tcPr>
@@ -4118,14 +3233,7 @@
               <w:right w:val="single" w:sz="4" w:space="0" w:color="auto"/>
             </w:tcBorders>
           </w:tcPr>
-          <w:p>
-            <w:pPr>
-              <w:rPr>
-                <w:b/>
-                <w:bCs/>
-              </w:rPr>
-            </w:pPr>
-          </w:p>
+          <w:p/>
         </w:tc>
       </w:tr>
     </w:tbl>
@@ -4336,9 +3444,6 @@
             <w:r>
               <w:t>All pages should load within 15ms</w:t>
             </w:r>
-            <w:r>
-              <w:t>.</w:t>
-            </w:r>
           </w:p>
           <w:p>
             <w:pPr>
@@ -4349,7 +3454,74 @@
               </w:numPr>
             </w:pPr>
             <w:r>
-              <w:t>Over a large span of time, the load speed doesn’t drop below the 15ms target.</w:t>
+              <w:t>Over a large span of time, the load speed doesn’t drop below the 15ms target</w:t>
+            </w:r>
+          </w:p>
+        </w:tc>
+      </w:tr>
+      <w:tr>
+        <w:trPr>
+          <w:trHeight w:val="8"/>
+        </w:trPr>
+        <w:tc>
+          <w:tcPr>
+            <w:tcW w:w="2744" w:type="dxa"/>
+            <w:tcBorders>
+              <w:top w:val="single" w:sz="4" w:space="0" w:color="auto"/>
+              <w:left w:val="single" w:sz="4" w:space="0" w:color="auto"/>
+              <w:bottom w:val="single" w:sz="4" w:space="0" w:color="auto"/>
+              <w:right w:val="single" w:sz="4" w:space="0" w:color="auto"/>
+            </w:tcBorders>
+          </w:tcPr>
+          <w:p>
+            <w:r>
+              <w:t>The solution should have no issues with latency</w:t>
+            </w:r>
+          </w:p>
+        </w:tc>
+        <w:tc>
+          <w:tcPr>
+            <w:tcW w:w="2744" w:type="dxa"/>
+            <w:tcBorders>
+              <w:top w:val="single" w:sz="4" w:space="0" w:color="auto"/>
+              <w:left w:val="single" w:sz="4" w:space="0" w:color="auto"/>
+              <w:bottom w:val="single" w:sz="4" w:space="0" w:color="auto"/>
+              <w:right w:val="single" w:sz="4" w:space="0" w:color="auto"/>
+            </w:tcBorders>
+          </w:tcPr>
+          <w:p>
+            <w:pPr>
+              <w:pStyle w:val="ListParagraph"/>
+              <w:numPr>
+                <w:ilvl w:val="0"/>
+                <w:numId w:val="2"/>
+              </w:numPr>
+            </w:pPr>
+            <w:r>
+              <w:t>The users would not want pages stuttering as to reduce delay</w:t>
+            </w:r>
+          </w:p>
+        </w:tc>
+        <w:tc>
+          <w:tcPr>
+            <w:tcW w:w="2748" w:type="dxa"/>
+            <w:tcBorders>
+              <w:top w:val="single" w:sz="4" w:space="0" w:color="auto"/>
+              <w:left w:val="single" w:sz="4" w:space="0" w:color="auto"/>
+              <w:bottom w:val="single" w:sz="4" w:space="0" w:color="auto"/>
+              <w:right w:val="single" w:sz="4" w:space="0" w:color="auto"/>
+            </w:tcBorders>
+          </w:tcPr>
+          <w:p>
+            <w:pPr>
+              <w:pStyle w:val="ListParagraph"/>
+              <w:numPr>
+                <w:ilvl w:val="0"/>
+                <w:numId w:val="14"/>
+              </w:numPr>
+            </w:pPr>
+            <w:r>
+              <w:t>There should be no complaints over latency issues</w:t>
             </w:r>
           </w:p>
         </w:tc>
@@ -4473,7 +3645,7 @@
               <w:spacing w:after="160" w:line="278" w:lineRule="auto"/>
             </w:pPr>
             <w:r>
-              <w:t xml:space="preserve">User data should be encrypted before it is stored </w:t>
+              <w:t>The solution should keep user data encrypted</w:t>
             </w:r>
           </w:p>
         </w:tc>
@@ -4496,11 +3668,7 @@
               </w:numPr>
             </w:pPr>
             <w:r>
-              <w:t xml:space="preserve">Users may have private information saved onto their </w:t>
-            </w:r>
-            <w:r>
-              <w:lastRenderedPageBreak/>
-              <w:t>account such as their payment information</w:t>
+              <w:t>The solution should be secure so that customer data is not at risk of being accessed without a security key</w:t>
             </w:r>
           </w:p>
         </w:tc>
@@ -4523,11 +3691,7 @@
               </w:numPr>
             </w:pPr>
             <w:r>
-              <w:lastRenderedPageBreak/>
-              <w:t>There are no reports of privacy breaches</w:t>
-            </w:r>
-            <w:r>
-              <w:t xml:space="preserve"> </w:t>
+              <w:t>No reports of breaches of customer information within 3 years</w:t>
             </w:r>
           </w:p>
         </w:tc>
@@ -4546,6 +3710,77 @@
               <w:right w:val="single" w:sz="4" w:space="0" w:color="auto"/>
             </w:tcBorders>
           </w:tcPr>
+          <w:p>
+            <w:r>
+              <w:t xml:space="preserve">The solution should follow DPA and GDPR standards. </w:t>
+            </w:r>
+          </w:p>
+        </w:tc>
+        <w:tc>
+          <w:tcPr>
+            <w:tcW w:w="2744" w:type="dxa"/>
+            <w:tcBorders>
+              <w:top w:val="single" w:sz="4" w:space="0" w:color="auto"/>
+              <w:left w:val="single" w:sz="4" w:space="0" w:color="auto"/>
+              <w:bottom w:val="single" w:sz="4" w:space="0" w:color="auto"/>
+              <w:right w:val="single" w:sz="4" w:space="0" w:color="auto"/>
+            </w:tcBorders>
+          </w:tcPr>
+          <w:p>
+            <w:pPr>
+              <w:pStyle w:val="ListParagraph"/>
+              <w:numPr>
+                <w:ilvl w:val="0"/>
+                <w:numId w:val="2"/>
+              </w:numPr>
+            </w:pPr>
+            <w:r>
+              <w:t>Industry standards</w:t>
+            </w:r>
+          </w:p>
+        </w:tc>
+        <w:tc>
+          <w:tcPr>
+            <w:tcW w:w="2748" w:type="dxa"/>
+            <w:tcBorders>
+              <w:top w:val="single" w:sz="4" w:space="0" w:color="auto"/>
+              <w:left w:val="single" w:sz="4" w:space="0" w:color="auto"/>
+              <w:bottom w:val="single" w:sz="4" w:space="0" w:color="auto"/>
+              <w:right w:val="single" w:sz="4" w:space="0" w:color="auto"/>
+            </w:tcBorders>
+          </w:tcPr>
+          <w:p>
+            <w:pPr>
+              <w:pStyle w:val="ListParagraph"/>
+              <w:numPr>
+                <w:ilvl w:val="0"/>
+                <w:numId w:val="15"/>
+              </w:numPr>
+            </w:pPr>
+            <w:r>
+              <w:t xml:space="preserve">The solution is evaluated every month to ensure </w:t>
+            </w:r>
+            <w:r>
+              <w:lastRenderedPageBreak/>
+              <w:t xml:space="preserve">it is compliant with GDPR and DPA regulations </w:t>
+            </w:r>
+          </w:p>
+        </w:tc>
+      </w:tr>
+      <w:tr>
+        <w:trPr>
+          <w:trHeight w:val="8"/>
+        </w:trPr>
+        <w:tc>
+          <w:tcPr>
+            <w:tcW w:w="2744" w:type="dxa"/>
+            <w:tcBorders>
+              <w:top w:val="single" w:sz="4" w:space="0" w:color="auto"/>
+              <w:left w:val="single" w:sz="4" w:space="0" w:color="auto"/>
+              <w:bottom w:val="single" w:sz="4" w:space="0" w:color="auto"/>
+              <w:right w:val="single" w:sz="4" w:space="0" w:color="auto"/>
+            </w:tcBorders>
+          </w:tcPr>
           <w:p/>
         </w:tc>
         <w:tc>
@@ -4699,6 +3934,9 @@
             <w:pPr>
               <w:spacing w:after="160" w:line="278" w:lineRule="auto"/>
             </w:pPr>
+            <w:r>
+              <w:t>The solution should be able to handle a growing number of accounts created</w:t>
+            </w:r>
           </w:p>
         </w:tc>
         <w:tc>
@@ -4713,8 +3951,15 @@
           </w:tcPr>
           <w:p>
             <w:pPr>
-              <w:spacing w:after="160" w:line="278" w:lineRule="auto"/>
-            </w:pPr>
+              <w:pStyle w:val="ListParagraph"/>
+              <w:numPr>
+                <w:ilvl w:val="0"/>
+                <w:numId w:val="2"/>
+              </w:numPr>
+            </w:pPr>
+            <w:r>
+              <w:t>The solution should allow people to create accounts seamlessly so customers can use the services</w:t>
+            </w:r>
           </w:p>
         </w:tc>
         <w:tc>
@@ -4735,6 +3980,9 @@
                 <w:numId w:val="10"/>
               </w:numPr>
             </w:pPr>
+            <w:r>
+              <w:t xml:space="preserve">The account creation process must stay consistent even with a growing number of registered user accounts. </w:t>
+            </w:r>
           </w:p>
         </w:tc>
       </w:tr>
@@ -4856,6 +4104,9 @@
             <w:pPr>
               <w:spacing w:after="160" w:line="278" w:lineRule="auto"/>
             </w:pPr>
+            <w:r>
+              <w:t>The solution must be able to host a multitude of users at one time</w:t>
+            </w:r>
           </w:p>
         </w:tc>
         <w:tc>
@@ -4870,8 +4121,15 @@
           </w:tcPr>
           <w:p>
             <w:pPr>
-              <w:spacing w:after="160" w:line="278" w:lineRule="auto"/>
-            </w:pPr>
+              <w:pStyle w:val="ListParagraph"/>
+              <w:numPr>
+                <w:ilvl w:val="0"/>
+                <w:numId w:val="2"/>
+              </w:numPr>
+            </w:pPr>
+            <w:r>
+              <w:t>The solution should be able to host more than one user session at a time to allow for more web traffic</w:t>
+            </w:r>
           </w:p>
         </w:tc>
         <w:tc>
@@ -4892,6 +4150,9 @@
                 <w:numId w:val="9"/>
               </w:numPr>
             </w:pPr>
+            <w:r>
+              <w:t>The solution must be able to efficiently hold a minimum of 100 concurrent users</w:t>
+            </w:r>
           </w:p>
         </w:tc>
       </w:tr>
@@ -5014,7 +4275,10 @@
               <w:spacing w:after="160" w:line="278" w:lineRule="auto"/>
             </w:pPr>
             <w:r>
-              <w:t xml:space="preserve">The pages should consistently load within 15ms. </w:t>
+              <w:t>The solution must have backups</w:t>
+            </w:r>
+            <w:r>
+              <w:t xml:space="preserve"> </w:t>
             </w:r>
           </w:p>
         </w:tc>
@@ -5037,7 +4301,7 @@
               </w:numPr>
             </w:pPr>
             <w:r>
-              <w:t>The page should be able to consistently load at high speeds</w:t>
+              <w:t>The client would want data to be easily recoverable if it is lost</w:t>
             </w:r>
           </w:p>
         </w:tc>
@@ -5059,6 +4323,9 @@
                 <w:numId w:val="7"/>
               </w:numPr>
             </w:pPr>
+            <w:r>
+              <w:t>Code should be backed up daily</w:t>
+            </w:r>
           </w:p>
         </w:tc>
       </w:tr>
@@ -5100,6 +4367,9 @@
                 <w:numId w:val="2"/>
               </w:numPr>
             </w:pPr>
+            <w:r>
+              <w:t>Users would not want the website to crash while they are purchasing a booking, so they do not lose a booking slot</w:t>
+            </w:r>
           </w:p>
         </w:tc>
         <w:tc>
@@ -5120,6 +4390,9 @@
                 <w:numId w:val="8"/>
               </w:numPr>
             </w:pPr>
+            <w:r>
+              <w:t>No complaints of downtime for more than 45 minutes per year</w:t>
+            </w:r>
           </w:p>
         </w:tc>
       </w:tr>
@@ -5153,6 +4426,7 @@
                 <w:b/>
                 <w:bCs/>
               </w:rPr>
+              <w:lastRenderedPageBreak/>
               <w:t>Usability</w:t>
             </w:r>
           </w:p>
@@ -5258,8 +4532,15 @@
           </w:tcPr>
           <w:p>
             <w:pPr>
-              <w:spacing w:after="160" w:line="278" w:lineRule="auto"/>
-            </w:pPr>
+              <w:pStyle w:val="ListParagraph"/>
+              <w:numPr>
+                <w:ilvl w:val="0"/>
+                <w:numId w:val="2"/>
+              </w:numPr>
+            </w:pPr>
+            <w:r>
+              <w:t>The user would not want to spend a long time searching for a specific function</w:t>
+            </w:r>
           </w:p>
         </w:tc>
         <w:tc>
@@ -5280,6 +4561,9 @@
                 <w:numId w:val="12"/>
               </w:numPr>
             </w:pPr>
+            <w:r>
+              <w:t>Minimum complaints of the website being difficult to navigate</w:t>
+            </w:r>
           </w:p>
         </w:tc>
       </w:tr>
@@ -5313,7 +4597,18 @@
               <w:right w:val="single" w:sz="4" w:space="0" w:color="auto"/>
             </w:tcBorders>
           </w:tcPr>
-          <w:p/>
+          <w:p>
+            <w:pPr>
+              <w:pStyle w:val="ListParagraph"/>
+              <w:numPr>
+                <w:ilvl w:val="0"/>
+                <w:numId w:val="2"/>
+              </w:numPr>
+            </w:pPr>
+            <w:r>
+              <w:t xml:space="preserve">The user would want the webpage to be clear and easy to understand </w:t>
+            </w:r>
+          </w:p>
         </w:tc>
         <w:tc>
           <w:tcPr>
@@ -5333,6 +4628,9 @@
                 <w:numId w:val="13"/>
               </w:numPr>
             </w:pPr>
+            <w:r>
+              <w:t>Ensure that the webpage has easy to see/read content</w:t>
+            </w:r>
           </w:p>
         </w:tc>
       </w:tr>
@@ -5455,7 +4753,6 @@
               <w:spacing w:after="160" w:line="278" w:lineRule="auto"/>
             </w:pPr>
             <w:r>
-              <w:lastRenderedPageBreak/>
               <w:t>The user should be able to switch the languages used on the solution</w:t>
             </w:r>
           </w:p>
@@ -5625,6 +4922,83 @@
       <w:bookmarkEnd w:id="13"/>
     </w:p>
     <w:p>
+      <w:r>
+        <w:rPr>
+          <w:b/>
+          <w:bCs/>
+        </w:rPr>
+        <w:t>Risk:</w:t>
+      </w:r>
+      <w:r>
+        <w:t xml:space="preserve"> An attacker may use SQL injection to gain unauthorised access to the database.</w:t>
+      </w:r>
+    </w:p>
+    <w:p>
+      <w:r>
+        <w:rPr>
+          <w:b/>
+          <w:bCs/>
+        </w:rPr>
+        <w:t>Mitigation:</w:t>
+      </w:r>
+    </w:p>
+    <w:p>
+      <w:r>
+        <w:rPr>
+          <w:b/>
+          <w:bCs/>
+        </w:rPr>
+        <w:lastRenderedPageBreak/>
+        <w:t>Risk:</w:t>
+      </w:r>
+      <w:r>
+        <w:t xml:space="preserve"> An attacker may </w:t>
+      </w:r>
+      <w:r>
+        <w:t>attempt</w:t>
+      </w:r>
+      <w:r>
+        <w:t xml:space="preserve"> to use a Man-In-The-Middle (MITM) attack to phish for unencrypted credentials.</w:t>
+      </w:r>
+    </w:p>
+    <w:p>
+      <w:r>
+        <w:rPr>
+          <w:b/>
+          <w:bCs/>
+        </w:rPr>
+        <w:t>Mitigation:</w:t>
+      </w:r>
+      <w:r>
+        <w:t xml:space="preserve"> </w:t>
+      </w:r>
+    </w:p>
+    <w:p>
+      <w:r>
+        <w:rPr>
+          <w:b/>
+          <w:bCs/>
+        </w:rPr>
+        <w:t>Risk:</w:t>
+      </w:r>
+      <w:r>
+        <w:t xml:space="preserve"> An attacker may DDoS the solution.</w:t>
+      </w:r>
+    </w:p>
+    <w:p>
+      <w:r>
+        <w:rPr>
+          <w:b/>
+          <w:bCs/>
+        </w:rPr>
+        <w:t>Mitigation:</w:t>
+      </w:r>
+      <w:r>
+        <w:t xml:space="preserve"> </w:t>
+      </w:r>
+    </w:p>
+    <w:p/>
+    <w:p>
       <w:pPr>
         <w:pStyle w:val="Heading1"/>
       </w:pPr>
@@ -5634,6 +5008,7 @@
       </w:r>
       <w:bookmarkEnd w:id="14"/>
     </w:p>
+    <w:p/>
     <w:p>
       <w:pPr>
         <w:pStyle w:val="Heading1"/>
@@ -5643,6 +5018,24 @@
         <w:t>Legal</w:t>
       </w:r>
       <w:bookmarkEnd w:id="15"/>
+    </w:p>
+    <w:p>
+      <w:r>
+        <w:t xml:space="preserve">WCAG - </w:t>
+      </w:r>
+      <w:r>
+        <w:t>Web Content Accessibility Guidelines </w:t>
+      </w:r>
+    </w:p>
+    <w:p>
+      <w:r>
+        <w:t>GDPR – General Data Protection Regulations</w:t>
+      </w:r>
+    </w:p>
+    <w:p>
+      <w:r>
+        <w:t>DPA – Data Protection Act</w:t>
+      </w:r>
     </w:p>
     <w:sectPr>
       <w:pgSz w:w="11906" w:h="16838"/>
@@ -5657,8 +5050,97 @@
 </file>
 
 <file path=word/numbering.xml><?xml version="1.0" encoding="utf-8"?>
-<w:numbering xmlns:wpc="http://schemas.microsoft.com/office/word/2010/wordprocessingCanvas" xmlns:cx="http://schemas.microsoft.com/office/drawing/2014/chartex" xmlns:cx1="http://schemas.microsoft.com/office/drawing/2015/9/8/chartex" xmlns:cx2="http://schemas.microsoft.com/office/drawing/2015/10/21/chartex" xmlns:cx3="http://schemas.microsoft.com/office/drawing/2016/5/9/chartex" xmlns:cx4="http://schemas.microsoft.com/office/drawing/2016/5/10/chartex" xmlns:cx5="http://schemas.microsoft.com/office/drawing/2016/5/11/chartex" xmlns:cx6="http://schemas.microsoft.com/office/drawing/2016/5/12/chartex" xmlns:cx7="http://schemas.microsoft.com/office/drawing/2016/5/13/chartex" xmlns:cx8="http://schemas.microsoft.com/office/drawing/2016/5/14/chartex" xmlns:mc="http://schemas.openxmlformats.org/markup-compatibility/2006" xmlns:aink="http://schemas.microsoft.com/office/drawing/2016/ink" xmlns:am3d="http://schemas.microsoft.com/office/drawing/2017/model3d" xmlns:o="urn:schemas-microsoft-com:office:office" xmlns:oel="http://schemas.microsoft.com/office/2019/extlst" xmlns:r="http://schemas.openxmlformats.org/officeDocument/2006/relationships" xmlns:m="http://schemas.openxmlformats.org/officeDocument/2006/math" xmlns:v="urn:schemas-microsoft-com:vml" xmlns:wp14="http://schemas.microsoft.com/office/word/2010/wordprocessingDrawing" xmlns:wp="http://schemas.openxmlformats.org/drawingml/2006/wordprocessingDrawing" xmlns:w10="urn:schemas-microsoft-com:office:word" xmlns:w="http://schemas.openxmlformats.org/wordprocessingml/2006/main" xmlns:w14="http://schemas.microsoft.com/office/word/2010/wordml" xmlns:w15="http://schemas.microsoft.com/office/word/2012/wordml" xmlns:w16cex="http://schemas.microsoft.com/office/word/2018/wordml/cex" xmlns:w16cid="http://schemas.microsoft.com/office/word/2016/wordml/cid" xmlns:w16="http://schemas.microsoft.com/office/word/2018/wordml" xmlns:w16sdtdh="http://schemas.microsoft.com/office/word/2020/wordml/sdtdatahash" xmlns:w16se="http://schemas.microsoft.com/office/word/2015/wordml/symex" xmlns:wpg="http://schemas.microsoft.com/office/word/2010/wordprocessingGroup" xmlns:wpi="http://schemas.microsoft.com/office/word/2010/wordprocessingInk" xmlns:wne="http://schemas.microsoft.com/office/word/2006/wordml" xmlns:wps="http://schemas.microsoft.com/office/word/2010/wordprocessingShape" mc:Ignorable="w14 w15 w16se w16cid w16 w16cex w16sdtdh wp14">
+<w:numbering xmlns:wpc="http://schemas.microsoft.com/office/word/2010/wordprocessingCanvas" xmlns:cx="http://schemas.microsoft.com/office/drawing/2014/chartex" xmlns:cx1="http://schemas.microsoft.com/office/drawing/2015/9/8/chartex" xmlns:cx2="http://schemas.microsoft.com/office/drawing/2015/10/21/chartex" xmlns:cx3="http://schemas.microsoft.com/office/drawing/2016/5/9/chartex" xmlns:cx4="http://schemas.microsoft.com/office/drawing/2016/5/10/chartex" xmlns:cx5="http://schemas.microsoft.com/office/drawing/2016/5/11/chartex" xmlns:cx6="http://schemas.microsoft.com/office/drawing/2016/5/12/chartex" xmlns:cx7="http://schemas.microsoft.com/office/drawing/2016/5/13/chartex" xmlns:cx8="http://schemas.microsoft.com/office/drawing/2016/5/14/chartex" xmlns:mc="http://schemas.openxmlformats.org/markup-compatibility/2006" xmlns:aink="http://schemas.microsoft.com/office/drawing/2016/ink" xmlns:am3d="http://schemas.microsoft.com/office/drawing/2017/model3d" xmlns:o="urn:schemas-microsoft-com:office:office" xmlns:oel="http://schemas.microsoft.com/office/2019/extlst" xmlns:r="http://schemas.openxmlformats.org/officeDocument/2006/relationships" xmlns:m="http://schemas.openxmlformats.org/officeDocument/2006/math" xmlns:v="urn:schemas-microsoft-com:vml" xmlns:wp14="http://schemas.microsoft.com/office/word/2010/wordprocessingDrawing" xmlns:wp="http://schemas.openxmlformats.org/drawingml/2006/wordprocessingDrawing" xmlns:w10="urn:schemas-microsoft-com:office:word" xmlns:w="http://schemas.openxmlformats.org/wordprocessingml/2006/main" xmlns:w14="http://schemas.microsoft.com/office/word/2010/wordml" xmlns:w15="http://schemas.microsoft.com/office/word/2012/wordml" xmlns:w16cex="http://schemas.microsoft.com/office/word/2018/wordml/cex" xmlns:w16cid="http://schemas.microsoft.com/office/word/2016/wordml/cid" xmlns:w16="http://schemas.microsoft.com/office/word/2018/wordml" xmlns:w16du="http://schemas.microsoft.com/office/word/2023/wordml/word16du" xmlns:w16sdtdh="http://schemas.microsoft.com/office/word/2020/wordml/sdtdatahash" xmlns:w16sdtfl="http://schemas.microsoft.com/office/word/2024/wordml/sdtformatlock" xmlns:w16se="http://schemas.microsoft.com/office/word/2015/wordml/symex" xmlns:wpg="http://schemas.microsoft.com/office/word/2010/wordprocessingGroup" xmlns:wpi="http://schemas.microsoft.com/office/word/2010/wordprocessingInk" xmlns:wne="http://schemas.microsoft.com/office/word/2006/wordml" xmlns:wps="http://schemas.microsoft.com/office/word/2010/wordprocessingShape" mc:Ignorable="w14 w15 w16se w16cid w16 w16cex w16sdtdh w16sdtfl w16du wp14">
   <w:abstractNum w:abstractNumId="0" w15:restartNumberingAfterBreak="0">
+    <w:nsid w:val="07267E38"/>
+    <w:multiLevelType w:val="hybridMultilevel"/>
+    <w:tmpl w:val="34AC3658"/>
+    <w:lvl w:ilvl="0" w:tplc="0809000F">
+      <w:start w:val="1"/>
+      <w:numFmt w:val="decimal"/>
+      <w:lvlText w:val="%1."/>
+      <w:lvlJc w:val="left"/>
+      <w:pPr>
+        <w:ind w:left="720" w:hanging="360"/>
+      </w:pPr>
+      <w:rPr>
+        <w:rFonts w:hint="default"/>
+      </w:rPr>
+    </w:lvl>
+    <w:lvl w:ilvl="1" w:tplc="08090019" w:tentative="1">
+      <w:start w:val="1"/>
+      <w:numFmt w:val="lowerLetter"/>
+      <w:lvlText w:val="%2."/>
+      <w:lvlJc w:val="left"/>
+      <w:pPr>
+        <w:ind w:left="1440" w:hanging="360"/>
+      </w:pPr>
+    </w:lvl>
+    <w:lvl w:ilvl="2" w:tplc="0809001B" w:tentative="1">
+      <w:start w:val="1"/>
+      <w:numFmt w:val="lowerRoman"/>
+      <w:lvlText w:val="%3."/>
+      <w:lvlJc w:val="right"/>
+      <w:pPr>
+        <w:ind w:left="2160" w:hanging="180"/>
+      </w:pPr>
+    </w:lvl>
+    <w:lvl w:ilvl="3" w:tplc="0809000F" w:tentative="1">
+      <w:start w:val="1"/>
+      <w:numFmt w:val="decimal"/>
+      <w:lvlText w:val="%4."/>
+      <w:lvlJc w:val="left"/>
+      <w:pPr>
+        <w:ind w:left="2880" w:hanging="360"/>
+      </w:pPr>
+    </w:lvl>
+    <w:lvl w:ilvl="4" w:tplc="08090019" w:tentative="1">
+      <w:start w:val="1"/>
+      <w:numFmt w:val="lowerLetter"/>
+      <w:lvlText w:val="%5."/>
+      <w:lvlJc w:val="left"/>
+      <w:pPr>
+        <w:ind w:left="3600" w:hanging="360"/>
+      </w:pPr>
+    </w:lvl>
+    <w:lvl w:ilvl="5" w:tplc="0809001B" w:tentative="1">
+      <w:start w:val="1"/>
+      <w:numFmt w:val="lowerRoman"/>
+      <w:lvlText w:val="%6."/>
+      <w:lvlJc w:val="right"/>
+      <w:pPr>
+        <w:ind w:left="4320" w:hanging="180"/>
+      </w:pPr>
+    </w:lvl>
+    <w:lvl w:ilvl="6" w:tplc="0809000F" w:tentative="1">
+      <w:start w:val="1"/>
+      <w:numFmt w:val="decimal"/>
+      <w:lvlText w:val="%7."/>
+      <w:lvlJc w:val="left"/>
+      <w:pPr>
+        <w:ind w:left="5040" w:hanging="360"/>
+      </w:pPr>
+    </w:lvl>
+    <w:lvl w:ilvl="7" w:tplc="08090019" w:tentative="1">
+      <w:start w:val="1"/>
+      <w:numFmt w:val="lowerLetter"/>
+      <w:lvlText w:val="%8."/>
+      <w:lvlJc w:val="left"/>
+      <w:pPr>
+        <w:ind w:left="5760" w:hanging="360"/>
+      </w:pPr>
+    </w:lvl>
+    <w:lvl w:ilvl="8" w:tplc="0809001B" w:tentative="1">
+      <w:start w:val="1"/>
+      <w:numFmt w:val="lowerRoman"/>
+      <w:lvlText w:val="%9."/>
+      <w:lvlJc w:val="right"/>
+      <w:pPr>
+        <w:ind w:left="6480" w:hanging="180"/>
+      </w:pPr>
+    </w:lvl>
+  </w:abstractNum>
+  <w:abstractNum w:abstractNumId="1" w15:restartNumberingAfterBreak="0">
     <w:nsid w:val="0A16324C"/>
     <w:multiLevelType w:val="hybridMultilevel"/>
     <w:tmpl w:val="1294FA92"/>
@@ -5770,7 +5252,7 @@
       </w:rPr>
     </w:lvl>
   </w:abstractNum>
-  <w:abstractNum w:abstractNumId="1" w15:restartNumberingAfterBreak="0">
+  <w:abstractNum w:abstractNumId="2" w15:restartNumberingAfterBreak="0">
     <w:nsid w:val="25C35E33"/>
     <w:multiLevelType w:val="hybridMultilevel"/>
     <w:tmpl w:val="A7AAADE4"/>
@@ -5859,7 +5341,7 @@
       </w:pPr>
     </w:lvl>
   </w:abstractNum>
-  <w:abstractNum w:abstractNumId="2" w15:restartNumberingAfterBreak="0">
+  <w:abstractNum w:abstractNumId="3" w15:restartNumberingAfterBreak="0">
     <w:nsid w:val="2AA37793"/>
     <w:multiLevelType w:val="hybridMultilevel"/>
     <w:tmpl w:val="A1E67B76"/>
@@ -5948,7 +5430,7 @@
       </w:pPr>
     </w:lvl>
   </w:abstractNum>
-  <w:abstractNum w:abstractNumId="3" w15:restartNumberingAfterBreak="0">
+  <w:abstractNum w:abstractNumId="4" w15:restartNumberingAfterBreak="0">
     <w:nsid w:val="2DE60F44"/>
     <w:multiLevelType w:val="hybridMultilevel"/>
     <w:tmpl w:val="AB52FD5A"/>
@@ -6037,7 +5519,7 @@
       </w:pPr>
     </w:lvl>
   </w:abstractNum>
-  <w:abstractNum w:abstractNumId="4" w15:restartNumberingAfterBreak="0">
+  <w:abstractNum w:abstractNumId="5" w15:restartNumberingAfterBreak="0">
     <w:nsid w:val="2F8B2599"/>
     <w:multiLevelType w:val="hybridMultilevel"/>
     <w:tmpl w:val="A49C6626"/>
@@ -6149,7 +5631,120 @@
       </w:rPr>
     </w:lvl>
   </w:abstractNum>
-  <w:abstractNum w:abstractNumId="5" w15:restartNumberingAfterBreak="0">
+  <w:abstractNum w:abstractNumId="6" w15:restartNumberingAfterBreak="0">
+    <w:nsid w:val="3A8E156A"/>
+    <w:multiLevelType w:val="multilevel"/>
+    <w:tmpl w:val="8AE84F1C"/>
+    <w:lvl w:ilvl="0">
+      <w:start w:val="1"/>
+      <w:numFmt w:val="decimal"/>
+      <w:lvlText w:val="%1."/>
+      <w:lvlJc w:val="left"/>
+      <w:pPr>
+        <w:tabs>
+          <w:tab w:val="num" w:pos="720"/>
+        </w:tabs>
+        <w:ind w:left="720" w:hanging="360"/>
+      </w:pPr>
+    </w:lvl>
+    <w:lvl w:ilvl="1" w:tentative="1">
+      <w:start w:val="1"/>
+      <w:numFmt w:val="decimal"/>
+      <w:lvlText w:val="%2."/>
+      <w:lvlJc w:val="left"/>
+      <w:pPr>
+        <w:tabs>
+          <w:tab w:val="num" w:pos="1440"/>
+        </w:tabs>
+        <w:ind w:left="1440" w:hanging="360"/>
+      </w:pPr>
+    </w:lvl>
+    <w:lvl w:ilvl="2" w:tentative="1">
+      <w:start w:val="1"/>
+      <w:numFmt w:val="decimal"/>
+      <w:lvlText w:val="%3."/>
+      <w:lvlJc w:val="left"/>
+      <w:pPr>
+        <w:tabs>
+          <w:tab w:val="num" w:pos="2160"/>
+        </w:tabs>
+        <w:ind w:left="2160" w:hanging="360"/>
+      </w:pPr>
+    </w:lvl>
+    <w:lvl w:ilvl="3" w:tentative="1">
+      <w:start w:val="1"/>
+      <w:numFmt w:val="decimal"/>
+      <w:lvlText w:val="%4."/>
+      <w:lvlJc w:val="left"/>
+      <w:pPr>
+        <w:tabs>
+          <w:tab w:val="num" w:pos="2880"/>
+        </w:tabs>
+        <w:ind w:left="2880" w:hanging="360"/>
+      </w:pPr>
+    </w:lvl>
+    <w:lvl w:ilvl="4" w:tentative="1">
+      <w:start w:val="1"/>
+      <w:numFmt w:val="decimal"/>
+      <w:lvlText w:val="%5."/>
+      <w:lvlJc w:val="left"/>
+      <w:pPr>
+        <w:tabs>
+          <w:tab w:val="num" w:pos="3600"/>
+        </w:tabs>
+        <w:ind w:left="3600" w:hanging="360"/>
+      </w:pPr>
+    </w:lvl>
+    <w:lvl w:ilvl="5" w:tentative="1">
+      <w:start w:val="1"/>
+      <w:numFmt w:val="decimal"/>
+      <w:lvlText w:val="%6."/>
+      <w:lvlJc w:val="left"/>
+      <w:pPr>
+        <w:tabs>
+          <w:tab w:val="num" w:pos="4320"/>
+        </w:tabs>
+        <w:ind w:left="4320" w:hanging="360"/>
+      </w:pPr>
+    </w:lvl>
+    <w:lvl w:ilvl="6" w:tentative="1">
+      <w:start w:val="1"/>
+      <w:numFmt w:val="decimal"/>
+      <w:lvlText w:val="%7."/>
+      <w:lvlJc w:val="left"/>
+      <w:pPr>
+        <w:tabs>
+          <w:tab w:val="num" w:pos="5040"/>
+        </w:tabs>
+        <w:ind w:left="5040" w:hanging="360"/>
+      </w:pPr>
+    </w:lvl>
+    <w:lvl w:ilvl="7" w:tentative="1">
+      <w:start w:val="1"/>
+      <w:numFmt w:val="decimal"/>
+      <w:lvlText w:val="%8."/>
+      <w:lvlJc w:val="left"/>
+      <w:pPr>
+        <w:tabs>
+          <w:tab w:val="num" w:pos="5760"/>
+        </w:tabs>
+        <w:ind w:left="5760" w:hanging="360"/>
+      </w:pPr>
+    </w:lvl>
+    <w:lvl w:ilvl="8" w:tentative="1">
+      <w:start w:val="1"/>
+      <w:numFmt w:val="decimal"/>
+      <w:lvlText w:val="%9."/>
+      <w:lvlJc w:val="left"/>
+      <w:pPr>
+        <w:tabs>
+          <w:tab w:val="num" w:pos="6480"/>
+        </w:tabs>
+        <w:ind w:left="6480" w:hanging="360"/>
+      </w:pPr>
+    </w:lvl>
+  </w:abstractNum>
+  <w:abstractNum w:abstractNumId="7" w15:restartNumberingAfterBreak="0">
     <w:nsid w:val="3D995B35"/>
     <w:multiLevelType w:val="hybridMultilevel"/>
     <w:tmpl w:val="5D669ABE"/>
@@ -6238,7 +5833,96 @@
       </w:pPr>
     </w:lvl>
   </w:abstractNum>
-  <w:abstractNum w:abstractNumId="6" w15:restartNumberingAfterBreak="0">
+  <w:abstractNum w:abstractNumId="8" w15:restartNumberingAfterBreak="0">
+    <w:nsid w:val="40BA6999"/>
+    <w:multiLevelType w:val="hybridMultilevel"/>
+    <w:tmpl w:val="18086D3C"/>
+    <w:lvl w:ilvl="0" w:tplc="0809000F">
+      <w:start w:val="1"/>
+      <w:numFmt w:val="decimal"/>
+      <w:lvlText w:val="%1."/>
+      <w:lvlJc w:val="left"/>
+      <w:pPr>
+        <w:ind w:left="720" w:hanging="360"/>
+      </w:pPr>
+      <w:rPr>
+        <w:rFonts w:hint="default"/>
+      </w:rPr>
+    </w:lvl>
+    <w:lvl w:ilvl="1" w:tplc="08090019" w:tentative="1">
+      <w:start w:val="1"/>
+      <w:numFmt w:val="lowerLetter"/>
+      <w:lvlText w:val="%2."/>
+      <w:lvlJc w:val="left"/>
+      <w:pPr>
+        <w:ind w:left="1440" w:hanging="360"/>
+      </w:pPr>
+    </w:lvl>
+    <w:lvl w:ilvl="2" w:tplc="0809001B" w:tentative="1">
+      <w:start w:val="1"/>
+      <w:numFmt w:val="lowerRoman"/>
+      <w:lvlText w:val="%3."/>
+      <w:lvlJc w:val="right"/>
+      <w:pPr>
+        <w:ind w:left="2160" w:hanging="180"/>
+      </w:pPr>
+    </w:lvl>
+    <w:lvl w:ilvl="3" w:tplc="0809000F" w:tentative="1">
+      <w:start w:val="1"/>
+      <w:numFmt w:val="decimal"/>
+      <w:lvlText w:val="%4."/>
+      <w:lvlJc w:val="left"/>
+      <w:pPr>
+        <w:ind w:left="2880" w:hanging="360"/>
+      </w:pPr>
+    </w:lvl>
+    <w:lvl w:ilvl="4" w:tplc="08090019" w:tentative="1">
+      <w:start w:val="1"/>
+      <w:numFmt w:val="lowerLetter"/>
+      <w:lvlText w:val="%5."/>
+      <w:lvlJc w:val="left"/>
+      <w:pPr>
+        <w:ind w:left="3600" w:hanging="360"/>
+      </w:pPr>
+    </w:lvl>
+    <w:lvl w:ilvl="5" w:tplc="0809001B" w:tentative="1">
+      <w:start w:val="1"/>
+      <w:numFmt w:val="lowerRoman"/>
+      <w:lvlText w:val="%6."/>
+      <w:lvlJc w:val="right"/>
+      <w:pPr>
+        <w:ind w:left="4320" w:hanging="180"/>
+      </w:pPr>
+    </w:lvl>
+    <w:lvl w:ilvl="6" w:tplc="0809000F" w:tentative="1">
+      <w:start w:val="1"/>
+      <w:numFmt w:val="decimal"/>
+      <w:lvlText w:val="%7."/>
+      <w:lvlJc w:val="left"/>
+      <w:pPr>
+        <w:ind w:left="5040" w:hanging="360"/>
+      </w:pPr>
+    </w:lvl>
+    <w:lvl w:ilvl="7" w:tplc="08090019" w:tentative="1">
+      <w:start w:val="1"/>
+      <w:numFmt w:val="lowerLetter"/>
+      <w:lvlText w:val="%8."/>
+      <w:lvlJc w:val="left"/>
+      <w:pPr>
+        <w:ind w:left="5760" w:hanging="360"/>
+      </w:pPr>
+    </w:lvl>
+    <w:lvl w:ilvl="8" w:tplc="0809001B" w:tentative="1">
+      <w:start w:val="1"/>
+      <w:numFmt w:val="lowerRoman"/>
+      <w:lvlText w:val="%9."/>
+      <w:lvlJc w:val="right"/>
+      <w:pPr>
+        <w:ind w:left="6480" w:hanging="180"/>
+      </w:pPr>
+    </w:lvl>
+  </w:abstractNum>
+  <w:abstractNum w:abstractNumId="9" w15:restartNumberingAfterBreak="0">
     <w:nsid w:val="433F1BB9"/>
     <w:multiLevelType w:val="hybridMultilevel"/>
     <w:tmpl w:val="440A9942"/>
@@ -6327,7 +6011,7 @@
       </w:pPr>
     </w:lvl>
   </w:abstractNum>
-  <w:abstractNum w:abstractNumId="7" w15:restartNumberingAfterBreak="0">
+  <w:abstractNum w:abstractNumId="10" w15:restartNumberingAfterBreak="0">
     <w:nsid w:val="520B3C97"/>
     <w:multiLevelType w:val="hybridMultilevel"/>
     <w:tmpl w:val="D1C8A6A8"/>
@@ -6416,7 +6100,7 @@
       </w:pPr>
     </w:lvl>
   </w:abstractNum>
-  <w:abstractNum w:abstractNumId="8" w15:restartNumberingAfterBreak="0">
+  <w:abstractNum w:abstractNumId="11" w15:restartNumberingAfterBreak="0">
     <w:nsid w:val="552D5725"/>
     <w:multiLevelType w:val="hybridMultilevel"/>
     <w:tmpl w:val="0F8A84F8"/>
@@ -6505,7 +6189,7 @@
       </w:pPr>
     </w:lvl>
   </w:abstractNum>
-  <w:abstractNum w:abstractNumId="9" w15:restartNumberingAfterBreak="0">
+  <w:abstractNum w:abstractNumId="12" w15:restartNumberingAfterBreak="0">
     <w:nsid w:val="55CB2499"/>
     <w:multiLevelType w:val="hybridMultilevel"/>
     <w:tmpl w:val="3B0C9FE8"/>
@@ -6594,7 +6278,7 @@
       </w:pPr>
     </w:lvl>
   </w:abstractNum>
-  <w:abstractNum w:abstractNumId="10" w15:restartNumberingAfterBreak="0">
+  <w:abstractNum w:abstractNumId="13" w15:restartNumberingAfterBreak="0">
     <w:nsid w:val="5A8D1928"/>
     <w:multiLevelType w:val="hybridMultilevel"/>
     <w:tmpl w:val="3E9EADE6"/>
@@ -6683,7 +6367,7 @@
       </w:pPr>
     </w:lvl>
   </w:abstractNum>
-  <w:abstractNum w:abstractNumId="11" w15:restartNumberingAfterBreak="0">
+  <w:abstractNum w:abstractNumId="14" w15:restartNumberingAfterBreak="0">
     <w:nsid w:val="5F033FBF"/>
     <w:multiLevelType w:val="hybridMultilevel"/>
     <w:tmpl w:val="76CE193E"/>
@@ -6772,7 +6456,7 @@
       </w:pPr>
     </w:lvl>
   </w:abstractNum>
-  <w:abstractNum w:abstractNumId="12" w15:restartNumberingAfterBreak="0">
+  <w:abstractNum w:abstractNumId="15" w15:restartNumberingAfterBreak="0">
     <w:nsid w:val="628723D6"/>
     <w:multiLevelType w:val="hybridMultilevel"/>
     <w:tmpl w:val="3766A9BE"/>
@@ -6862,49 +6546,58 @@
     </w:lvl>
   </w:abstractNum>
   <w:num w:numId="1" w16cid:durableId="2023239908">
+    <w:abstractNumId w:val="1"/>
+  </w:num>
+  <w:num w:numId="2" w16cid:durableId="1394083679">
+    <w:abstractNumId w:val="5"/>
+  </w:num>
+  <w:num w:numId="3" w16cid:durableId="1068304247">
+    <w:abstractNumId w:val="15"/>
+  </w:num>
+  <w:num w:numId="4" w16cid:durableId="1350257287">
+    <w:abstractNumId w:val="2"/>
+  </w:num>
+  <w:num w:numId="5" w16cid:durableId="512719580">
+    <w:abstractNumId w:val="9"/>
+  </w:num>
+  <w:num w:numId="6" w16cid:durableId="1848128392">
+    <w:abstractNumId w:val="12"/>
+  </w:num>
+  <w:num w:numId="7" w16cid:durableId="1219973215">
+    <w:abstractNumId w:val="11"/>
+  </w:num>
+  <w:num w:numId="8" w16cid:durableId="8064703">
+    <w:abstractNumId w:val="10"/>
+  </w:num>
+  <w:num w:numId="9" w16cid:durableId="837382859">
+    <w:abstractNumId w:val="13"/>
+  </w:num>
+  <w:num w:numId="10" w16cid:durableId="1745907453">
+    <w:abstractNumId w:val="14"/>
+  </w:num>
+  <w:num w:numId="11" w16cid:durableId="139466877">
+    <w:abstractNumId w:val="7"/>
+  </w:num>
+  <w:num w:numId="12" w16cid:durableId="40789684">
+    <w:abstractNumId w:val="4"/>
+  </w:num>
+  <w:num w:numId="13" w16cid:durableId="1784811509">
+    <w:abstractNumId w:val="3"/>
+  </w:num>
+  <w:num w:numId="14" w16cid:durableId="311638086">
     <w:abstractNumId w:val="0"/>
   </w:num>
-  <w:num w:numId="2" w16cid:durableId="1394083679">
-    <w:abstractNumId w:val="4"/>
-  </w:num>
-  <w:num w:numId="3" w16cid:durableId="1068304247">
-    <w:abstractNumId w:val="12"/>
-  </w:num>
-  <w:num w:numId="4" w16cid:durableId="1350257287">
-    <w:abstractNumId w:val="1"/>
-  </w:num>
-  <w:num w:numId="5" w16cid:durableId="512719580">
-    <w:abstractNumId w:val="6"/>
-  </w:num>
-  <w:num w:numId="6" w16cid:durableId="1848128392">
-    <w:abstractNumId w:val="9"/>
-  </w:num>
-  <w:num w:numId="7" w16cid:durableId="1219973215">
+  <w:num w:numId="15" w16cid:durableId="401370222">
     <w:abstractNumId w:val="8"/>
   </w:num>
-  <w:num w:numId="8" w16cid:durableId="8064703">
-    <w:abstractNumId w:val="7"/>
-  </w:num>
-  <w:num w:numId="9" w16cid:durableId="837382859">
-    <w:abstractNumId w:val="10"/>
-  </w:num>
-  <w:num w:numId="10" w16cid:durableId="1745907453">
-    <w:abstractNumId w:val="11"/>
-  </w:num>
-  <w:num w:numId="11" w16cid:durableId="139466877">
-    <w:abstractNumId w:val="5"/>
-  </w:num>
-  <w:num w:numId="12" w16cid:durableId="40789684">
-    <w:abstractNumId w:val="3"/>
-  </w:num>
-  <w:num w:numId="13" w16cid:durableId="1784811509">
-    <w:abstractNumId w:val="2"/>
+  <w:num w:numId="16" w16cid:durableId="541786702">
+    <w:abstractNumId w:val="6"/>
   </w:num>
 </w:numbering>
 </file>
 
 <file path=word/styles.xml><?xml version="1.0" encoding="utf-8"?>
-<w:styles xmlns:mc="http://schemas.openxmlformats.org/markup-compatibility/2006" xmlns:r="http://schemas.openxmlformats.org/officeDocument/2006/relationships" xmlns:w="http://schemas.openxmlformats.org/wordprocessingml/2006/main" xmlns:w14="http://schemas.microsoft.com/office/word/2010/wordml" xmlns:w15="http://schemas.microsoft.com/office/word/2012/wordml" xmlns:w16cex="http://schemas.microsoft.com/office/word/2018/wordml/cex" xmlns:w16cid="http://schemas.microsoft.com/office/word/2016/wordml/cid" xmlns:w16="http://schemas.microsoft.com/office/word/2018/wordml" xmlns:w16sdtdh="http://schemas.microsoft.com/office/word/2020/wordml/sdtdatahash" xmlns:w16se="http://schemas.microsoft.com/office/word/2015/wordml/symex" mc:Ignorable="w14 w15 w16se w16cid w16 w16cex w16sdtdh">
+<w:styles xmlns:mc="http://schemas.openxmlformats.org/markup-compatibility/2006" xmlns:r="http://schemas.openxmlformats.org/officeDocument/2006/relationships" xmlns:w="http://schemas.openxmlformats.org/wordprocessingml/2006/main" xmlns:w14="http://schemas.microsoft.com/office/word/2010/wordml" xmlns:w15="http://schemas.microsoft.com/office/word/2012/wordml" xmlns:w16cex="http://schemas.microsoft.com/office/word/2018/wordml/cex" xmlns:w16cid="http://schemas.microsoft.com/office/word/2016/wordml/cid" xmlns:w16="http://schemas.microsoft.com/office/word/2018/wordml" xmlns:w16du="http://schemas.microsoft.com/office/word/2023/wordml/word16du" xmlns:w16sdtdh="http://schemas.microsoft.com/office/word/2020/wordml/sdtdatahash" xmlns:w16sdtfl="http://schemas.microsoft.com/office/word/2024/wordml/sdtformatlock" xmlns:w16se="http://schemas.microsoft.com/office/word/2015/wordml/symex" mc:Ignorable="w14 w15 w16se w16cid w16 w16cex w16sdtdh w16sdtfl w16du">
   <w:docDefaults>
     <w:rPrDefault>
       <w:rPr>
@@ -7505,7 +7198,6 @@
   <w:style w:type="character" w:default="1" w:styleId="DefaultParagraphFont">
     <w:name w:val="Default Paragraph Font"/>
     <w:uiPriority w:val="1"/>
-    <w:semiHidden/>
     <w:unhideWhenUsed/>
   </w:style>
   <w:style w:type="table" w:default="1" w:styleId="TableNormal">
@@ -7930,7 +7622,7 @@
 </file>
 
 <file path=word/glossary/document.xml><?xml version="1.0" encoding="utf-8"?>
-<w:glossaryDocument xmlns:wpc="http://schemas.microsoft.com/office/word/2010/wordprocessingCanvas" xmlns:cx="http://schemas.microsoft.com/office/drawing/2014/chartex" xmlns:cx1="http://schemas.microsoft.com/office/drawing/2015/9/8/chartex" xmlns:cx2="http://schemas.microsoft.com/office/drawing/2015/10/21/chartex" xmlns:cx3="http://schemas.microsoft.com/office/drawing/2016/5/9/chartex" xmlns:cx4="http://schemas.microsoft.com/office/drawing/2016/5/10/chartex" xmlns:cx5="http://schemas.microsoft.com/office/drawing/2016/5/11/chartex" xmlns:cx6="http://schemas.microsoft.com/office/drawing/2016/5/12/chartex" xmlns:cx7="http://schemas.microsoft.com/office/drawing/2016/5/13/chartex" xmlns:cx8="http://schemas.microsoft.com/office/drawing/2016/5/14/chartex" xmlns:mc="http://schemas.openxmlformats.org/markup-compatibility/2006" xmlns:aink="http://schemas.microsoft.com/office/drawing/2016/ink" xmlns:am3d="http://schemas.microsoft.com/office/drawing/2017/model3d" xmlns:o="urn:schemas-microsoft-com:office:office" xmlns:oel="http://schemas.microsoft.com/office/2019/extlst" xmlns:r="http://schemas.openxmlformats.org/officeDocument/2006/relationships" xmlns:m="http://schemas.openxmlformats.org/officeDocument/2006/math" xmlns:v="urn:schemas-microsoft-com:vml" xmlns:wp14="http://schemas.microsoft.com/office/word/2010/wordprocessingDrawing" xmlns:wp="http://schemas.openxmlformats.org/drawingml/2006/wordprocessingDrawing" xmlns:w10="urn:schemas-microsoft-com:office:word" xmlns:w="http://schemas.openxmlformats.org/wordprocessingml/2006/main" xmlns:w14="http://schemas.microsoft.com/office/word/2010/wordml" xmlns:w15="http://schemas.microsoft.com/office/word/2012/wordml" xmlns:w16cex="http://schemas.microsoft.com/office/word/2018/wordml/cex" xmlns:w16cid="http://schemas.microsoft.com/office/word/2016/wordml/cid" xmlns:w16="http://schemas.microsoft.com/office/word/2018/wordml" xmlns:w16sdtdh="http://schemas.microsoft.com/office/word/2020/wordml/sdtdatahash" xmlns:w16se="http://schemas.microsoft.com/office/word/2015/wordml/symex" xmlns:wpg="http://schemas.microsoft.com/office/word/2010/wordprocessingGroup" xmlns:wpi="http://schemas.microsoft.com/office/word/2010/wordprocessingInk" xmlns:wne="http://schemas.microsoft.com/office/word/2006/wordml" xmlns:wps="http://schemas.microsoft.com/office/word/2010/wordprocessingShape" mc:Ignorable="w14 w15 w16se w16cid w16 w16cex w16sdtdh wp14">
+<w:glossaryDocument xmlns:wpc="http://schemas.microsoft.com/office/word/2010/wordprocessingCanvas" xmlns:cx="http://schemas.microsoft.com/office/drawing/2014/chartex" xmlns:cx1="http://schemas.microsoft.com/office/drawing/2015/9/8/chartex" xmlns:cx2="http://schemas.microsoft.com/office/drawing/2015/10/21/chartex" xmlns:cx3="http://schemas.microsoft.com/office/drawing/2016/5/9/chartex" xmlns:cx4="http://schemas.microsoft.com/office/drawing/2016/5/10/chartex" xmlns:cx5="http://schemas.microsoft.com/office/drawing/2016/5/11/chartex" xmlns:cx6="http://schemas.microsoft.com/office/drawing/2016/5/12/chartex" xmlns:cx7="http://schemas.microsoft.com/office/drawing/2016/5/13/chartex" xmlns:cx8="http://schemas.microsoft.com/office/drawing/2016/5/14/chartex" xmlns:mc="http://schemas.openxmlformats.org/markup-compatibility/2006" xmlns:aink="http://schemas.microsoft.com/office/drawing/2016/ink" xmlns:am3d="http://schemas.microsoft.com/office/drawing/2017/model3d" xmlns:o="urn:schemas-microsoft-com:office:office" xmlns:oel="http://schemas.microsoft.com/office/2019/extlst" xmlns:r="http://schemas.openxmlformats.org/officeDocument/2006/relationships" xmlns:m="http://schemas.openxmlformats.org/officeDocument/2006/math" xmlns:v="urn:schemas-microsoft-com:vml" xmlns:wp14="http://schemas.microsoft.com/office/word/2010/wordprocessingDrawing" xmlns:wp="http://schemas.openxmlformats.org/drawingml/2006/wordprocessingDrawing" xmlns:w10="urn:schemas-microsoft-com:office:word" xmlns:w="http://schemas.openxmlformats.org/wordprocessingml/2006/main" xmlns:w14="http://schemas.microsoft.com/office/word/2010/wordml" xmlns:w15="http://schemas.microsoft.com/office/word/2012/wordml" xmlns:w16cex="http://schemas.microsoft.com/office/word/2018/wordml/cex" xmlns:w16cid="http://schemas.microsoft.com/office/word/2016/wordml/cid" xmlns:w16="http://schemas.microsoft.com/office/word/2018/wordml" xmlns:w16du="http://schemas.microsoft.com/office/word/2023/wordml/word16du" xmlns:w16sdtdh="http://schemas.microsoft.com/office/word/2020/wordml/sdtdatahash" xmlns:w16sdtfl="http://schemas.microsoft.com/office/word/2024/wordml/sdtformatlock" xmlns:w16se="http://schemas.microsoft.com/office/word/2015/wordml/symex" xmlns:wpg="http://schemas.microsoft.com/office/word/2010/wordprocessingGroup" xmlns:wpi="http://schemas.microsoft.com/office/word/2010/wordprocessingInk" xmlns:wne="http://schemas.microsoft.com/office/word/2006/wordml" xmlns:wps="http://schemas.microsoft.com/office/word/2010/wordprocessingShape" mc:Ignorable="w14 w15 w16se w16cid w16 w16cex w16sdtdh w16sdtfl w16du wp14">
   <w:docParts>
     <w:docPart>
       <w:docPartPr>
@@ -8001,19 +7693,19 @@
 </file>
 
 <file path=word/glossary/fontTable.xml><?xml version="1.0" encoding="utf-8"?>
-<w:fonts xmlns:mc="http://schemas.openxmlformats.org/markup-compatibility/2006" xmlns:r="http://schemas.openxmlformats.org/officeDocument/2006/relationships" xmlns:w="http://schemas.openxmlformats.org/wordprocessingml/2006/main" xmlns:w14="http://schemas.microsoft.com/office/word/2010/wordml" xmlns:w15="http://schemas.microsoft.com/office/word/2012/wordml" xmlns:w16cex="http://schemas.microsoft.com/office/word/2018/wordml/cex" xmlns:w16cid="http://schemas.microsoft.com/office/word/2016/wordml/cid" xmlns:w16="http://schemas.microsoft.com/office/word/2018/wordml" xmlns:w16sdtdh="http://schemas.microsoft.com/office/word/2020/wordml/sdtdatahash" xmlns:w16se="http://schemas.microsoft.com/office/word/2015/wordml/symex" mc:Ignorable="w14 w15 w16se w16cid w16 w16cex w16sdtdh">
-  <w:font w:name="Aptos">
-    <w:charset w:val="00"/>
-    <w:family w:val="swiss"/>
-    <w:pitch w:val="variable"/>
-    <w:sig w:usb0="20000287" w:usb1="00000003" w:usb2="00000000" w:usb3="00000000" w:csb0="0000019F" w:csb1="00000000"/>
-  </w:font>
+<w:fonts xmlns:mc="http://schemas.openxmlformats.org/markup-compatibility/2006" xmlns:r="http://schemas.openxmlformats.org/officeDocument/2006/relationships" xmlns:w="http://schemas.openxmlformats.org/wordprocessingml/2006/main" xmlns:w14="http://schemas.microsoft.com/office/word/2010/wordml" xmlns:w15="http://schemas.microsoft.com/office/word/2012/wordml" xmlns:w16cex="http://schemas.microsoft.com/office/word/2018/wordml/cex" xmlns:w16cid="http://schemas.microsoft.com/office/word/2016/wordml/cid" xmlns:w16="http://schemas.microsoft.com/office/word/2018/wordml" xmlns:w16du="http://schemas.microsoft.com/office/word/2023/wordml/word16du" xmlns:w16sdtdh="http://schemas.microsoft.com/office/word/2020/wordml/sdtdatahash" xmlns:w16sdtfl="http://schemas.microsoft.com/office/word/2024/wordml/sdtformatlock" xmlns:w16se="http://schemas.microsoft.com/office/word/2015/wordml/symex" mc:Ignorable="w14 w15 w16se w16cid w16 w16cex w16sdtdh w16sdtfl w16du">
   <w:font w:name="Times New Roman">
     <w:panose1 w:val="02020603050405020304"/>
     <w:charset w:val="00"/>
     <w:family w:val="roman"/>
     <w:pitch w:val="variable"/>
     <w:sig w:usb0="E0002EFF" w:usb1="C000785B" w:usb2="00000009" w:usb3="00000000" w:csb0="000001FF" w:csb1="00000000"/>
+  </w:font>
+  <w:font w:name="Aptos">
+    <w:charset w:val="00"/>
+    <w:family w:val="swiss"/>
+    <w:pitch w:val="variable"/>
+    <w:sig w:usb0="20000287" w:usb1="00000003" w:usb2="00000000" w:usb3="00000000" w:csb0="0000019F" w:csb1="00000000"/>
   </w:font>
   <w:font w:name="Courier New">
     <w:panose1 w:val="02070309020205020404"/>
@@ -8046,7 +7738,7 @@
 </file>
 
 <file path=word/glossary/settings.xml><?xml version="1.0" encoding="utf-8"?>
-<w:settings xmlns:mc="http://schemas.openxmlformats.org/markup-compatibility/2006" xmlns:o="urn:schemas-microsoft-com:office:office" xmlns:r="http://schemas.openxmlformats.org/officeDocument/2006/relationships" xmlns:m="http://schemas.openxmlformats.org/officeDocument/2006/math" xmlns:v="urn:schemas-microsoft-com:vml" xmlns:w10="urn:schemas-microsoft-com:office:word" xmlns:w="http://schemas.openxmlformats.org/wordprocessingml/2006/main" xmlns:w14="http://schemas.microsoft.com/office/word/2010/wordml" xmlns:w15="http://schemas.microsoft.com/office/word/2012/wordml" xmlns:w16cex="http://schemas.microsoft.com/office/word/2018/wordml/cex" xmlns:w16cid="http://schemas.microsoft.com/office/word/2016/wordml/cid" xmlns:w16="http://schemas.microsoft.com/office/word/2018/wordml" xmlns:w16sdtdh="http://schemas.microsoft.com/office/word/2020/wordml/sdtdatahash" xmlns:w16se="http://schemas.microsoft.com/office/word/2015/wordml/symex" xmlns:sl="http://schemas.openxmlformats.org/schemaLibrary/2006/main" mc:Ignorable="w14 w15 w16se w16cid w16 w16cex w16sdtdh">
+<w:settings xmlns:mc="http://schemas.openxmlformats.org/markup-compatibility/2006" xmlns:o="urn:schemas-microsoft-com:office:office" xmlns:r="http://schemas.openxmlformats.org/officeDocument/2006/relationships" xmlns:m="http://schemas.openxmlformats.org/officeDocument/2006/math" xmlns:v="urn:schemas-microsoft-com:vml" xmlns:w10="urn:schemas-microsoft-com:office:word" xmlns:w="http://schemas.openxmlformats.org/wordprocessingml/2006/main" xmlns:w14="http://schemas.microsoft.com/office/word/2010/wordml" xmlns:w15="http://schemas.microsoft.com/office/word/2012/wordml" xmlns:w16cex="http://schemas.microsoft.com/office/word/2018/wordml/cex" xmlns:w16cid="http://schemas.microsoft.com/office/word/2016/wordml/cid" xmlns:w16="http://schemas.microsoft.com/office/word/2018/wordml" xmlns:w16du="http://schemas.microsoft.com/office/word/2023/wordml/word16du" xmlns:w16sdtdh="http://schemas.microsoft.com/office/word/2020/wordml/sdtdatahash" xmlns:w16sdtfl="http://schemas.microsoft.com/office/word/2024/wordml/sdtformatlock" xmlns:w16se="http://schemas.microsoft.com/office/word/2015/wordml/symex" xmlns:sl="http://schemas.openxmlformats.org/schemaLibrary/2006/main" mc:Ignorable="w14 w15 w16se w16cid w16 w16cex w16sdtdh w16sdtfl w16du">
   <w:view w:val="normal"/>
   <w:defaultTabStop w:val="720"/>
   <w:characterSpacingControl w:val="doNotCompress"/>
@@ -8061,9 +7753,11 @@
   </w:compat>
   <w:rsids>
     <w:rsidRoot w:val="00606098"/>
+    <w:rsid w:val="000F26B1"/>
     <w:rsid w:val="00606098"/>
     <w:rsid w:val="00A00728"/>
     <w:rsid w:val="00BB675D"/>
+    <w:rsid w:val="00D113E5"/>
   </w:rsids>
   <m:mathPr>
     <m:mathFont m:val="Cambria Math"/>
@@ -8087,7 +7781,7 @@
 </file>
 
 <file path=word/glossary/styles.xml><?xml version="1.0" encoding="utf-8"?>
-<w:styles xmlns:mc="http://schemas.openxmlformats.org/markup-compatibility/2006" xmlns:r="http://schemas.openxmlformats.org/officeDocument/2006/relationships" xmlns:w="http://schemas.openxmlformats.org/wordprocessingml/2006/main" xmlns:w14="http://schemas.microsoft.com/office/word/2010/wordml" xmlns:w15="http://schemas.microsoft.com/office/word/2012/wordml" xmlns:w16cex="http://schemas.microsoft.com/office/word/2018/wordml/cex" xmlns:w16cid="http://schemas.microsoft.com/office/word/2016/wordml/cid" xmlns:w16="http://schemas.microsoft.com/office/word/2018/wordml" xmlns:w16sdtdh="http://schemas.microsoft.com/office/word/2020/wordml/sdtdatahash" xmlns:w16se="http://schemas.microsoft.com/office/word/2015/wordml/symex" mc:Ignorable="w14 w15 w16se w16cid w16 w16cex w16sdtdh">
+<w:styles xmlns:mc="http://schemas.openxmlformats.org/markup-compatibility/2006" xmlns:r="http://schemas.openxmlformats.org/officeDocument/2006/relationships" xmlns:w="http://schemas.openxmlformats.org/wordprocessingml/2006/main" xmlns:w14="http://schemas.microsoft.com/office/word/2010/wordml" xmlns:w15="http://schemas.microsoft.com/office/word/2012/wordml" xmlns:w16cex="http://schemas.microsoft.com/office/word/2018/wordml/cex" xmlns:w16cid="http://schemas.microsoft.com/office/word/2016/wordml/cid" xmlns:w16="http://schemas.microsoft.com/office/word/2018/wordml" xmlns:w16du="http://schemas.microsoft.com/office/word/2023/wordml/word16du" xmlns:w16sdtdh="http://schemas.microsoft.com/office/word/2020/wordml/sdtdatahash" xmlns:w16sdtfl="http://schemas.microsoft.com/office/word/2024/wordml/sdtformatlock" xmlns:w16se="http://schemas.microsoft.com/office/word/2015/wordml/symex" mc:Ignorable="w14 w15 w16se w16cid w16 w16cex w16sdtdh w16sdtfl w16du">
   <w:docDefaults>
     <w:rPrDefault>
       <w:rPr>
@@ -8526,7 +8220,7 @@
 </file>
 
 <file path=word/glossary/webSettings.xml><?xml version="1.0" encoding="utf-8"?>
-<w:webSettings xmlns:mc="http://schemas.openxmlformats.org/markup-compatibility/2006" xmlns:r="http://schemas.openxmlformats.org/officeDocument/2006/relationships" xmlns:w="http://schemas.openxmlformats.org/wordprocessingml/2006/main" xmlns:w14="http://schemas.microsoft.com/office/word/2010/wordml" xmlns:w15="http://schemas.microsoft.com/office/word/2012/wordml" xmlns:w16cex="http://schemas.microsoft.com/office/word/2018/wordml/cex" xmlns:w16cid="http://schemas.microsoft.com/office/word/2016/wordml/cid" xmlns:w16="http://schemas.microsoft.com/office/word/2018/wordml" xmlns:w16sdtdh="http://schemas.microsoft.com/office/word/2020/wordml/sdtdatahash" xmlns:w16se="http://schemas.microsoft.com/office/word/2015/wordml/symex" mc:Ignorable="w14 w15 w16se w16cid w16 w16cex w16sdtdh">
+<w:webSettings xmlns:mc="http://schemas.openxmlformats.org/markup-compatibility/2006" xmlns:r="http://schemas.openxmlformats.org/officeDocument/2006/relationships" xmlns:w="http://schemas.openxmlformats.org/wordprocessingml/2006/main" xmlns:w14="http://schemas.microsoft.com/office/word/2010/wordml" xmlns:w15="http://schemas.microsoft.com/office/word/2012/wordml" xmlns:w16cex="http://schemas.microsoft.com/office/word/2018/wordml/cex" xmlns:w16cid="http://schemas.microsoft.com/office/word/2016/wordml/cid" xmlns:w16="http://schemas.microsoft.com/office/word/2018/wordml" xmlns:w16du="http://schemas.microsoft.com/office/word/2023/wordml/word16du" xmlns:w16sdtdh="http://schemas.microsoft.com/office/word/2020/wordml/sdtdatahash" xmlns:w16sdtfl="http://schemas.microsoft.com/office/word/2024/wordml/sdtformatlock" xmlns:w16se="http://schemas.microsoft.com/office/word/2015/wordml/symex" mc:Ignorable="w14 w15 w16se w16cid w16 w16cex w16sdtdh w16sdtfl w16du">
   <w:optimizeForBrowser/>
   <w:allowPNG/>
 </w:webSettings>

</xml_diff>

<commit_message>
added all updated files
</commit_message>
<xml_diff>
--- a/Project Proposal.docx
+++ b/Project Proposal.docx
@@ -1,6 +1,6 @@
 
 <file path=word/document.xml><?xml version="1.0" encoding="utf-8"?>
-<w:document xmlns:wpc="http://schemas.microsoft.com/office/word/2010/wordprocessingCanvas" xmlns:cx="http://schemas.microsoft.com/office/drawing/2014/chartex" xmlns:cx1="http://schemas.microsoft.com/office/drawing/2015/9/8/chartex" xmlns:cx2="http://schemas.microsoft.com/office/drawing/2015/10/21/chartex" xmlns:cx3="http://schemas.microsoft.com/office/drawing/2016/5/9/chartex" xmlns:cx4="http://schemas.microsoft.com/office/drawing/2016/5/10/chartex" xmlns:cx5="http://schemas.microsoft.com/office/drawing/2016/5/11/chartex" xmlns:cx6="http://schemas.microsoft.com/office/drawing/2016/5/12/chartex" xmlns:cx7="http://schemas.microsoft.com/office/drawing/2016/5/13/chartex" xmlns:cx8="http://schemas.microsoft.com/office/drawing/2016/5/14/chartex" xmlns:mc="http://schemas.openxmlformats.org/markup-compatibility/2006" xmlns:aink="http://schemas.microsoft.com/office/drawing/2016/ink" xmlns:am3d="http://schemas.microsoft.com/office/drawing/2017/model3d" xmlns:o="urn:schemas-microsoft-com:office:office" xmlns:oel="http://schemas.microsoft.com/office/2019/extlst" xmlns:r="http://schemas.openxmlformats.org/officeDocument/2006/relationships" xmlns:m="http://schemas.openxmlformats.org/officeDocument/2006/math" xmlns:v="urn:schemas-microsoft-com:vml" xmlns:wp14="http://schemas.microsoft.com/office/word/2010/wordprocessingDrawing" xmlns:wp="http://schemas.openxmlformats.org/drawingml/2006/wordprocessingDrawing" xmlns:w10="urn:schemas-microsoft-com:office:word" xmlns:w="http://schemas.openxmlformats.org/wordprocessingml/2006/main" xmlns:w14="http://schemas.microsoft.com/office/word/2010/wordml" xmlns:w15="http://schemas.microsoft.com/office/word/2012/wordml" xmlns:w16cex="http://schemas.microsoft.com/office/word/2018/wordml/cex" xmlns:w16cid="http://schemas.microsoft.com/office/word/2016/wordml/cid" xmlns:w16="http://schemas.microsoft.com/office/word/2018/wordml" xmlns:w16du="http://schemas.microsoft.com/office/word/2023/wordml/word16du" xmlns:w16sdtdh="http://schemas.microsoft.com/office/word/2020/wordml/sdtdatahash" xmlns:w16sdtfl="http://schemas.microsoft.com/office/word/2024/wordml/sdtformatlock" xmlns:w16se="http://schemas.microsoft.com/office/word/2015/wordml/symex" xmlns:wpg="http://schemas.microsoft.com/office/word/2010/wordprocessingGroup" xmlns:wpi="http://schemas.microsoft.com/office/word/2010/wordprocessingInk" xmlns:wne="http://schemas.microsoft.com/office/word/2006/wordml" xmlns:wps="http://schemas.microsoft.com/office/word/2010/wordprocessingShape" mc:Ignorable="w14 w15 w16se w16cid w16 w16cex w16sdtdh w16sdtfl w16du wp14">
+<w:document xmlns:wpc="http://schemas.microsoft.com/office/word/2010/wordprocessingCanvas" xmlns:cx="http://schemas.microsoft.com/office/drawing/2014/chartex" xmlns:cx1="http://schemas.microsoft.com/office/drawing/2015/9/8/chartex" xmlns:cx2="http://schemas.microsoft.com/office/drawing/2015/10/21/chartex" xmlns:cx3="http://schemas.microsoft.com/office/drawing/2016/5/9/chartex" xmlns:cx4="http://schemas.microsoft.com/office/drawing/2016/5/10/chartex" xmlns:cx5="http://schemas.microsoft.com/office/drawing/2016/5/11/chartex" xmlns:cx6="http://schemas.microsoft.com/office/drawing/2016/5/12/chartex" xmlns:cx7="http://schemas.microsoft.com/office/drawing/2016/5/13/chartex" xmlns:cx8="http://schemas.microsoft.com/office/drawing/2016/5/14/chartex" xmlns:mc="http://schemas.openxmlformats.org/markup-compatibility/2006" xmlns:aink="http://schemas.microsoft.com/office/drawing/2016/ink" xmlns:am3d="http://schemas.microsoft.com/office/drawing/2017/model3d" xmlns:o="urn:schemas-microsoft-com:office:office" xmlns:r="http://schemas.openxmlformats.org/officeDocument/2006/relationships" xmlns:m="http://schemas.openxmlformats.org/officeDocument/2006/math" xmlns:v="urn:schemas-microsoft-com:vml" xmlns:wp14="http://schemas.microsoft.com/office/word/2010/wordprocessingDrawing" xmlns:wp="http://schemas.openxmlformats.org/drawingml/2006/wordprocessingDrawing" xmlns:w10="urn:schemas-microsoft-com:office:word" xmlns:w="http://schemas.openxmlformats.org/wordprocessingml/2006/main" xmlns:w14="http://schemas.microsoft.com/office/word/2010/wordml" xmlns:w15="http://schemas.microsoft.com/office/word/2012/wordml" xmlns:w16cex="http://schemas.microsoft.com/office/word/2018/wordml/cex" xmlns:w16cid="http://schemas.microsoft.com/office/word/2016/wordml/cid" xmlns:w16="http://schemas.microsoft.com/office/word/2018/wordml" xmlns:w16sdtdh="http://schemas.microsoft.com/office/word/2020/wordml/sdtdatahash" xmlns:w16se="http://schemas.microsoft.com/office/word/2015/wordml/symex" xmlns:wpg="http://schemas.microsoft.com/office/word/2010/wordprocessingGroup" xmlns:wpi="http://schemas.microsoft.com/office/word/2010/wordprocessingInk" xmlns:wne="http://schemas.microsoft.com/office/word/2006/wordml" xmlns:wps="http://schemas.microsoft.com/office/word/2010/wordprocessingShape" mc:Ignorable="w14 w15 w16se w16cid w16 w16cex w16sdtdh wp14">
   <w:body>
     <w:sdt>
       <w:sdtPr>
@@ -106,6 +106,7 @@
             <w:dataBinding w:prefixMappings="xmlns:ns0='http://purl.org/dc/elements/1.1/' xmlns:ns1='http://schemas.openxmlformats.org/package/2006/metadata/core-properties' " w:xpath="/ns1:coreProperties[1]/ns0:subject[1]" w:storeItemID="{6C3C8BC8-F283-45AE-878A-BAB7291924A1}"/>
             <w:text/>
           </w:sdtPr>
+          <w:sdtEndPr/>
           <w:sdtContent>
             <w:p>
               <w:pPr>
@@ -230,7 +231,7 @@
                   </wp:anchor>
                 </w:drawing>
               </mc:Choice>
-              <mc:Fallback>
+              <mc:Fallback xmlns:w16sdtfl="http://schemas.microsoft.com/office/word/2024/wordml/sdtformatlock" xmlns:w16du="http://schemas.microsoft.com/office/word/2023/wordml/word16du" xmlns:oel="http://schemas.microsoft.com/office/2019/extlst">
                 <w:pict>
                   <v:shapetype w14:anchorId="3299F684" id="_x0000_t202" coordsize="21600,21600" o:spt="202" path="m,l,21600r21600,l21600,xe">
                     <v:stroke joinstyle="miter"/>
@@ -1759,7 +1760,6 @@
         </w:numPr>
       </w:pPr>
       <w:r>
-        <w:lastRenderedPageBreak/>
         <w:t>Accessibility features</w:t>
       </w:r>
     </w:p>
@@ -1781,6 +1781,7 @@
       </w:pPr>
       <w:bookmarkStart w:id="10" w:name="_Toc220335988"/>
       <w:r>
+        <w:lastRenderedPageBreak/>
         <w:t>Functional requirements</w:t>
       </w:r>
       <w:bookmarkEnd w:id="10"/>
@@ -2262,11 +2263,7 @@
               <w:t>any account data</w:t>
             </w:r>
             <w:r>
-              <w:t xml:space="preserve"> </w:t>
-            </w:r>
-            <w:r>
-              <w:lastRenderedPageBreak/>
-              <w:t>saved onto the database</w:t>
+              <w:t xml:space="preserve"> saved onto the database</w:t>
             </w:r>
           </w:p>
         </w:tc>
@@ -2285,7 +2282,6 @@
               <w:spacing w:after="160" w:line="278" w:lineRule="auto"/>
             </w:pPr>
             <w:r>
-              <w:lastRenderedPageBreak/>
               <w:t xml:space="preserve">This feature will benefit the </w:t>
             </w:r>
             <w:r>
@@ -2338,6 +2334,7 @@
               <w:t xml:space="preserve">As Jon, I want to be able to create bookings through </w:t>
             </w:r>
             <w:r>
+              <w:lastRenderedPageBreak/>
               <w:t xml:space="preserve">my </w:t>
             </w:r>
             <w:r>
@@ -2364,7 +2361,12 @@
               </w:numPr>
             </w:pPr>
             <w:r>
-              <w:t>Provide user with a form-based page to enter booking details</w:t>
+              <w:lastRenderedPageBreak/>
+              <w:t xml:space="preserve">Provide user with a form-based page </w:t>
+            </w:r>
+            <w:r>
+              <w:lastRenderedPageBreak/>
+              <w:t>to enter booking details</w:t>
             </w:r>
           </w:p>
           <w:p>
@@ -2419,13 +2421,18 @@
               <w:spacing w:after="160" w:line="278" w:lineRule="auto"/>
             </w:pPr>
             <w:r>
+              <w:lastRenderedPageBreak/>
               <w:t xml:space="preserve">This feature will benefit the </w:t>
             </w:r>
             <w:r>
               <w:t>customer</w:t>
             </w:r>
             <w:r>
-              <w:t xml:space="preserve"> as it allows for users to create bookings online rather than in-person allowing for a better automated process. </w:t>
+              <w:t xml:space="preserve"> as it </w:t>
+            </w:r>
+            <w:r>
+              <w:lastRenderedPageBreak/>
+              <w:t xml:space="preserve">allows for users to create bookings online rather than in-person allowing for a better automated process. </w:t>
             </w:r>
           </w:p>
         </w:tc>
@@ -2449,6 +2456,7 @@
               <w:spacing w:after="160" w:line="278" w:lineRule="auto"/>
             </w:pPr>
             <w:r>
+              <w:lastRenderedPageBreak/>
               <w:t>View bookings</w:t>
             </w:r>
           </w:p>
@@ -2574,34 +2582,34 @@
               <w:spacing w:after="160" w:line="278" w:lineRule="auto"/>
             </w:pPr>
             <w:r>
+              <w:t>Manage bookings</w:t>
+            </w:r>
+          </w:p>
+        </w:tc>
+        <w:tc>
+          <w:tcPr>
+            <w:tcW w:w="2133" w:type="dxa"/>
+            <w:tcBorders>
+              <w:top w:val="single" w:sz="4" w:space="0" w:color="auto"/>
+              <w:left w:val="single" w:sz="4" w:space="0" w:color="auto"/>
+              <w:bottom w:val="single" w:sz="4" w:space="0" w:color="auto"/>
+              <w:right w:val="single" w:sz="4" w:space="0" w:color="auto"/>
+            </w:tcBorders>
+          </w:tcPr>
+          <w:p>
+            <w:pPr>
+              <w:spacing w:after="160" w:line="278" w:lineRule="auto"/>
+            </w:pPr>
+            <w:r>
+              <w:t xml:space="preserve">As Sam, I would like to manage customer bookings so that I can confirm or deny customer requests. </w:t>
+            </w:r>
+          </w:p>
+          <w:p>
+            <w:pPr>
+              <w:spacing w:after="160" w:line="278" w:lineRule="auto"/>
+            </w:pPr>
+            <w:r>
               <w:lastRenderedPageBreak/>
-              <w:t>Manage bookings</w:t>
-            </w:r>
-          </w:p>
-        </w:tc>
-        <w:tc>
-          <w:tcPr>
-            <w:tcW w:w="2133" w:type="dxa"/>
-            <w:tcBorders>
-              <w:top w:val="single" w:sz="4" w:space="0" w:color="auto"/>
-              <w:left w:val="single" w:sz="4" w:space="0" w:color="auto"/>
-              <w:bottom w:val="single" w:sz="4" w:space="0" w:color="auto"/>
-              <w:right w:val="single" w:sz="4" w:space="0" w:color="auto"/>
-            </w:tcBorders>
-          </w:tcPr>
-          <w:p>
-            <w:pPr>
-              <w:spacing w:after="160" w:line="278" w:lineRule="auto"/>
-            </w:pPr>
-            <w:r>
-              <w:t xml:space="preserve">As Sam, I would like to manage customer bookings so that I can confirm or deny customer requests. </w:t>
-            </w:r>
-          </w:p>
-          <w:p>
-            <w:pPr>
-              <w:spacing w:after="160" w:line="278" w:lineRule="auto"/>
-            </w:pPr>
-            <w:r>
               <w:t xml:space="preserve">As Jon, I would like to be able to manage my personal bookings, so that I can delete or update information. </w:t>
             </w:r>
           </w:p>
@@ -2625,6 +2633,7 @@
               </w:numPr>
             </w:pPr>
             <w:r>
+              <w:lastRenderedPageBreak/>
               <w:t>Provide users with an appropriate UI</w:t>
             </w:r>
             <w:r>
@@ -2643,7 +2652,11 @@
               </w:numPr>
             </w:pPr>
             <w:r>
-              <w:t>Staff should be able to manage bookings made by users and confirm or deny based on availability</w:t>
+              <w:t xml:space="preserve">Staff should be able to manage bookings made by users and confirm </w:t>
+            </w:r>
+            <w:r>
+              <w:lastRenderedPageBreak/>
+              <w:t>or deny based on availability</w:t>
             </w:r>
           </w:p>
           <w:p>
@@ -2676,6 +2689,14 @@
             <w:pPr>
               <w:spacing w:after="160" w:line="278" w:lineRule="auto"/>
             </w:pPr>
+            <w:r>
+              <w:lastRenderedPageBreak/>
+              <w:t xml:space="preserve">This feature will benefit the client as it allows staff to manage customer booking from a centralised </w:t>
+            </w:r>
+            <w:r>
+              <w:lastRenderedPageBreak/>
+              <w:t>location which will allow them to confirm/deny these requests a lot quicker improving the speed of workflow</w:t>
+            </w:r>
           </w:p>
         </w:tc>
       </w:tr>
@@ -2695,6 +2716,7 @@
           </w:tcPr>
           <w:p>
             <w:r>
+              <w:lastRenderedPageBreak/>
               <w:t>Update room information</w:t>
             </w:r>
           </w:p>
@@ -2711,15 +2733,7 @@
           </w:tcPr>
           <w:p>
             <w:r>
-              <w:t xml:space="preserve">As Rebecca, I want to be able to update information about the rooms available so that the customers are </w:t>
-            </w:r>
-            <w:proofErr w:type="gramStart"/>
-            <w:r>
-              <w:t>up-to-date</w:t>
-            </w:r>
-            <w:proofErr w:type="gramEnd"/>
-            <w:r>
-              <w:t xml:space="preserve"> with our available services. </w:t>
+              <w:t xml:space="preserve">As Rebecca, I want to be able to update information about the rooms available so that the customers are up-to-date with our available services. </w:t>
             </w:r>
           </w:p>
         </w:tc>
@@ -2780,7 +2794,11 @@
               <w:right w:val="single" w:sz="4" w:space="0" w:color="auto"/>
             </w:tcBorders>
           </w:tcPr>
-          <w:p/>
+          <w:p>
+            <w:r>
+              <w:t xml:space="preserve">This is beneficial to the client as it allows the company to keep information as up-to-date as possible, and helps to avoid confusion. </w:t>
+            </w:r>
+          </w:p>
         </w:tc>
       </w:tr>
       <w:tr>
@@ -2820,11 +2838,7 @@
           </w:p>
           <w:p>
             <w:r>
-              <w:t xml:space="preserve">As Sam, I would need to view the available rooms so that I can </w:t>
-            </w:r>
-            <w:r>
-              <w:lastRenderedPageBreak/>
-              <w:t xml:space="preserve">confirm or deny customer booking requests. </w:t>
+              <w:t xml:space="preserve">As Sam, I would need to view the available rooms so that I can confirm or deny customer booking requests. </w:t>
             </w:r>
           </w:p>
         </w:tc>
@@ -2847,7 +2861,6 @@
               </w:numPr>
             </w:pPr>
             <w:r>
-              <w:lastRenderedPageBreak/>
               <w:t>The solution should provide the user with an appropriate UI/UX to fit the user requirements</w:t>
             </w:r>
           </w:p>
@@ -2863,7 +2876,6 @@
               <w:t xml:space="preserve">The user should be able to filter the available rooms to find rooms that fit </w:t>
             </w:r>
             <w:r>
-              <w:lastRenderedPageBreak/>
               <w:t>their specific needs</w:t>
             </w:r>
           </w:p>
@@ -2880,7 +2892,6 @@
           </w:tcPr>
           <w:p>
             <w:r>
-              <w:lastRenderedPageBreak/>
               <w:t xml:space="preserve">This feature will be beneficial as it will allow all users to have a better overview of which rooms are available.   </w:t>
             </w:r>
           </w:p>
@@ -2974,6 +2985,7 @@
               </w:numPr>
             </w:pPr>
             <w:r>
+              <w:lastRenderedPageBreak/>
               <w:t>Verify that the information entered is in the correct format</w:t>
             </w:r>
           </w:p>
@@ -2990,21 +3002,18 @@
           </w:tcPr>
           <w:p>
             <w:r>
+              <w:lastRenderedPageBreak/>
               <w:t xml:space="preserve">This will be beneficial for the client as the function would allow for the user to </w:t>
             </w:r>
             <w:r>
               <w:t>set a</w:t>
             </w:r>
             <w:r>
-              <w:t xml:space="preserve"> payment method </w:t>
-            </w:r>
-            <w:proofErr w:type="gramStart"/>
-            <w:r>
-              <w:t>in order to</w:t>
-            </w:r>
-            <w:proofErr w:type="gramEnd"/>
-            <w:r>
-              <w:t xml:space="preserve"> make purchases through the solution instead of in person. </w:t>
+              <w:t xml:space="preserve"> payment method in order to make purchases </w:t>
+            </w:r>
+            <w:r>
+              <w:lastRenderedPageBreak/>
+              <w:t xml:space="preserve">through the solution instead of in person. </w:t>
             </w:r>
           </w:p>
         </w:tc>
@@ -3025,6 +3034,7 @@
           </w:tcPr>
           <w:p>
             <w:r>
+              <w:lastRenderedPageBreak/>
               <w:t>Update payment method</w:t>
             </w:r>
           </w:p>
@@ -3102,7 +3112,11 @@
               <w:right w:val="single" w:sz="4" w:space="0" w:color="auto"/>
             </w:tcBorders>
           </w:tcPr>
-          <w:p/>
+          <w:p>
+            <w:r>
+              <w:t xml:space="preserve">This will benefit the customer as they may need to change their payment information in the future and this function will make the process more efficient. </w:t>
+            </w:r>
+          </w:p>
         </w:tc>
       </w:tr>
       <w:tr>
@@ -3145,11 +3159,7 @@
           </w:p>
           <w:p>
             <w:r>
-              <w:t xml:space="preserve">As Rebecca, I would like to be able to view the </w:t>
-            </w:r>
-            <w:r>
-              <w:lastRenderedPageBreak/>
-              <w:t xml:space="preserve">booking policies online so that I can make sure that all customers are following the correct policies when booking with </w:t>
+              <w:t xml:space="preserve">As Rebecca, I would like to be able to view the booking policies online so that I can make sure that all customers are following the correct policies when booking with </w:t>
             </w:r>
             <w:proofErr w:type="spellStart"/>
             <w:r>
@@ -3180,7 +3190,6 @@
               </w:numPr>
             </w:pPr>
             <w:r>
-              <w:lastRenderedPageBreak/>
               <w:t xml:space="preserve">The solution should provide the user with an appropriate UI/UX to fit the user requirements </w:t>
             </w:r>
           </w:p>
@@ -3205,7 +3214,6 @@
               </w:numPr>
             </w:pPr>
             <w:r>
-              <w:lastRenderedPageBreak/>
               <w:t>Display policies in a clear, readable format</w:t>
             </w:r>
           </w:p>
@@ -3233,7 +3241,11 @@
               <w:right w:val="single" w:sz="4" w:space="0" w:color="auto"/>
             </w:tcBorders>
           </w:tcPr>
-          <w:p/>
+          <w:p>
+            <w:r>
+              <w:t xml:space="preserve">This will benefit the client as it will allow staff to monitor whether policies are being followed correctly without the hassle of keeping paper documents which are at risk of being lost. </w:t>
+            </w:r>
+          </w:p>
         </w:tc>
       </w:tr>
     </w:tbl>
@@ -3314,6 +3326,7 @@
               <w:spacing w:after="160" w:line="278" w:lineRule="auto"/>
             </w:pPr>
             <w:r>
+              <w:lastRenderedPageBreak/>
               <w:t>Non-Functional Requirement</w:t>
             </w:r>
           </w:p>
@@ -3758,11 +3771,7 @@
               </w:numPr>
             </w:pPr>
             <w:r>
-              <w:t xml:space="preserve">The solution is evaluated every month to ensure </w:t>
-            </w:r>
-            <w:r>
-              <w:lastRenderedPageBreak/>
-              <w:t xml:space="preserve">it is compliant with GDPR and DPA regulations </w:t>
+              <w:t xml:space="preserve">The solution is evaluated every month to ensure it is compliant with GDPR and DPA regulations </w:t>
             </w:r>
           </w:p>
         </w:tc>
@@ -4041,6 +4050,7 @@
               <w:spacing w:after="160" w:line="278" w:lineRule="auto"/>
             </w:pPr>
             <w:r>
+              <w:lastRenderedPageBreak/>
               <w:t>Non-Functional Requirement</w:t>
             </w:r>
           </w:p>
@@ -4426,7 +4436,6 @@
                 <w:b/>
                 <w:bCs/>
               </w:rPr>
-              <w:lastRenderedPageBreak/>
               <w:t>Usability</w:t>
             </w:r>
           </w:p>
@@ -4753,6 +4762,7 @@
               <w:spacing w:after="160" w:line="278" w:lineRule="auto"/>
             </w:pPr>
             <w:r>
+              <w:lastRenderedPageBreak/>
               <w:t>The user should be able to switch the languages used on the solution</w:t>
             </w:r>
           </w:p>
@@ -4884,10 +4894,6 @@
               <w:t xml:space="preserve">The solution should offer a </w:t>
             </w:r>
             <w:r>
-              <w:rPr>
-                <w:i/>
-                <w:iCs/>
-              </w:rPr>
               <w:t>clear</w:t>
             </w:r>
             <w:r>
@@ -4904,6 +4910,7 @@
       </w:pPr>
       <w:bookmarkStart w:id="12" w:name="_Toc220335990"/>
       <w:r>
+        <w:lastRenderedPageBreak/>
         <w:t>Hierarchy Diagram</w:t>
       </w:r>
       <w:bookmarkEnd w:id="12"/>
@@ -4912,131 +4919,502 @@
       </w:r>
     </w:p>
     <w:p>
-      <w:pPr>
-        <w:pStyle w:val="Heading1"/>
-      </w:pPr>
-      <w:bookmarkStart w:id="13" w:name="_Toc220335991"/>
-      <w:r>
-        <w:t>Risk management plan</w:t>
-      </w:r>
-      <w:bookmarkEnd w:id="13"/>
+      <w:r>
+        <w:drawing>
+          <wp:inline distT="0" distB="0" distL="0" distR="0" wp14:anchorId="000F15BD" wp14:editId="189F6AD0">
+            <wp:extent cx="5731510" cy="5943600"/>
+            <wp:effectExtent l="0" t="0" r="2540" b="0"/>
+            <wp:docPr id="1" name="Picture 1"/>
+            <wp:cNvGraphicFramePr>
+              <a:graphicFrameLocks xmlns:a="http://schemas.openxmlformats.org/drawingml/2006/main" noChangeAspect="1"/>
+            </wp:cNvGraphicFramePr>
+            <a:graphic xmlns:a="http://schemas.openxmlformats.org/drawingml/2006/main">
+              <a:graphicData uri="http://schemas.openxmlformats.org/drawingml/2006/picture">
+                <pic:pic xmlns:pic="http://schemas.openxmlformats.org/drawingml/2006/picture">
+                  <pic:nvPicPr>
+                    <pic:cNvPr id="1" name=""/>
+                    <pic:cNvPicPr/>
+                  </pic:nvPicPr>
+                  <pic:blipFill>
+                    <a:blip r:embed="rId5"/>
+                    <a:stretch>
+                      <a:fillRect/>
+                    </a:stretch>
+                  </pic:blipFill>
+                  <pic:spPr>
+                    <a:xfrm>
+                      <a:off x="0" y="0"/>
+                      <a:ext cx="5731510" cy="5943600"/>
+                    </a:xfrm>
+                    <a:prstGeom prst="rect">
+                      <a:avLst/>
+                    </a:prstGeom>
+                  </pic:spPr>
+                </pic:pic>
+              </a:graphicData>
+            </a:graphic>
+          </wp:inline>
+        </w:drawing>
+      </w:r>
     </w:p>
     <w:p>
-      <w:r>
-        <w:rPr>
-          <w:b/>
-          <w:bCs/>
-        </w:rPr>
-        <w:t>Risk:</w:t>
-      </w:r>
-      <w:r>
-        <w:t xml:space="preserve"> An attacker may use SQL injection to gain unauthorised access to the database.</w:t>
-      </w:r>
+      <w:pPr>
+        <w:pStyle w:val="Heading1"/>
+      </w:pPr>
+      <w:bookmarkStart w:id="13" w:name="_Toc220335991"/>
+      <w:r>
+        <w:t>Risk management plan</w:t>
+      </w:r>
+      <w:bookmarkEnd w:id="13"/>
+      <w:r>
+        <w:t xml:space="preserve"> </w:t>
+      </w:r>
+    </w:p>
+    <w:tbl>
+      <w:tblPr>
+        <w:tblStyle w:val="TableGrid"/>
+        <w:tblW w:w="0" w:type="auto"/>
+        <w:tblLook w:val="04A0" w:firstRow="1" w:lastRow="0" w:firstColumn="1" w:lastColumn="0" w:noHBand="0" w:noVBand="1"/>
+      </w:tblPr>
+      <w:tblGrid>
+        <w:gridCol w:w="4508"/>
+        <w:gridCol w:w="4508"/>
+      </w:tblGrid>
+      <w:tr>
+        <w:tc>
+          <w:tcPr>
+            <w:tcW w:w="4508" w:type="dxa"/>
+          </w:tcPr>
+          <w:p>
+            <w:pPr>
+              <w:rPr>
+                <w:b/>
+                <w:bCs/>
+                <w:u w:val="single"/>
+              </w:rPr>
+            </w:pPr>
+            <w:r>
+              <w:rPr>
+                <w:b/>
+                <w:bCs/>
+                <w:u w:val="single"/>
+              </w:rPr>
+              <w:t>Risk</w:t>
+            </w:r>
+          </w:p>
+        </w:tc>
+        <w:tc>
+          <w:tcPr>
+            <w:tcW w:w="4508" w:type="dxa"/>
+          </w:tcPr>
+          <w:p>
+            <w:pPr>
+              <w:rPr>
+                <w:b/>
+                <w:bCs/>
+                <w:i/>
+                <w:iCs/>
+                <w:u w:val="single"/>
+              </w:rPr>
+            </w:pPr>
+            <w:r>
+              <w:rPr>
+                <w:b/>
+                <w:bCs/>
+                <w:i/>
+                <w:iCs/>
+                <w:u w:val="single"/>
+              </w:rPr>
+              <w:t xml:space="preserve">Mitigation </w:t>
+            </w:r>
+          </w:p>
+        </w:tc>
+      </w:tr>
+      <w:tr>
+        <w:tc>
+          <w:tcPr>
+            <w:tcW w:w="4508" w:type="dxa"/>
+          </w:tcPr>
+          <w:p>
+            <w:r>
+              <w:t xml:space="preserve">An attacker </w:t>
+            </w:r>
+            <w:r>
+              <w:t>could</w:t>
+            </w:r>
+            <w:r>
+              <w:t xml:space="preserve"> attempt to launch a DDOS (Distributed Denial of Service) attack by using botnet to send a multitude of automated requests to purchase a booking, which would overwhelm the system, causing it to crash, resulting in the software becoming temporarily unusable for real users. </w:t>
+            </w:r>
+          </w:p>
+        </w:tc>
+        <w:tc>
+          <w:tcPr>
+            <w:tcW w:w="4508" w:type="dxa"/>
+          </w:tcPr>
+          <w:p>
+            <w:pPr>
+              <w:rPr>
+                <w:i/>
+                <w:iCs/>
+              </w:rPr>
+            </w:pPr>
+            <w:r>
+              <w:rPr>
+                <w:i/>
+                <w:iCs/>
+              </w:rPr>
+              <w:t xml:space="preserve">To mitigate this, </w:t>
+            </w:r>
+            <w:r>
+              <w:rPr>
+                <w:i/>
+                <w:iCs/>
+              </w:rPr>
+              <w:t xml:space="preserve">I will include a two-factor authentication (2FA) to the register system to reduce the likelihood of fake emails being used to register automated bot accounts. I will also make it so the user is required to login/register an account before they can use the services provided by the application. </w:t>
+            </w:r>
+            <w:r>
+              <w:rPr>
+                <w:i/>
+                <w:iCs/>
+              </w:rPr>
+              <w:t xml:space="preserve">While not fully protecting against DDOS </w:t>
+            </w:r>
+            <w:r>
+              <w:rPr>
+                <w:i/>
+                <w:iCs/>
+              </w:rPr>
+              <w:lastRenderedPageBreak/>
+              <w:t xml:space="preserve">attacks, these methods will provide a layer of protection against bot accounts. </w:t>
+            </w:r>
+            <w:r>
+              <w:rPr>
+                <w:i/>
+                <w:iCs/>
+              </w:rPr>
+              <w:t xml:space="preserve"> </w:t>
+            </w:r>
+          </w:p>
+        </w:tc>
+      </w:tr>
+      <w:tr>
+        <w:tc>
+          <w:tcPr>
+            <w:tcW w:w="4508" w:type="dxa"/>
+          </w:tcPr>
+          <w:p>
+            <w:r>
+              <w:lastRenderedPageBreak/>
+              <w:t xml:space="preserve">An attacker may use SQL injection to execute commands to gain unauthorized access to the database which would allow the attacker to view and steal user’s personal data.  </w:t>
+            </w:r>
+          </w:p>
+        </w:tc>
+        <w:tc>
+          <w:tcPr>
+            <w:tcW w:w="4508" w:type="dxa"/>
+          </w:tcPr>
+          <w:p>
+            <w:pPr>
+              <w:rPr>
+                <w:i/>
+                <w:iCs/>
+              </w:rPr>
+            </w:pPr>
+            <w:r>
+              <w:rPr>
+                <w:i/>
+                <w:iCs/>
+              </w:rPr>
+              <w:t xml:space="preserve">To mitigate </w:t>
+            </w:r>
+            <w:r>
+              <w:rPr>
+                <w:i/>
+                <w:iCs/>
+              </w:rPr>
+              <w:t>this,</w:t>
+            </w:r>
+            <w:r>
+              <w:rPr>
+                <w:i/>
+                <w:iCs/>
+              </w:rPr>
+              <w:t xml:space="preserve"> I will be using parameterized queries </w:t>
+            </w:r>
+            <w:r>
+              <w:rPr>
+                <w:i/>
+                <w:iCs/>
+              </w:rPr>
+              <w:t xml:space="preserve">built into ASP.NET MVC to protect against SQL injections, parameterized queries help to separate user input from the query itself, treating malicious executables as normal text entries. </w:t>
+            </w:r>
+          </w:p>
+        </w:tc>
+      </w:tr>
+      <w:tr>
+        <w:tc>
+          <w:tcPr>
+            <w:tcW w:w="4508" w:type="dxa"/>
+          </w:tcPr>
+          <w:p>
+            <w:r>
+              <w:t xml:space="preserve">An attacker may attempt to use a Man-In-The-Middle (MITM) attack to intercept communication without their knowledge or consent, with the intention of stealing their sensitive information, such as login </w:t>
+            </w:r>
+            <w:r>
+              <w:t>credentials</w:t>
+            </w:r>
+            <w:r>
+              <w:t xml:space="preserve"> </w:t>
+            </w:r>
+            <w:r>
+              <w:t>o</w:t>
+            </w:r>
+            <w:r>
+              <w:t>r</w:t>
+            </w:r>
+            <w:r>
+              <w:t xml:space="preserve"> credit card information. </w:t>
+            </w:r>
+            <w:r>
+              <w:t xml:space="preserve"> </w:t>
+            </w:r>
+          </w:p>
+        </w:tc>
+        <w:tc>
+          <w:tcPr>
+            <w:tcW w:w="4508" w:type="dxa"/>
+          </w:tcPr>
+          <w:p>
+            <w:pPr>
+              <w:rPr>
+                <w:i/>
+                <w:iCs/>
+              </w:rPr>
+            </w:pPr>
+            <w:r>
+              <w:rPr>
+                <w:i/>
+                <w:iCs/>
+              </w:rPr>
+              <w:t xml:space="preserve">To mitigate this, </w:t>
+            </w:r>
+            <w:r>
+              <w:rPr>
+                <w:i/>
+                <w:iCs/>
+              </w:rPr>
+              <w:t>I will use strong encryption such as HTTPS</w:t>
+            </w:r>
+            <w:r>
+              <w:rPr>
+                <w:i/>
+                <w:iCs/>
+              </w:rPr>
+              <w:t xml:space="preserve">, MFA (multi-factor authentication) and end-to-end encryption, to prevent attackers from intercepting or altering communications. </w:t>
+            </w:r>
+          </w:p>
+        </w:tc>
+      </w:tr>
+      <w:tr>
+        <w:tc>
+          <w:tcPr>
+            <w:tcW w:w="4508" w:type="dxa"/>
+          </w:tcPr>
+          <w:p>
+            <w:r>
+              <w:t xml:space="preserve">An attacker could use a brute force attack to gain unauthorised access to a user’s account through the use of trial-and-error to guess login credentials. </w:t>
+            </w:r>
+          </w:p>
+        </w:tc>
+        <w:tc>
+          <w:tcPr>
+            <w:tcW w:w="4508" w:type="dxa"/>
+          </w:tcPr>
+          <w:p>
+            <w:pPr>
+              <w:rPr>
+                <w:i/>
+                <w:iCs/>
+              </w:rPr>
+            </w:pPr>
+            <w:r>
+              <w:rPr>
+                <w:i/>
+                <w:iCs/>
+              </w:rPr>
+              <w:t xml:space="preserve">To mitigate this, I would enforce strict password policies such as a minimum character limit, include at least one number or symbol, have a minimum of one uppercase letter, etc. This ensures that the users’ passwords are strong and cannot be guessed easily. </w:t>
+            </w:r>
+          </w:p>
+        </w:tc>
+      </w:tr>
+    </w:tbl>
+    <w:p/>
+    <w:p/>
+    <w:p>
+      <w:pPr>
+        <w:pStyle w:val="Heading1"/>
+      </w:pPr>
+      <w:bookmarkStart w:id="14" w:name="_Toc220335992"/>
+      <w:r>
+        <w:t>UI Considerations</w:t>
+      </w:r>
+      <w:bookmarkEnd w:id="14"/>
     </w:p>
     <w:p>
       <w:r>
-        <w:rPr>
-          <w:b/>
-          <w:bCs/>
-        </w:rPr>
-        <w:t>Mitigation:</w:t>
+        <w:t xml:space="preserve">Some key aspects I have considered for the design phase of the solution are the colour scheme, fonts, and images. </w:t>
+      </w:r>
+      <w:r>
+        <w:t xml:space="preserve">For the overall </w:t>
+      </w:r>
+      <w:r>
+        <w:t xml:space="preserve">appearance </w:t>
+      </w:r>
+      <w:r>
+        <w:t xml:space="preserve">of the </w:t>
+      </w:r>
+      <w:r>
+        <w:t>application,</w:t>
+      </w:r>
+      <w:r>
+        <w:t xml:space="preserve"> I plan to use</w:t>
+      </w:r>
+      <w:r>
+        <w:t xml:space="preserve"> a</w:t>
+      </w:r>
+      <w:r>
+        <w:t xml:space="preserve"> more neutral </w:t>
+      </w:r>
+      <w:r>
+        <w:t>pallet</w:t>
+      </w:r>
+      <w:r>
+        <w:t xml:space="preserve"> </w:t>
+      </w:r>
+      <w:r>
+        <w:t>as there is no</w:t>
+      </w:r>
+      <w:r>
+        <w:t>t one</w:t>
+      </w:r>
+      <w:r>
+        <w:t xml:space="preserve"> specific theme for the business,</w:t>
+      </w:r>
+      <w:r>
+        <w:t xml:space="preserve"> using a neutral colour scheme allows for the website to look appropriate in all scenarios.</w:t>
+      </w:r>
+      <w:r>
+        <w:t xml:space="preserve"> I plan to utilize colours </w:t>
+      </w:r>
+      <w:r>
+        <w:t xml:space="preserve">such as a light beige </w:t>
+      </w:r>
+      <w:r>
+        <w:t xml:space="preserve">for the background </w:t>
+      </w:r>
+      <w:r>
+        <w:t xml:space="preserve">with darker </w:t>
+      </w:r>
+      <w:r>
+        <w:t xml:space="preserve">toned </w:t>
+      </w:r>
+      <w:r>
+        <w:t xml:space="preserve">accent colours for buttons and </w:t>
+      </w:r>
+      <w:r>
+        <w:t xml:space="preserve">a </w:t>
+      </w:r>
+      <w:r>
+        <w:t xml:space="preserve">lightly </w:t>
+      </w:r>
+      <w:r>
+        <w:t>darker beige for any containers.</w:t>
+      </w:r>
+      <w:r>
+        <w:t xml:space="preserve"> I intend to utilize spacing appropriately to ensure that key elements of the website are defined and keeping the overview of the website pleasing to the </w:t>
+      </w:r>
+      <w:r>
+        <w:t>user’s</w:t>
+      </w:r>
+      <w:r>
+        <w:t xml:space="preserve"> eye.</w:t>
+      </w:r>
+      <w:r>
+        <w:t xml:space="preserve"> Furthermore, I have chosen to use Franklin Gothic as my font due to its clean and slender appearance which helps to represent the professional aspect of the design</w:t>
+      </w:r>
+      <w:r>
+        <w:t>, I have chosen to use this font throughout all of the information within the site to maintain consistency and ensure readability.</w:t>
+      </w:r>
+      <w:r>
+        <w:t xml:space="preserve"> </w:t>
+      </w:r>
+      <w:r>
+        <w:t xml:space="preserve"> </w:t>
+      </w:r>
+      <w:r>
+        <w:t>I will consistently use appropriate, professional images across the web application, ensuring that the graphics chosen are appropriate to the content displayed within my site</w:t>
+      </w:r>
+      <w:r>
+        <w:t xml:space="preserve">. </w:t>
+      </w:r>
+      <w:r>
+        <w:t xml:space="preserve"> </w:t>
+      </w:r>
+      <w:r>
+        <w:t>T</w:t>
+      </w:r>
+      <w:r>
+        <w:t xml:space="preserve">his will display a level of maturity and professionalism, allowing the user to trust the application. </w:t>
       </w:r>
     </w:p>
     <w:p>
-      <w:r>
-        <w:rPr>
-          <w:b/>
-          <w:bCs/>
-        </w:rPr>
+      <w:pPr>
+        <w:pStyle w:val="Heading1"/>
+      </w:pPr>
+      <w:bookmarkStart w:id="15" w:name="_Toc220335993"/>
+      <w:r>
         <w:lastRenderedPageBreak/>
-        <w:t>Risk:</w:t>
-      </w:r>
-      <w:r>
-        <w:t xml:space="preserve"> An attacker may </w:t>
-      </w:r>
-      <w:r>
-        <w:t>attempt</w:t>
-      </w:r>
-      <w:r>
-        <w:t xml:space="preserve"> to use a Man-In-The-Middle (MITM) attack to phish for unencrypted credentials.</w:t>
-      </w:r>
-    </w:p>
-    <w:p>
-      <w:r>
-        <w:rPr>
-          <w:b/>
-          <w:bCs/>
-        </w:rPr>
-        <w:t>Mitigation:</w:t>
-      </w:r>
-      <w:r>
-        <w:t xml:space="preserve"> </w:t>
-      </w:r>
-    </w:p>
-    <w:p>
-      <w:r>
-        <w:rPr>
-          <w:b/>
-          <w:bCs/>
-        </w:rPr>
-        <w:t>Risk:</w:t>
-      </w:r>
-      <w:r>
-        <w:t xml:space="preserve"> An attacker may DDoS the solution.</w:t>
-      </w:r>
-    </w:p>
-    <w:p>
-      <w:r>
-        <w:rPr>
-          <w:b/>
-          <w:bCs/>
-        </w:rPr>
-        <w:t>Mitigation:</w:t>
-      </w:r>
-      <w:r>
-        <w:t xml:space="preserve"> </w:t>
-      </w:r>
-    </w:p>
-    <w:p/>
-    <w:p>
-      <w:pPr>
-        <w:pStyle w:val="Heading1"/>
-      </w:pPr>
-      <w:bookmarkStart w:id="14" w:name="_Toc220335992"/>
-      <w:r>
-        <w:t>UI Considerations</w:t>
-      </w:r>
-      <w:bookmarkEnd w:id="14"/>
-    </w:p>
-    <w:p/>
-    <w:p>
-      <w:pPr>
-        <w:pStyle w:val="Heading1"/>
-      </w:pPr>
-      <w:bookmarkStart w:id="15" w:name="_Toc220335993"/>
-      <w:r>
         <w:t>Legal</w:t>
       </w:r>
       <w:bookmarkEnd w:id="15"/>
     </w:p>
     <w:p>
       <w:r>
-        <w:t xml:space="preserve">WCAG - </w:t>
-      </w:r>
-      <w:r>
-        <w:t>Web Content Accessibility Guidelines </w:t>
+        <w:t>Due to the large number of users that will use this site it is important for the application to include accessibility features to support all users when complying with the WCAG – Web Content and Accessibility</w:t>
+      </w:r>
+      <w:r>
+        <w:t xml:space="preserve"> Guidelines. This includes implementing a text size slider and text-to-speech, as well as various colour filters and language options to support users when interacting with and accessing content provided by the site, as well as making the software easier to use and providing a better overall user experience. </w:t>
       </w:r>
     </w:p>
     <w:p>
       <w:r>
-        <w:t>GDPR – General Data Protection Regulations</w:t>
+        <w:t>When a user registers an account to use this platform, their personal data is collected and stored on a database. The collection of this data requires the website to comply with various laws, including the Data Protection Act and GDPR. This will be done by ensuring that data is secured through the use of password hashing and SSL encryption</w:t>
+      </w:r>
+      <w:r>
+        <w:t xml:space="preserve">, this ensure that user data is handled correctly and their accounts are secure. As stated by the GDPR, an organization must maintain lawfulness, fairness, and transparency when collecting a user’s data, to comply with these principles the website must also include a privacy policy to inform the user on how </w:t>
+      </w:r>
+      <w:r>
+        <w:t>the website and company will use their data, and inform them on their rights regarding the processing and transferral of their data. The website will make use of opt-in via the use of cookies, meaning that the user will be given an in-site pop up asking them if they wish to accept or decline cookies. This ensures that the platform has consent before collecting the user data, which can be withdrawn at any time</w:t>
+      </w:r>
+      <w:r>
+        <w:t>.</w:t>
       </w:r>
     </w:p>
     <w:p>
       <w:r>
-        <w:t>DPA – Data Protection Act</w:t>
+        <w:t xml:space="preserve">Furthermore, the website will include a terms and conditions pop up as it will limit legal liability of the website if anything happens to the </w:t>
+      </w:r>
+      <w:r>
+        <w:t>user’s</w:t>
+      </w:r>
+      <w:r>
+        <w:t xml:space="preserve"> data. The company may be able to dispute any claims made </w:t>
+      </w:r>
+      <w:r>
+        <w:t xml:space="preserve">towards them as they are disclosed in the terms and conditions, it allows the company to legally prohibit acts like spam which would reduce the likelihood of it occurring. Finally, this ensures compliance with both the GDPR and DPA as it informs users of any data being collected. </w:t>
       </w:r>
     </w:p>
+    <w:p/>
     <w:sectPr>
       <w:pgSz w:w="11906" w:h="16838"/>
       <w:pgMar w:top="1440" w:right="1440" w:bottom="1440" w:left="1440" w:header="708" w:footer="708" w:gutter="0"/>
@@ -5050,7 +5428,7 @@
 </file>
 
 <file path=word/numbering.xml><?xml version="1.0" encoding="utf-8"?>
-<w:numbering xmlns:wpc="http://schemas.microsoft.com/office/word/2010/wordprocessingCanvas" xmlns:cx="http://schemas.microsoft.com/office/drawing/2014/chartex" xmlns:cx1="http://schemas.microsoft.com/office/drawing/2015/9/8/chartex" xmlns:cx2="http://schemas.microsoft.com/office/drawing/2015/10/21/chartex" xmlns:cx3="http://schemas.microsoft.com/office/drawing/2016/5/9/chartex" xmlns:cx4="http://schemas.microsoft.com/office/drawing/2016/5/10/chartex" xmlns:cx5="http://schemas.microsoft.com/office/drawing/2016/5/11/chartex" xmlns:cx6="http://schemas.microsoft.com/office/drawing/2016/5/12/chartex" xmlns:cx7="http://schemas.microsoft.com/office/drawing/2016/5/13/chartex" xmlns:cx8="http://schemas.microsoft.com/office/drawing/2016/5/14/chartex" xmlns:mc="http://schemas.openxmlformats.org/markup-compatibility/2006" xmlns:aink="http://schemas.microsoft.com/office/drawing/2016/ink" xmlns:am3d="http://schemas.microsoft.com/office/drawing/2017/model3d" xmlns:o="urn:schemas-microsoft-com:office:office" xmlns:oel="http://schemas.microsoft.com/office/2019/extlst" xmlns:r="http://schemas.openxmlformats.org/officeDocument/2006/relationships" xmlns:m="http://schemas.openxmlformats.org/officeDocument/2006/math" xmlns:v="urn:schemas-microsoft-com:vml" xmlns:wp14="http://schemas.microsoft.com/office/word/2010/wordprocessingDrawing" xmlns:wp="http://schemas.openxmlformats.org/drawingml/2006/wordprocessingDrawing" xmlns:w10="urn:schemas-microsoft-com:office:word" xmlns:w="http://schemas.openxmlformats.org/wordprocessingml/2006/main" xmlns:w14="http://schemas.microsoft.com/office/word/2010/wordml" xmlns:w15="http://schemas.microsoft.com/office/word/2012/wordml" xmlns:w16cex="http://schemas.microsoft.com/office/word/2018/wordml/cex" xmlns:w16cid="http://schemas.microsoft.com/office/word/2016/wordml/cid" xmlns:w16="http://schemas.microsoft.com/office/word/2018/wordml" xmlns:w16du="http://schemas.microsoft.com/office/word/2023/wordml/word16du" xmlns:w16sdtdh="http://schemas.microsoft.com/office/word/2020/wordml/sdtdatahash" xmlns:w16sdtfl="http://schemas.microsoft.com/office/word/2024/wordml/sdtformatlock" xmlns:w16se="http://schemas.microsoft.com/office/word/2015/wordml/symex" xmlns:wpg="http://schemas.microsoft.com/office/word/2010/wordprocessingGroup" xmlns:wpi="http://schemas.microsoft.com/office/word/2010/wordprocessingInk" xmlns:wne="http://schemas.microsoft.com/office/word/2006/wordml" xmlns:wps="http://schemas.microsoft.com/office/word/2010/wordprocessingShape" mc:Ignorable="w14 w15 w16se w16cid w16 w16cex w16sdtdh w16sdtfl w16du wp14">
+<w:numbering xmlns:wpc="http://schemas.microsoft.com/office/word/2010/wordprocessingCanvas" xmlns:cx="http://schemas.microsoft.com/office/drawing/2014/chartex" xmlns:cx1="http://schemas.microsoft.com/office/drawing/2015/9/8/chartex" xmlns:cx2="http://schemas.microsoft.com/office/drawing/2015/10/21/chartex" xmlns:cx3="http://schemas.microsoft.com/office/drawing/2016/5/9/chartex" xmlns:cx4="http://schemas.microsoft.com/office/drawing/2016/5/10/chartex" xmlns:cx5="http://schemas.microsoft.com/office/drawing/2016/5/11/chartex" xmlns:cx6="http://schemas.microsoft.com/office/drawing/2016/5/12/chartex" xmlns:cx7="http://schemas.microsoft.com/office/drawing/2016/5/13/chartex" xmlns:cx8="http://schemas.microsoft.com/office/drawing/2016/5/14/chartex" xmlns:mc="http://schemas.openxmlformats.org/markup-compatibility/2006" xmlns:aink="http://schemas.microsoft.com/office/drawing/2016/ink" xmlns:am3d="http://schemas.microsoft.com/office/drawing/2017/model3d" xmlns:o="urn:schemas-microsoft-com:office:office" xmlns:r="http://schemas.openxmlformats.org/officeDocument/2006/relationships" xmlns:m="http://schemas.openxmlformats.org/officeDocument/2006/math" xmlns:v="urn:schemas-microsoft-com:vml" xmlns:wp14="http://schemas.microsoft.com/office/word/2010/wordprocessingDrawing" xmlns:wp="http://schemas.openxmlformats.org/drawingml/2006/wordprocessingDrawing" xmlns:w10="urn:schemas-microsoft-com:office:word" xmlns:w="http://schemas.openxmlformats.org/wordprocessingml/2006/main" xmlns:w14="http://schemas.microsoft.com/office/word/2010/wordml" xmlns:w15="http://schemas.microsoft.com/office/word/2012/wordml" xmlns:w16cex="http://schemas.microsoft.com/office/word/2018/wordml/cex" xmlns:w16cid="http://schemas.microsoft.com/office/word/2016/wordml/cid" xmlns:w16="http://schemas.microsoft.com/office/word/2018/wordml" xmlns:w16sdtdh="http://schemas.microsoft.com/office/word/2020/wordml/sdtdatahash" xmlns:w16se="http://schemas.microsoft.com/office/word/2015/wordml/symex" xmlns:wpg="http://schemas.microsoft.com/office/word/2010/wordprocessingGroup" xmlns:wpi="http://schemas.microsoft.com/office/word/2010/wordprocessingInk" xmlns:wne="http://schemas.microsoft.com/office/word/2006/wordml" xmlns:wps="http://schemas.microsoft.com/office/word/2010/wordprocessingShape" mc:Ignorable="w14 w15 w16se w16cid w16 w16cex w16sdtdh wp14">
   <w:abstractNum w:abstractNumId="0" w15:restartNumberingAfterBreak="0">
     <w:nsid w:val="07267E38"/>
     <w:multiLevelType w:val="hybridMultilevel"/>
@@ -6545,59 +6923,59 @@
       </w:pPr>
     </w:lvl>
   </w:abstractNum>
-  <w:num w:numId="1" w16cid:durableId="2023239908">
+  <w:num w:numId="1">
     <w:abstractNumId w:val="1"/>
   </w:num>
-  <w:num w:numId="2" w16cid:durableId="1394083679">
+  <w:num w:numId="2">
     <w:abstractNumId w:val="5"/>
   </w:num>
-  <w:num w:numId="3" w16cid:durableId="1068304247">
+  <w:num w:numId="3">
     <w:abstractNumId w:val="15"/>
   </w:num>
-  <w:num w:numId="4" w16cid:durableId="1350257287">
+  <w:num w:numId="4">
     <w:abstractNumId w:val="2"/>
   </w:num>
-  <w:num w:numId="5" w16cid:durableId="512719580">
+  <w:num w:numId="5">
     <w:abstractNumId w:val="9"/>
   </w:num>
-  <w:num w:numId="6" w16cid:durableId="1848128392">
+  <w:num w:numId="6">
     <w:abstractNumId w:val="12"/>
   </w:num>
-  <w:num w:numId="7" w16cid:durableId="1219973215">
+  <w:num w:numId="7">
     <w:abstractNumId w:val="11"/>
   </w:num>
-  <w:num w:numId="8" w16cid:durableId="8064703">
+  <w:num w:numId="8">
     <w:abstractNumId w:val="10"/>
   </w:num>
-  <w:num w:numId="9" w16cid:durableId="837382859">
+  <w:num w:numId="9">
     <w:abstractNumId w:val="13"/>
   </w:num>
-  <w:num w:numId="10" w16cid:durableId="1745907453">
+  <w:num w:numId="10">
     <w:abstractNumId w:val="14"/>
   </w:num>
-  <w:num w:numId="11" w16cid:durableId="139466877">
+  <w:num w:numId="11">
     <w:abstractNumId w:val="7"/>
   </w:num>
-  <w:num w:numId="12" w16cid:durableId="40789684">
+  <w:num w:numId="12">
     <w:abstractNumId w:val="4"/>
   </w:num>
-  <w:num w:numId="13" w16cid:durableId="1784811509">
+  <w:num w:numId="13">
     <w:abstractNumId w:val="3"/>
   </w:num>
-  <w:num w:numId="14" w16cid:durableId="311638086">
+  <w:num w:numId="14">
     <w:abstractNumId w:val="0"/>
   </w:num>
-  <w:num w:numId="15" w16cid:durableId="401370222">
+  <w:num w:numId="15">
     <w:abstractNumId w:val="8"/>
   </w:num>
-  <w:num w:numId="16" w16cid:durableId="541786702">
+  <w:num w:numId="16">
     <w:abstractNumId w:val="6"/>
   </w:num>
 </w:numbering>
 </file>
 
 <file path=word/styles.xml><?xml version="1.0" encoding="utf-8"?>
-<w:styles xmlns:mc="http://schemas.openxmlformats.org/markup-compatibility/2006" xmlns:r="http://schemas.openxmlformats.org/officeDocument/2006/relationships" xmlns:w="http://schemas.openxmlformats.org/wordprocessingml/2006/main" xmlns:w14="http://schemas.microsoft.com/office/word/2010/wordml" xmlns:w15="http://schemas.microsoft.com/office/word/2012/wordml" xmlns:w16cex="http://schemas.microsoft.com/office/word/2018/wordml/cex" xmlns:w16cid="http://schemas.microsoft.com/office/word/2016/wordml/cid" xmlns:w16="http://schemas.microsoft.com/office/word/2018/wordml" xmlns:w16du="http://schemas.microsoft.com/office/word/2023/wordml/word16du" xmlns:w16sdtdh="http://schemas.microsoft.com/office/word/2020/wordml/sdtdatahash" xmlns:w16sdtfl="http://schemas.microsoft.com/office/word/2024/wordml/sdtformatlock" xmlns:w16se="http://schemas.microsoft.com/office/word/2015/wordml/symex" mc:Ignorable="w14 w15 w16se w16cid w16 w16cex w16sdtdh w16sdtfl w16du">
+<w:styles xmlns:mc="http://schemas.openxmlformats.org/markup-compatibility/2006" xmlns:r="http://schemas.openxmlformats.org/officeDocument/2006/relationships" xmlns:w="http://schemas.openxmlformats.org/wordprocessingml/2006/main" xmlns:w14="http://schemas.microsoft.com/office/word/2010/wordml" xmlns:w15="http://schemas.microsoft.com/office/word/2012/wordml" xmlns:w16cex="http://schemas.microsoft.com/office/word/2018/wordml/cex" xmlns:w16cid="http://schemas.microsoft.com/office/word/2016/wordml/cid" xmlns:w16="http://schemas.microsoft.com/office/word/2018/wordml" xmlns:w16sdtdh="http://schemas.microsoft.com/office/word/2020/wordml/sdtdatahash" xmlns:w16se="http://schemas.microsoft.com/office/word/2015/wordml/symex" mc:Ignorable="w14 w15 w16se w16cid w16 w16cex w16sdtdh">
   <w:docDefaults>
     <w:rPrDefault>
       <w:rPr>
@@ -7198,6 +7576,7 @@
   <w:style w:type="character" w:default="1" w:styleId="DefaultParagraphFont">
     <w:name w:val="Default Paragraph Font"/>
     <w:uiPriority w:val="1"/>
+    <w:semiHidden/>
     <w:unhideWhenUsed/>
   </w:style>
   <w:style w:type="table" w:default="1" w:styleId="TableNormal">
@@ -7622,7 +8001,7 @@
 </file>
 
 <file path=word/glossary/document.xml><?xml version="1.0" encoding="utf-8"?>
-<w:glossaryDocument xmlns:wpc="http://schemas.microsoft.com/office/word/2010/wordprocessingCanvas" xmlns:cx="http://schemas.microsoft.com/office/drawing/2014/chartex" xmlns:cx1="http://schemas.microsoft.com/office/drawing/2015/9/8/chartex" xmlns:cx2="http://schemas.microsoft.com/office/drawing/2015/10/21/chartex" xmlns:cx3="http://schemas.microsoft.com/office/drawing/2016/5/9/chartex" xmlns:cx4="http://schemas.microsoft.com/office/drawing/2016/5/10/chartex" xmlns:cx5="http://schemas.microsoft.com/office/drawing/2016/5/11/chartex" xmlns:cx6="http://schemas.microsoft.com/office/drawing/2016/5/12/chartex" xmlns:cx7="http://schemas.microsoft.com/office/drawing/2016/5/13/chartex" xmlns:cx8="http://schemas.microsoft.com/office/drawing/2016/5/14/chartex" xmlns:mc="http://schemas.openxmlformats.org/markup-compatibility/2006" xmlns:aink="http://schemas.microsoft.com/office/drawing/2016/ink" xmlns:am3d="http://schemas.microsoft.com/office/drawing/2017/model3d" xmlns:o="urn:schemas-microsoft-com:office:office" xmlns:oel="http://schemas.microsoft.com/office/2019/extlst" xmlns:r="http://schemas.openxmlformats.org/officeDocument/2006/relationships" xmlns:m="http://schemas.openxmlformats.org/officeDocument/2006/math" xmlns:v="urn:schemas-microsoft-com:vml" xmlns:wp14="http://schemas.microsoft.com/office/word/2010/wordprocessingDrawing" xmlns:wp="http://schemas.openxmlformats.org/drawingml/2006/wordprocessingDrawing" xmlns:w10="urn:schemas-microsoft-com:office:word" xmlns:w="http://schemas.openxmlformats.org/wordprocessingml/2006/main" xmlns:w14="http://schemas.microsoft.com/office/word/2010/wordml" xmlns:w15="http://schemas.microsoft.com/office/word/2012/wordml" xmlns:w16cex="http://schemas.microsoft.com/office/word/2018/wordml/cex" xmlns:w16cid="http://schemas.microsoft.com/office/word/2016/wordml/cid" xmlns:w16="http://schemas.microsoft.com/office/word/2018/wordml" xmlns:w16du="http://schemas.microsoft.com/office/word/2023/wordml/word16du" xmlns:w16sdtdh="http://schemas.microsoft.com/office/word/2020/wordml/sdtdatahash" xmlns:w16sdtfl="http://schemas.microsoft.com/office/word/2024/wordml/sdtformatlock" xmlns:w16se="http://schemas.microsoft.com/office/word/2015/wordml/symex" xmlns:wpg="http://schemas.microsoft.com/office/word/2010/wordprocessingGroup" xmlns:wpi="http://schemas.microsoft.com/office/word/2010/wordprocessingInk" xmlns:wne="http://schemas.microsoft.com/office/word/2006/wordml" xmlns:wps="http://schemas.microsoft.com/office/word/2010/wordprocessingShape" mc:Ignorable="w14 w15 w16se w16cid w16 w16cex w16sdtdh w16sdtfl w16du wp14">
+<w:glossaryDocument xmlns:wpc="http://schemas.microsoft.com/office/word/2010/wordprocessingCanvas" xmlns:cx="http://schemas.microsoft.com/office/drawing/2014/chartex" xmlns:cx1="http://schemas.microsoft.com/office/drawing/2015/9/8/chartex" xmlns:cx2="http://schemas.microsoft.com/office/drawing/2015/10/21/chartex" xmlns:cx3="http://schemas.microsoft.com/office/drawing/2016/5/9/chartex" xmlns:cx4="http://schemas.microsoft.com/office/drawing/2016/5/10/chartex" xmlns:cx5="http://schemas.microsoft.com/office/drawing/2016/5/11/chartex" xmlns:cx6="http://schemas.microsoft.com/office/drawing/2016/5/12/chartex" xmlns:cx7="http://schemas.microsoft.com/office/drawing/2016/5/13/chartex" xmlns:cx8="http://schemas.microsoft.com/office/drawing/2016/5/14/chartex" xmlns:mc="http://schemas.openxmlformats.org/markup-compatibility/2006" xmlns:aink="http://schemas.microsoft.com/office/drawing/2016/ink" xmlns:am3d="http://schemas.microsoft.com/office/drawing/2017/model3d" xmlns:o="urn:schemas-microsoft-com:office:office" xmlns:r="http://schemas.openxmlformats.org/officeDocument/2006/relationships" xmlns:m="http://schemas.openxmlformats.org/officeDocument/2006/math" xmlns:v="urn:schemas-microsoft-com:vml" xmlns:wp14="http://schemas.microsoft.com/office/word/2010/wordprocessingDrawing" xmlns:wp="http://schemas.openxmlformats.org/drawingml/2006/wordprocessingDrawing" xmlns:w10="urn:schemas-microsoft-com:office:word" xmlns:w="http://schemas.openxmlformats.org/wordprocessingml/2006/main" xmlns:w14="http://schemas.microsoft.com/office/word/2010/wordml" xmlns:w15="http://schemas.microsoft.com/office/word/2012/wordml" xmlns:w16cex="http://schemas.microsoft.com/office/word/2018/wordml/cex" xmlns:w16cid="http://schemas.microsoft.com/office/word/2016/wordml/cid" xmlns:w16="http://schemas.microsoft.com/office/word/2018/wordml" xmlns:w16sdtdh="http://schemas.microsoft.com/office/word/2020/wordml/sdtdatahash" xmlns:w16se="http://schemas.microsoft.com/office/word/2015/wordml/symex" xmlns:wpg="http://schemas.microsoft.com/office/word/2010/wordprocessingGroup" xmlns:wpi="http://schemas.microsoft.com/office/word/2010/wordprocessingInk" xmlns:wne="http://schemas.microsoft.com/office/word/2006/wordml" xmlns:wps="http://schemas.microsoft.com/office/word/2010/wordprocessingShape" mc:Ignorable="w14 w15 w16se w16cid w16 w16cex w16sdtdh wp14">
   <w:docParts>
     <w:docPart>
       <w:docPartPr>
@@ -7648,7 +8027,7 @@
             <w:rPr>
               <w:rFonts w:asciiTheme="majorHAnsi" w:eastAsiaTheme="majorEastAsia" w:hAnsiTheme="majorHAnsi" w:cstheme="majorBidi"/>
               <w:caps/>
-              <w:color w:val="156082" w:themeColor="accent1"/>
+              <w:color w:val="4472C4" w:themeColor="accent1"/>
               <w:sz w:val="80"/>
               <w:szCs w:val="80"/>
             </w:rPr>
@@ -7679,7 +8058,7 @@
           </w:pPr>
           <w:r>
             <w:rPr>
-              <w:color w:val="156082" w:themeColor="accent1"/>
+              <w:color w:val="4472C4" w:themeColor="accent1"/>
               <w:sz w:val="28"/>
               <w:szCs w:val="28"/>
             </w:rPr>
@@ -7693,7 +8072,7 @@
 </file>
 
 <file path=word/glossary/fontTable.xml><?xml version="1.0" encoding="utf-8"?>
-<w:fonts xmlns:mc="http://schemas.openxmlformats.org/markup-compatibility/2006" xmlns:r="http://schemas.openxmlformats.org/officeDocument/2006/relationships" xmlns:w="http://schemas.openxmlformats.org/wordprocessingml/2006/main" xmlns:w14="http://schemas.microsoft.com/office/word/2010/wordml" xmlns:w15="http://schemas.microsoft.com/office/word/2012/wordml" xmlns:w16cex="http://schemas.microsoft.com/office/word/2018/wordml/cex" xmlns:w16cid="http://schemas.microsoft.com/office/word/2016/wordml/cid" xmlns:w16="http://schemas.microsoft.com/office/word/2018/wordml" xmlns:w16du="http://schemas.microsoft.com/office/word/2023/wordml/word16du" xmlns:w16sdtdh="http://schemas.microsoft.com/office/word/2020/wordml/sdtdatahash" xmlns:w16sdtfl="http://schemas.microsoft.com/office/word/2024/wordml/sdtformatlock" xmlns:w16se="http://schemas.microsoft.com/office/word/2015/wordml/symex" mc:Ignorable="w14 w15 w16se w16cid w16 w16cex w16sdtdh w16sdtfl w16du">
+<w:fonts xmlns:mc="http://schemas.openxmlformats.org/markup-compatibility/2006" xmlns:r="http://schemas.openxmlformats.org/officeDocument/2006/relationships" xmlns:w="http://schemas.openxmlformats.org/wordprocessingml/2006/main" xmlns:w14="http://schemas.microsoft.com/office/word/2010/wordml" xmlns:w15="http://schemas.microsoft.com/office/word/2012/wordml" xmlns:w16cex="http://schemas.microsoft.com/office/word/2018/wordml/cex" xmlns:w16cid="http://schemas.microsoft.com/office/word/2016/wordml/cid" xmlns:w16="http://schemas.microsoft.com/office/word/2018/wordml" xmlns:w16sdtdh="http://schemas.microsoft.com/office/word/2020/wordml/sdtdatahash" xmlns:w16se="http://schemas.microsoft.com/office/word/2015/wordml/symex" mc:Ignorable="w14 w15 w16se w16cid w16 w16cex w16sdtdh">
   <w:font w:name="Times New Roman">
     <w:panose1 w:val="02020603050405020304"/>
     <w:charset w:val="00"/>
@@ -7702,6 +8081,7 @@
     <w:sig w:usb0="E0002EFF" w:usb1="C000785B" w:usb2="00000009" w:usb3="00000000" w:csb0="000001FF" w:csb1="00000000"/>
   </w:font>
   <w:font w:name="Aptos">
+    <w:altName w:val="Calibri"/>
     <w:charset w:val="00"/>
     <w:family w:val="swiss"/>
     <w:pitch w:val="variable"/>
@@ -7729,16 +8109,31 @@
     <w:sig w:usb0="00000000" w:usb1="10000000" w:usb2="00000000" w:usb3="00000000" w:csb0="80000000" w:csb1="00000000"/>
   </w:font>
   <w:font w:name="Aptos Display">
+    <w:altName w:val="Calibri"/>
     <w:charset w:val="00"/>
     <w:family w:val="swiss"/>
     <w:pitch w:val="variable"/>
     <w:sig w:usb0="20000287" w:usb1="00000003" w:usb2="00000000" w:usb3="00000000" w:csb0="0000019F" w:csb1="00000000"/>
   </w:font>
+  <w:font w:name="Calibri">
+    <w:panose1 w:val="020F0502020204030204"/>
+    <w:charset w:val="00"/>
+    <w:family w:val="swiss"/>
+    <w:pitch w:val="variable"/>
+    <w:sig w:usb0="E4002EFF" w:usb1="C200247B" w:usb2="00000009" w:usb3="00000000" w:csb0="000001FF" w:csb1="00000000"/>
+  </w:font>
+  <w:font w:name="Calibri Light">
+    <w:panose1 w:val="020F0302020204030204"/>
+    <w:charset w:val="00"/>
+    <w:family w:val="swiss"/>
+    <w:pitch w:val="variable"/>
+    <w:sig w:usb0="E4002EFF" w:usb1="C200247B" w:usb2="00000009" w:usb3="00000000" w:csb0="000001FF" w:csb1="00000000"/>
+  </w:font>
 </w:fonts>
 </file>
 
 <file path=word/glossary/settings.xml><?xml version="1.0" encoding="utf-8"?>
-<w:settings xmlns:mc="http://schemas.openxmlformats.org/markup-compatibility/2006" xmlns:o="urn:schemas-microsoft-com:office:office" xmlns:r="http://schemas.openxmlformats.org/officeDocument/2006/relationships" xmlns:m="http://schemas.openxmlformats.org/officeDocument/2006/math" xmlns:v="urn:schemas-microsoft-com:vml" xmlns:w10="urn:schemas-microsoft-com:office:word" xmlns:w="http://schemas.openxmlformats.org/wordprocessingml/2006/main" xmlns:w14="http://schemas.microsoft.com/office/word/2010/wordml" xmlns:w15="http://schemas.microsoft.com/office/word/2012/wordml" xmlns:w16cex="http://schemas.microsoft.com/office/word/2018/wordml/cex" xmlns:w16cid="http://schemas.microsoft.com/office/word/2016/wordml/cid" xmlns:w16="http://schemas.microsoft.com/office/word/2018/wordml" xmlns:w16du="http://schemas.microsoft.com/office/word/2023/wordml/word16du" xmlns:w16sdtdh="http://schemas.microsoft.com/office/word/2020/wordml/sdtdatahash" xmlns:w16sdtfl="http://schemas.microsoft.com/office/word/2024/wordml/sdtformatlock" xmlns:w16se="http://schemas.microsoft.com/office/word/2015/wordml/symex" xmlns:sl="http://schemas.openxmlformats.org/schemaLibrary/2006/main" mc:Ignorable="w14 w15 w16se w16cid w16 w16cex w16sdtdh w16sdtfl w16du">
+<w:settings xmlns:mc="http://schemas.openxmlformats.org/markup-compatibility/2006" xmlns:o="urn:schemas-microsoft-com:office:office" xmlns:r="http://schemas.openxmlformats.org/officeDocument/2006/relationships" xmlns:m="http://schemas.openxmlformats.org/officeDocument/2006/math" xmlns:v="urn:schemas-microsoft-com:vml" xmlns:w10="urn:schemas-microsoft-com:office:word" xmlns:w="http://schemas.openxmlformats.org/wordprocessingml/2006/main" xmlns:w14="http://schemas.microsoft.com/office/word/2010/wordml" xmlns:w15="http://schemas.microsoft.com/office/word/2012/wordml" xmlns:w16cex="http://schemas.microsoft.com/office/word/2018/wordml/cex" xmlns:w16cid="http://schemas.microsoft.com/office/word/2016/wordml/cid" xmlns:w16="http://schemas.microsoft.com/office/word/2018/wordml" xmlns:w16sdtdh="http://schemas.microsoft.com/office/word/2020/wordml/sdtdatahash" xmlns:w16se="http://schemas.microsoft.com/office/word/2015/wordml/symex" xmlns:sl="http://schemas.openxmlformats.org/schemaLibrary/2006/main" mc:Ignorable="w14 w15 w16se w16cid w16 w16cex w16sdtdh">
   <w:view w:val="normal"/>
   <w:defaultTabStop w:val="720"/>
   <w:characterSpacingControl w:val="doNotCompress"/>
@@ -7781,7 +8176,7 @@
 </file>
 
 <file path=word/glossary/styles.xml><?xml version="1.0" encoding="utf-8"?>
-<w:styles xmlns:mc="http://schemas.openxmlformats.org/markup-compatibility/2006" xmlns:r="http://schemas.openxmlformats.org/officeDocument/2006/relationships" xmlns:w="http://schemas.openxmlformats.org/wordprocessingml/2006/main" xmlns:w14="http://schemas.microsoft.com/office/word/2010/wordml" xmlns:w15="http://schemas.microsoft.com/office/word/2012/wordml" xmlns:w16cex="http://schemas.microsoft.com/office/word/2018/wordml/cex" xmlns:w16cid="http://schemas.microsoft.com/office/word/2016/wordml/cid" xmlns:w16="http://schemas.microsoft.com/office/word/2018/wordml" xmlns:w16du="http://schemas.microsoft.com/office/word/2023/wordml/word16du" xmlns:w16sdtdh="http://schemas.microsoft.com/office/word/2020/wordml/sdtdatahash" xmlns:w16sdtfl="http://schemas.microsoft.com/office/word/2024/wordml/sdtformatlock" xmlns:w16se="http://schemas.microsoft.com/office/word/2015/wordml/symex" mc:Ignorable="w14 w15 w16se w16cid w16 w16cex w16sdtdh w16sdtfl w16du">
+<w:styles xmlns:mc="http://schemas.openxmlformats.org/markup-compatibility/2006" xmlns:r="http://schemas.openxmlformats.org/officeDocument/2006/relationships" xmlns:w="http://schemas.openxmlformats.org/wordprocessingml/2006/main" xmlns:w14="http://schemas.microsoft.com/office/word/2010/wordml" xmlns:w15="http://schemas.microsoft.com/office/word/2012/wordml" xmlns:w16cex="http://schemas.microsoft.com/office/word/2018/wordml/cex" xmlns:w16cid="http://schemas.microsoft.com/office/word/2016/wordml/cid" xmlns:w16="http://schemas.microsoft.com/office/word/2018/wordml" xmlns:w16sdtdh="http://schemas.microsoft.com/office/word/2020/wordml/sdtdatahash" xmlns:w16se="http://schemas.microsoft.com/office/word/2015/wordml/symex" mc:Ignorable="w14 w15 w16se w16cid w16 w16cex w16sdtdh">
   <w:docDefaults>
     <w:rPrDefault>
       <w:rPr>
@@ -8220,7 +8615,7 @@
 </file>
 
 <file path=word/glossary/webSettings.xml><?xml version="1.0" encoding="utf-8"?>
-<w:webSettings xmlns:mc="http://schemas.openxmlformats.org/markup-compatibility/2006" xmlns:r="http://schemas.openxmlformats.org/officeDocument/2006/relationships" xmlns:w="http://schemas.openxmlformats.org/wordprocessingml/2006/main" xmlns:w14="http://schemas.microsoft.com/office/word/2010/wordml" xmlns:w15="http://schemas.microsoft.com/office/word/2012/wordml" xmlns:w16cex="http://schemas.microsoft.com/office/word/2018/wordml/cex" xmlns:w16cid="http://schemas.microsoft.com/office/word/2016/wordml/cid" xmlns:w16="http://schemas.microsoft.com/office/word/2018/wordml" xmlns:w16du="http://schemas.microsoft.com/office/word/2023/wordml/word16du" xmlns:w16sdtdh="http://schemas.microsoft.com/office/word/2020/wordml/sdtdatahash" xmlns:w16sdtfl="http://schemas.microsoft.com/office/word/2024/wordml/sdtformatlock" xmlns:w16se="http://schemas.microsoft.com/office/word/2015/wordml/symex" mc:Ignorable="w14 w15 w16se w16cid w16 w16cex w16sdtdh w16sdtfl w16du">
+<w:webSettings xmlns:mc="http://schemas.openxmlformats.org/markup-compatibility/2006" xmlns:r="http://schemas.openxmlformats.org/officeDocument/2006/relationships" xmlns:w="http://schemas.openxmlformats.org/wordprocessingml/2006/main" xmlns:w14="http://schemas.microsoft.com/office/word/2010/wordml" xmlns:w15="http://schemas.microsoft.com/office/word/2012/wordml" xmlns:w16cex="http://schemas.microsoft.com/office/word/2018/wordml/cex" xmlns:w16cid="http://schemas.microsoft.com/office/word/2016/wordml/cid" xmlns:w16="http://schemas.microsoft.com/office/word/2018/wordml" xmlns:w16sdtdh="http://schemas.microsoft.com/office/word/2020/wordml/sdtdatahash" xmlns:w16se="http://schemas.microsoft.com/office/word/2015/wordml/symex" mc:Ignorable="w14 w15 w16se w16cid w16 w16cex w16sdtdh">
   <w:optimizeForBrowser/>
   <w:allowPNG/>
 </w:webSettings>

</xml_diff>